<commit_message>
Doc-Interview-2026 - Value type and reference type - P.21-28
</commit_message>
<xml_diff>
--- a/Documents/Interview-2026.docx
+++ b/Documents/Interview-2026.docx
@@ -5,13 +5,15 @@
     <w:p>
       <w:pPr>
         <w:rPr>
-          <w:b/>
-          <w:bCs/>
-          <w:lang w:val="en-US"/>
-        </w:rPr>
-      </w:pPr>
-      <w:r>
-        <w:rPr>
+          <w:rFonts w:ascii="Calibri" w:hAnsi="Calibri" w:cs="Calibri"/>
+          <w:b/>
+          <w:bCs/>
+          <w:lang w:val="en-US"/>
+        </w:rPr>
+      </w:pPr>
+      <w:r>
+        <w:rPr>
+          <w:rFonts w:ascii="Calibri" w:hAnsi="Calibri" w:cs="Calibri"/>
           <w:b/>
           <w:bCs/>
           <w:lang w:val="en-US"/>
@@ -20,6 +22,7 @@
       </w:r>
       <w:r>
         <w:rPr>
+          <w:rFonts w:ascii="Calibri" w:hAnsi="Calibri" w:cs="Calibri"/>
           <w:b/>
           <w:bCs/>
           <w:lang w:val="en-US"/>
@@ -30,41 +33,48 @@
     <w:p>
       <w:pPr>
         <w:rPr>
-          <w:lang w:val="en-US"/>
-        </w:rPr>
-      </w:pPr>
-      <w:r>
-        <w:rPr>
+          <w:rFonts w:ascii="Calibri" w:hAnsi="Calibri" w:cs="Calibri"/>
+          <w:lang w:val="en-US"/>
+        </w:rPr>
+      </w:pPr>
+      <w:r>
+        <w:rPr>
+          <w:rFonts w:ascii="Calibri" w:hAnsi="Calibri" w:cs="Calibri"/>
           <w:lang w:val="en-US"/>
         </w:rPr>
         <w:t>Oop</w:t>
       </w:r>
       <w:r>
         <w:rPr>
+          <w:rFonts w:ascii="Calibri" w:hAnsi="Calibri" w:cs="Calibri"/>
           <w:lang w:val="en-US"/>
         </w:rPr>
         <w:t>s</w:t>
       </w:r>
       <w:r>
         <w:rPr>
+          <w:rFonts w:ascii="Calibri" w:hAnsi="Calibri" w:cs="Calibri"/>
           <w:lang w:val="en-US"/>
         </w:rPr>
         <w:t xml:space="preserve"> </w:t>
       </w:r>
       <w:r>
         <w:rPr>
+          <w:rFonts w:ascii="Calibri" w:hAnsi="Calibri" w:cs="Calibri"/>
           <w:lang w:val="en-US"/>
         </w:rPr>
         <w:t>(Object oriented programming) is programming paradigm which is using to designed software using Object that combine data(properties) and behavior (methods).</w:t>
       </w:r>
       <w:r>
         <w:rPr>
-          <w:lang w:val="en-US"/>
-        </w:rPr>
-        <w:br/>
-      </w:r>
-      <w:r>
-        <w:rPr>
+          <w:rFonts w:ascii="Calibri" w:hAnsi="Calibri" w:cs="Calibri"/>
+          <w:lang w:val="en-US"/>
+        </w:rPr>
+        <w:br/>
+      </w:r>
+      <w:r>
+        <w:rPr>
+          <w:rFonts w:ascii="Calibri" w:hAnsi="Calibri" w:cs="Calibri"/>
           <w:lang w:val="en-US"/>
         </w:rPr>
         <w:br/>
@@ -72,12 +82,14 @@
       </w:r>
       <w:r>
         <w:rPr>
-          <w:lang w:val="en-US"/>
-        </w:rPr>
-        <w:br/>
-      </w:r>
-      <w:r>
-        <w:rPr>
+          <w:rFonts w:ascii="Calibri" w:hAnsi="Calibri" w:cs="Calibri"/>
+          <w:lang w:val="en-US"/>
+        </w:rPr>
+        <w:br/>
+      </w:r>
+      <w:r>
+        <w:rPr>
+          <w:rFonts w:ascii="Calibri" w:hAnsi="Calibri" w:cs="Calibri"/>
           <w:lang w:val="en-US"/>
         </w:rPr>
         <w:t xml:space="preserve">Methods: </w:t>
@@ -85,6 +97,7 @@
       <w:proofErr w:type="gramStart"/>
       <w:r>
         <w:rPr>
+          <w:rFonts w:ascii="Calibri" w:hAnsi="Calibri" w:cs="Calibri"/>
           <w:lang w:val="en-US"/>
         </w:rPr>
         <w:t>talking(</w:t>
@@ -92,6 +105,7 @@
       <w:proofErr w:type="gramEnd"/>
       <w:r>
         <w:rPr>
+          <w:rFonts w:ascii="Calibri" w:hAnsi="Calibri" w:cs="Calibri"/>
           <w:lang w:val="en-US"/>
         </w:rPr>
         <w:t xml:space="preserve">), </w:t>
@@ -99,6 +113,7 @@
       <w:proofErr w:type="gramStart"/>
       <w:r>
         <w:rPr>
+          <w:rFonts w:ascii="Calibri" w:hAnsi="Calibri" w:cs="Calibri"/>
           <w:lang w:val="en-US"/>
         </w:rPr>
         <w:t>saving(</w:t>
@@ -106,6 +121,7 @@
       <w:proofErr w:type="gramEnd"/>
       <w:r>
         <w:rPr>
+          <w:rFonts w:ascii="Calibri" w:hAnsi="Calibri" w:cs="Calibri"/>
           <w:lang w:val="en-US"/>
         </w:rPr>
         <w:t xml:space="preserve">), </w:t>
@@ -113,6 +129,7 @@
       <w:proofErr w:type="gramStart"/>
       <w:r>
         <w:rPr>
+          <w:rFonts w:ascii="Calibri" w:hAnsi="Calibri" w:cs="Calibri"/>
           <w:lang w:val="en-US"/>
         </w:rPr>
         <w:t>running(</w:t>
@@ -120,24 +137,28 @@
       <w:proofErr w:type="gramEnd"/>
       <w:r>
         <w:rPr>
+          <w:rFonts w:ascii="Calibri" w:hAnsi="Calibri" w:cs="Calibri"/>
           <w:lang w:val="en-US"/>
         </w:rPr>
         <w:t>).</w:t>
       </w:r>
       <w:r>
         <w:rPr>
-          <w:lang w:val="en-US"/>
-        </w:rPr>
-        <w:br/>
-      </w:r>
-      <w:r>
-        <w:rPr>
-          <w:lang w:val="en-US"/>
-        </w:rPr>
-        <w:br/>
-      </w:r>
-      <w:r>
-        <w:rPr>
+          <w:rFonts w:ascii="Calibri" w:hAnsi="Calibri" w:cs="Calibri"/>
+          <w:lang w:val="en-US"/>
+        </w:rPr>
+        <w:br/>
+      </w:r>
+      <w:r>
+        <w:rPr>
+          <w:rFonts w:ascii="Calibri" w:hAnsi="Calibri" w:cs="Calibri"/>
+          <w:lang w:val="en-US"/>
+        </w:rPr>
+        <w:br/>
+      </w:r>
+      <w:r>
+        <w:rPr>
+          <w:rFonts w:ascii="Calibri" w:hAnsi="Calibri" w:cs="Calibri"/>
           <w:b/>
           <w:bCs/>
           <w:lang w:val="en-US"/>
@@ -146,18 +167,21 @@
       </w:r>
       <w:r>
         <w:rPr>
-          <w:lang w:val="en-US"/>
-        </w:rPr>
-        <w:br/>
-      </w:r>
-      <w:r>
-        <w:rPr>
-          <w:lang w:val="en-US"/>
-        </w:rPr>
-        <w:br/>
-      </w:r>
-      <w:r>
-        <w:rPr>
+          <w:rFonts w:ascii="Calibri" w:hAnsi="Calibri" w:cs="Calibri"/>
+          <w:lang w:val="en-US"/>
+        </w:rPr>
+        <w:br/>
+      </w:r>
+      <w:r>
+        <w:rPr>
+          <w:rFonts w:ascii="Calibri" w:hAnsi="Calibri" w:cs="Calibri"/>
+          <w:lang w:val="en-US"/>
+        </w:rPr>
+        <w:br/>
+      </w:r>
+      <w:r>
+        <w:rPr>
+          <w:rFonts w:ascii="Calibri" w:hAnsi="Calibri" w:cs="Calibri"/>
           <w:b/>
           <w:bCs/>
           <w:lang w:val="en-US"/>
@@ -166,24 +190,28 @@
       </w:r>
       <w:r>
         <w:rPr>
+          <w:rFonts w:ascii="Calibri" w:hAnsi="Calibri" w:cs="Calibri"/>
           <w:lang w:val="en-US"/>
         </w:rPr>
         <w:t xml:space="preserve"> Class is a blueprint or template for creating object. It defines properties (data) and behavior (method).</w:t>
       </w:r>
       <w:r>
         <w:rPr>
-          <w:lang w:val="en-US"/>
-        </w:rPr>
-        <w:br/>
-      </w:r>
-      <w:r>
-        <w:rPr>
-          <w:lang w:val="en-US"/>
-        </w:rPr>
-        <w:br/>
-      </w:r>
-      <w:r>
-        <w:rPr>
+          <w:rFonts w:ascii="Calibri" w:hAnsi="Calibri" w:cs="Calibri"/>
+          <w:lang w:val="en-US"/>
+        </w:rPr>
+        <w:br/>
+      </w:r>
+      <w:r>
+        <w:rPr>
+          <w:rFonts w:ascii="Calibri" w:hAnsi="Calibri" w:cs="Calibri"/>
+          <w:lang w:val="en-US"/>
+        </w:rPr>
+        <w:br/>
+      </w:r>
+      <w:r>
+        <w:rPr>
+          <w:rFonts w:ascii="Calibri" w:hAnsi="Calibri" w:cs="Calibri"/>
           <w:noProof/>
           <w:lang w:val="en-US"/>
         </w:rPr>
@@ -233,17 +261,20 @@
     <w:p>
       <w:pPr>
         <w:rPr>
-          <w:lang w:val="en-US"/>
-        </w:rPr>
-      </w:pPr>
-      <w:r>
-        <w:rPr>
+          <w:rFonts w:ascii="Calibri" w:hAnsi="Calibri" w:cs="Calibri"/>
+          <w:lang w:val="en-US"/>
+        </w:rPr>
+      </w:pPr>
+      <w:r>
+        <w:rPr>
+          <w:rFonts w:ascii="Calibri" w:hAnsi="Calibri" w:cs="Calibri"/>
           <w:lang w:val="en-US"/>
         </w:rPr>
         <w:t xml:space="preserve">2. </w:t>
       </w:r>
       <w:r>
         <w:rPr>
+          <w:rFonts w:ascii="Calibri" w:hAnsi="Calibri" w:cs="Calibri"/>
           <w:b/>
           <w:bCs/>
           <w:lang w:val="en-US"/>
@@ -252,30 +283,35 @@
       </w:r>
       <w:r>
         <w:rPr>
+          <w:rFonts w:ascii="Calibri" w:hAnsi="Calibri" w:cs="Calibri"/>
           <w:lang w:val="en-US"/>
         </w:rPr>
         <w:t xml:space="preserve"> Object is instance of any class </w:t>
       </w:r>
       <w:r>
         <w:rPr>
+          <w:rFonts w:ascii="Calibri" w:hAnsi="Calibri" w:cs="Calibri"/>
           <w:lang w:val="en-US"/>
         </w:rPr>
         <w:t>that holds the data and perform actions on data defined by class.</w:t>
       </w:r>
       <w:r>
         <w:rPr>
-          <w:lang w:val="en-US"/>
-        </w:rPr>
-        <w:br/>
-      </w:r>
-      <w:r>
-        <w:rPr>
-          <w:lang w:val="en-US"/>
-        </w:rPr>
-        <w:br/>
-      </w:r>
-      <w:r>
-        <w:rPr>
+          <w:rFonts w:ascii="Calibri" w:hAnsi="Calibri" w:cs="Calibri"/>
+          <w:lang w:val="en-US"/>
+        </w:rPr>
+        <w:br/>
+      </w:r>
+      <w:r>
+        <w:rPr>
+          <w:rFonts w:ascii="Calibri" w:hAnsi="Calibri" w:cs="Calibri"/>
+          <w:lang w:val="en-US"/>
+        </w:rPr>
+        <w:br/>
+      </w:r>
+      <w:r>
+        <w:rPr>
+          <w:rFonts w:ascii="Calibri" w:hAnsi="Calibri" w:cs="Calibri"/>
           <w:noProof/>
           <w:lang w:val="en-US"/>
         </w:rPr>
@@ -325,17 +361,20 @@
     <w:p>
       <w:pPr>
         <w:rPr>
-          <w:lang w:val="en-US"/>
-        </w:rPr>
-      </w:pPr>
-      <w:r>
-        <w:rPr>
+          <w:rFonts w:ascii="Calibri" w:hAnsi="Calibri" w:cs="Calibri"/>
+          <w:lang w:val="en-US"/>
+        </w:rPr>
+      </w:pPr>
+      <w:r>
+        <w:rPr>
+          <w:rFonts w:ascii="Calibri" w:hAnsi="Calibri" w:cs="Calibri"/>
           <w:lang w:val="en-US"/>
         </w:rPr>
         <w:t xml:space="preserve">3. </w:t>
       </w:r>
       <w:r>
         <w:rPr>
+          <w:rFonts w:ascii="Calibri" w:hAnsi="Calibri" w:cs="Calibri"/>
           <w:b/>
           <w:bCs/>
           <w:lang w:val="en-US"/>
@@ -344,12 +383,14 @@
       </w:r>
       <w:r>
         <w:rPr>
+          <w:rFonts w:ascii="Calibri" w:hAnsi="Calibri" w:cs="Calibri"/>
           <w:lang w:val="en-US"/>
         </w:rPr>
         <w:t xml:space="preserve">Encapsulation is the concept of binding data and methods together, hiding internal details from outside the world and control access of data and methods using </w:t>
       </w:r>
       <w:r>
         <w:rPr>
+          <w:rFonts w:ascii="Calibri" w:hAnsi="Calibri" w:cs="Calibri"/>
           <w:b/>
           <w:bCs/>
           <w:lang w:val="en-US"/>
@@ -358,6 +399,7 @@
       </w:r>
       <w:r>
         <w:rPr>
+          <w:rFonts w:ascii="Calibri" w:hAnsi="Calibri" w:cs="Calibri"/>
           <w:b/>
           <w:bCs/>
           <w:lang w:val="en-US"/>
@@ -366,18 +408,21 @@
       </w:r>
       <w:r>
         <w:rPr>
+          <w:rFonts w:ascii="Calibri" w:hAnsi="Calibri" w:cs="Calibri"/>
           <w:lang w:val="en-US"/>
         </w:rPr>
         <w:t xml:space="preserve"> -</w:t>
       </w:r>
       <w:r>
         <w:rPr>
+          <w:rFonts w:ascii="Calibri" w:hAnsi="Calibri" w:cs="Calibri"/>
           <w:lang w:val="en-US"/>
         </w:rPr>
         <w:t xml:space="preserve"> </w:t>
       </w:r>
       <w:r>
         <w:rPr>
+          <w:rFonts w:ascii="Calibri" w:hAnsi="Calibri" w:cs="Calibri"/>
           <w:b/>
           <w:bCs/>
           <w:lang w:val="en-US"/>
@@ -387,6 +432,7 @@
       <w:proofErr w:type="spellStart"/>
       <w:r>
         <w:rPr>
+          <w:rFonts w:ascii="Calibri" w:hAnsi="Calibri" w:cs="Calibri"/>
           <w:b/>
           <w:bCs/>
           <w:lang w:val="en-US"/>
@@ -396,6 +442,7 @@
       <w:proofErr w:type="spellEnd"/>
       <w:r>
         <w:rPr>
+          <w:rFonts w:ascii="Calibri" w:hAnsi="Calibri" w:cs="Calibri"/>
           <w:b/>
           <w:bCs/>
           <w:lang w:val="en-US"/>
@@ -404,14 +451,16 @@
       </w:r>
       <w:r>
         <w:rPr>
-          <w:b/>
-          <w:bCs/>
-          <w:lang w:val="en-US"/>
-        </w:rPr>
-        <w:br/>
-      </w:r>
-      <w:r>
-        <w:rPr>
+          <w:rFonts w:ascii="Calibri" w:hAnsi="Calibri" w:cs="Calibri"/>
+          <w:b/>
+          <w:bCs/>
+          <w:lang w:val="en-US"/>
+        </w:rPr>
+        <w:br/>
+      </w:r>
+      <w:r>
+        <w:rPr>
+          <w:rFonts w:ascii="Calibri" w:hAnsi="Calibri" w:cs="Calibri"/>
           <w:lang w:val="en-US"/>
         </w:rPr>
         <w:br/>
@@ -420,6 +469,7 @@
     <w:p>
       <w:pPr>
         <w:rPr>
+          <w:rFonts w:ascii="Calibri" w:hAnsi="Calibri" w:cs="Calibri"/>
           <w:lang w:val="en-US"/>
         </w:rPr>
       </w:pPr>
@@ -427,6 +477,7 @@
     <w:p>
       <w:pPr>
         <w:rPr>
+          <w:rFonts w:ascii="Calibri" w:hAnsi="Calibri" w:cs="Calibri"/>
           <w:lang w:val="en-US"/>
         </w:rPr>
       </w:pPr>
@@ -449,14 +500,15 @@
           <w:p>
             <w:pPr>
               <w:rPr>
+                <w:rFonts w:ascii="Calibri" w:hAnsi="Calibri" w:cs="Calibri"/>
                 <w:lang w:val="en-US"/>
               </w:rPr>
             </w:pPr>
             <w:r>
               <w:rPr>
+                <w:rFonts w:ascii="Calibri" w:hAnsi="Calibri" w:cs="Calibri"/>
                 <w:lang w:val="en-US"/>
               </w:rPr>
-              <w:lastRenderedPageBreak/>
               <w:t>Open</w:t>
             </w:r>
           </w:p>
@@ -468,11 +520,13 @@
           <w:p>
             <w:pPr>
               <w:rPr>
+                <w:rFonts w:ascii="Calibri" w:hAnsi="Calibri" w:cs="Calibri"/>
                 <w:lang w:val="en-US"/>
               </w:rPr>
             </w:pPr>
             <w:r>
               <w:rPr>
+                <w:rFonts w:ascii="Calibri" w:hAnsi="Calibri" w:cs="Calibri"/>
                 <w:lang w:val="en-US"/>
               </w:rPr>
               <w:t>Accessible anywhere + can be subclassed/overridden outside the module</w:t>
@@ -488,13 +542,16 @@
           <w:p>
             <w:pPr>
               <w:rPr>
+                <w:rFonts w:ascii="Calibri" w:hAnsi="Calibri" w:cs="Calibri"/>
                 <w:lang w:val="en-US"/>
               </w:rPr>
             </w:pPr>
             <w:r>
               <w:rPr>
+                <w:rFonts w:ascii="Calibri" w:hAnsi="Calibri" w:cs="Calibri"/>
                 <w:lang w:val="en-US"/>
               </w:rPr>
+              <w:lastRenderedPageBreak/>
               <w:t>Public</w:t>
             </w:r>
           </w:p>
@@ -506,11 +563,13 @@
           <w:p>
             <w:pPr>
               <w:rPr>
+                <w:rFonts w:ascii="Calibri" w:hAnsi="Calibri" w:cs="Calibri"/>
                 <w:lang w:val="en-US"/>
               </w:rPr>
             </w:pPr>
             <w:r>
               <w:rPr>
+                <w:rFonts w:ascii="Calibri" w:hAnsi="Calibri" w:cs="Calibri"/>
                 <w:lang w:val="en-US"/>
               </w:rPr>
               <w:t>Accessible anywhere + cannot be subclassed/overridden outside the module</w:t>
@@ -526,11 +585,13 @@
           <w:p>
             <w:pPr>
               <w:rPr>
+                <w:rFonts w:ascii="Calibri" w:hAnsi="Calibri" w:cs="Calibri"/>
                 <w:lang w:val="en-US"/>
               </w:rPr>
             </w:pPr>
             <w:r>
               <w:rPr>
+                <w:rFonts w:ascii="Calibri" w:hAnsi="Calibri" w:cs="Calibri"/>
                 <w:lang w:val="en-US"/>
               </w:rPr>
               <w:t>Internal</w:t>
@@ -544,11 +605,13 @@
           <w:p>
             <w:pPr>
               <w:rPr>
+                <w:rFonts w:ascii="Calibri" w:hAnsi="Calibri" w:cs="Calibri"/>
                 <w:lang w:val="en-US"/>
               </w:rPr>
             </w:pPr>
             <w:r>
               <w:rPr>
+                <w:rFonts w:ascii="Calibri" w:hAnsi="Calibri" w:cs="Calibri"/>
                 <w:lang w:val="en-US"/>
               </w:rPr>
               <w:t>Default: accessible only inside the module</w:t>
@@ -564,12 +627,14 @@
           <w:p>
             <w:pPr>
               <w:rPr>
+                <w:rFonts w:ascii="Calibri" w:hAnsi="Calibri" w:cs="Calibri"/>
                 <w:lang w:val="en-US"/>
               </w:rPr>
             </w:pPr>
             <w:proofErr w:type="spellStart"/>
             <w:r>
               <w:rPr>
+                <w:rFonts w:ascii="Calibri" w:hAnsi="Calibri" w:cs="Calibri"/>
                 <w:lang w:val="en-US"/>
               </w:rPr>
               <w:t>fileprivate</w:t>
@@ -584,11 +649,13 @@
           <w:p>
             <w:pPr>
               <w:rPr>
+                <w:rFonts w:ascii="Calibri" w:hAnsi="Calibri" w:cs="Calibri"/>
                 <w:lang w:val="en-US"/>
               </w:rPr>
             </w:pPr>
             <w:r>
               <w:rPr>
+                <w:rFonts w:ascii="Calibri" w:hAnsi="Calibri" w:cs="Calibri"/>
                 <w:lang w:val="en-US"/>
               </w:rPr>
               <w:t>Accessible only inside the same file</w:t>
@@ -604,11 +671,13 @@
           <w:p>
             <w:pPr>
               <w:rPr>
+                <w:rFonts w:ascii="Calibri" w:hAnsi="Calibri" w:cs="Calibri"/>
                 <w:lang w:val="en-US"/>
               </w:rPr>
             </w:pPr>
             <w:r>
               <w:rPr>
+                <w:rFonts w:ascii="Calibri" w:hAnsi="Calibri" w:cs="Calibri"/>
                 <w:lang w:val="en-US"/>
               </w:rPr>
               <w:t>private</w:t>
@@ -622,11 +691,13 @@
           <w:p>
             <w:pPr>
               <w:rPr>
+                <w:rFonts w:ascii="Calibri" w:hAnsi="Calibri" w:cs="Calibri"/>
                 <w:lang w:val="en-US"/>
               </w:rPr>
             </w:pPr>
             <w:r>
               <w:rPr>
+                <w:rFonts w:ascii="Calibri" w:hAnsi="Calibri" w:cs="Calibri"/>
                 <w:lang w:val="en-US"/>
               </w:rPr>
               <w:t>accessible only withing the same declaration.</w:t>
@@ -638,17 +709,20 @@
     <w:p>
       <w:pPr>
         <w:rPr>
-          <w:lang w:val="en-US"/>
-        </w:rPr>
-      </w:pPr>
-      <w:r>
-        <w:rPr>
-          <w:lang w:val="en-US"/>
-        </w:rPr>
-        <w:br/>
-      </w:r>
-      <w:r>
-        <w:rPr>
+          <w:rFonts w:ascii="Calibri" w:hAnsi="Calibri" w:cs="Calibri"/>
+          <w:lang w:val="en-US"/>
+        </w:rPr>
+      </w:pPr>
+      <w:r>
+        <w:rPr>
+          <w:rFonts w:ascii="Calibri" w:hAnsi="Calibri" w:cs="Calibri"/>
+          <w:lang w:val="en-US"/>
+        </w:rPr>
+        <w:br/>
+      </w:r>
+      <w:r>
+        <w:rPr>
+          <w:rFonts w:ascii="Calibri" w:hAnsi="Calibri" w:cs="Calibri"/>
           <w:noProof/>
           <w:lang w:val="en-US"/>
         </w:rPr>
@@ -696,12 +770,14 @@
       </w:r>
       <w:r>
         <w:rPr>
-          <w:lang w:val="en-US"/>
-        </w:rPr>
-        <w:br/>
-      </w:r>
-      <w:r>
-        <w:rPr>
+          <w:rFonts w:ascii="Calibri" w:hAnsi="Calibri" w:cs="Calibri"/>
+          <w:lang w:val="en-US"/>
+        </w:rPr>
+        <w:br/>
+      </w:r>
+      <w:r>
+        <w:rPr>
+          <w:rFonts w:ascii="Calibri" w:hAnsi="Calibri" w:cs="Calibri"/>
           <w:b/>
           <w:bCs/>
           <w:lang w:val="en-US"/>
@@ -710,32 +786,37 @@
       </w:r>
       <w:r>
         <w:rPr>
-          <w:b/>
-          <w:bCs/>
-          <w:lang w:val="en-US"/>
-        </w:rPr>
-        <w:br/>
-      </w:r>
-      <w:r>
-        <w:rPr>
+          <w:rFonts w:ascii="Calibri" w:hAnsi="Calibri" w:cs="Calibri"/>
+          <w:b/>
+          <w:bCs/>
+          <w:lang w:val="en-US"/>
+        </w:rPr>
+        <w:br/>
+      </w:r>
+      <w:r>
+        <w:rPr>
+          <w:rFonts w:ascii="Calibri" w:hAnsi="Calibri" w:cs="Calibri"/>
           <w:lang w:val="en-US"/>
         </w:rPr>
         <w:t>Inheritance is mechanism where one class can access property and method from another class. Inheritance it used for code reusability.</w:t>
       </w:r>
       <w:r>
         <w:rPr>
-          <w:lang w:val="en-US"/>
-        </w:rPr>
-        <w:br/>
-      </w:r>
-      <w:r>
-        <w:rPr>
-          <w:lang w:val="en-US"/>
-        </w:rPr>
-        <w:br/>
-      </w:r>
-      <w:r>
-        <w:rPr>
+          <w:rFonts w:ascii="Calibri" w:hAnsi="Calibri" w:cs="Calibri"/>
+          <w:lang w:val="en-US"/>
+        </w:rPr>
+        <w:br/>
+      </w:r>
+      <w:r>
+        <w:rPr>
+          <w:rFonts w:ascii="Calibri" w:hAnsi="Calibri" w:cs="Calibri"/>
+          <w:lang w:val="en-US"/>
+        </w:rPr>
+        <w:br/>
+      </w:r>
+      <w:r>
+        <w:rPr>
+          <w:rFonts w:ascii="Calibri" w:hAnsi="Calibri" w:cs="Calibri"/>
           <w:b/>
           <w:bCs/>
           <w:lang w:val="en-US"/>
@@ -744,24 +825,28 @@
       </w:r>
       <w:r>
         <w:rPr>
+          <w:rFonts w:ascii="Calibri" w:hAnsi="Calibri" w:cs="Calibri"/>
           <w:lang w:val="en-US"/>
         </w:rPr>
         <w:t xml:space="preserve"> The class whose properties and methods are inherited by another class.</w:t>
       </w:r>
       <w:r>
         <w:rPr>
-          <w:lang w:val="en-US"/>
-        </w:rPr>
-        <w:br/>
-      </w:r>
-      <w:r>
-        <w:rPr>
-          <w:lang w:val="en-US"/>
-        </w:rPr>
-        <w:br/>
-      </w:r>
-      <w:r>
-        <w:rPr>
+          <w:rFonts w:ascii="Calibri" w:hAnsi="Calibri" w:cs="Calibri"/>
+          <w:lang w:val="en-US"/>
+        </w:rPr>
+        <w:br/>
+      </w:r>
+      <w:r>
+        <w:rPr>
+          <w:rFonts w:ascii="Calibri" w:hAnsi="Calibri" w:cs="Calibri"/>
+          <w:lang w:val="en-US"/>
+        </w:rPr>
+        <w:br/>
+      </w:r>
+      <w:r>
+        <w:rPr>
+          <w:rFonts w:ascii="Calibri" w:hAnsi="Calibri" w:cs="Calibri"/>
           <w:b/>
           <w:bCs/>
           <w:lang w:val="en-US"/>
@@ -770,24 +855,28 @@
       </w:r>
       <w:r>
         <w:rPr>
+          <w:rFonts w:ascii="Calibri" w:hAnsi="Calibri" w:cs="Calibri"/>
           <w:lang w:val="en-US"/>
         </w:rPr>
         <w:t>The class that inherits from a superclass and adds/overrides functionality.</w:t>
       </w:r>
       <w:r>
         <w:rPr>
-          <w:lang w:val="en-US"/>
-        </w:rPr>
-        <w:br/>
-      </w:r>
-      <w:r>
-        <w:rPr>
-          <w:lang w:val="en-US"/>
-        </w:rPr>
-        <w:br/>
-      </w:r>
-      <w:r>
-        <w:rPr>
+          <w:rFonts w:ascii="Calibri" w:hAnsi="Calibri" w:cs="Calibri"/>
+          <w:lang w:val="en-US"/>
+        </w:rPr>
+        <w:br/>
+      </w:r>
+      <w:r>
+        <w:rPr>
+          <w:rFonts w:ascii="Calibri" w:hAnsi="Calibri" w:cs="Calibri"/>
+          <w:lang w:val="en-US"/>
+        </w:rPr>
+        <w:br/>
+      </w:r>
+      <w:r>
+        <w:rPr>
+          <w:rFonts w:ascii="Calibri" w:hAnsi="Calibri" w:cs="Calibri"/>
           <w:b/>
           <w:bCs/>
           <w:lang w:val="en-US"/>
@@ -796,6 +885,7 @@
       </w:r>
       <w:r>
         <w:rPr>
+          <w:rFonts w:ascii="Calibri" w:hAnsi="Calibri" w:cs="Calibri"/>
           <w:b/>
           <w:bCs/>
           <w:lang w:val="en-US"/>
@@ -804,6 +894,7 @@
       </w:r>
       <w:r>
         <w:rPr>
+          <w:rFonts w:ascii="Calibri" w:hAnsi="Calibri" w:cs="Calibri"/>
           <w:b/>
           <w:bCs/>
           <w:lang w:val="en-US"/>
@@ -812,24 +903,28 @@
       </w:r>
       <w:r>
         <w:rPr>
+          <w:rFonts w:ascii="Calibri" w:hAnsi="Calibri" w:cs="Calibri"/>
           <w:lang w:val="en-US"/>
         </w:rPr>
         <w:t>Subclass provides its own version of superclass method using override.</w:t>
       </w:r>
       <w:r>
         <w:rPr>
-          <w:lang w:val="en-US"/>
-        </w:rPr>
-        <w:br/>
-      </w:r>
-      <w:r>
-        <w:rPr>
-          <w:lang w:val="en-US"/>
-        </w:rPr>
-        <w:br/>
-      </w:r>
-      <w:r>
-        <w:rPr>
+          <w:rFonts w:ascii="Calibri" w:hAnsi="Calibri" w:cs="Calibri"/>
+          <w:lang w:val="en-US"/>
+        </w:rPr>
+        <w:br/>
+      </w:r>
+      <w:r>
+        <w:rPr>
+          <w:rFonts w:ascii="Calibri" w:hAnsi="Calibri" w:cs="Calibri"/>
+          <w:lang w:val="en-US"/>
+        </w:rPr>
+        <w:br/>
+      </w:r>
+      <w:r>
+        <w:rPr>
+          <w:rFonts w:ascii="Calibri" w:hAnsi="Calibri" w:cs="Calibri"/>
           <w:b/>
           <w:bCs/>
           <w:lang w:val="en-US"/>
@@ -839,6 +934,7 @@
       <w:proofErr w:type="gramStart"/>
       <w:r>
         <w:rPr>
+          <w:rFonts w:ascii="Calibri" w:hAnsi="Calibri" w:cs="Calibri"/>
           <w:b/>
           <w:bCs/>
           <w:lang w:val="en-US"/>
@@ -848,6 +944,7 @@
       <w:proofErr w:type="gramEnd"/>
       <w:r>
         <w:rPr>
+          <w:rFonts w:ascii="Calibri" w:hAnsi="Calibri" w:cs="Calibri"/>
           <w:lang w:val="en-US"/>
         </w:rPr>
         <w:t xml:space="preserve"> Subclass override computed property. (stored property </w:t>
@@ -855,6 +952,7 @@
       <w:proofErr w:type="spellStart"/>
       <w:r>
         <w:rPr>
+          <w:rFonts w:ascii="Calibri" w:hAnsi="Calibri" w:cs="Calibri"/>
           <w:lang w:val="en-US"/>
         </w:rPr>
         <w:t>can not</w:t>
@@ -862,24 +960,28 @@
       <w:proofErr w:type="spellEnd"/>
       <w:r>
         <w:rPr>
+          <w:rFonts w:ascii="Calibri" w:hAnsi="Calibri" w:cs="Calibri"/>
           <w:lang w:val="en-US"/>
         </w:rPr>
         <w:t xml:space="preserve"> be overridden)</w:t>
       </w:r>
       <w:r>
         <w:rPr>
-          <w:lang w:val="en-US"/>
-        </w:rPr>
-        <w:br/>
-      </w:r>
-      <w:r>
-        <w:rPr>
-          <w:lang w:val="en-US"/>
-        </w:rPr>
-        <w:br/>
-      </w:r>
-      <w:r>
-        <w:rPr>
+          <w:rFonts w:ascii="Calibri" w:hAnsi="Calibri" w:cs="Calibri"/>
+          <w:lang w:val="en-US"/>
+        </w:rPr>
+        <w:br/>
+      </w:r>
+      <w:r>
+        <w:rPr>
+          <w:rFonts w:ascii="Calibri" w:hAnsi="Calibri" w:cs="Calibri"/>
+          <w:lang w:val="en-US"/>
+        </w:rPr>
+        <w:br/>
+      </w:r>
+      <w:r>
+        <w:rPr>
+          <w:rFonts w:ascii="Calibri" w:hAnsi="Calibri" w:cs="Calibri"/>
           <w:b/>
           <w:bCs/>
           <w:lang w:val="en-US"/>
@@ -889,6 +991,7 @@
       <w:proofErr w:type="gramStart"/>
       <w:r>
         <w:rPr>
+          <w:rFonts w:ascii="Calibri" w:hAnsi="Calibri" w:cs="Calibri"/>
           <w:b/>
           <w:bCs/>
           <w:lang w:val="en-US"/>
@@ -898,6 +1001,7 @@
       <w:proofErr w:type="gramEnd"/>
       <w:r>
         <w:rPr>
+          <w:rFonts w:ascii="Calibri" w:hAnsi="Calibri" w:cs="Calibri"/>
           <w:b/>
           <w:bCs/>
           <w:lang w:val="en-US"/>
@@ -906,6 +1010,7 @@
       </w:r>
       <w:r>
         <w:rPr>
+          <w:rFonts w:ascii="Calibri" w:hAnsi="Calibri" w:cs="Calibri"/>
           <w:lang w:val="en-US"/>
         </w:rPr>
         <w:t xml:space="preserve">Subclass adds </w:t>
@@ -913,6 +1018,7 @@
       <w:proofErr w:type="spellStart"/>
       <w:r>
         <w:rPr>
+          <w:rFonts w:ascii="Calibri" w:hAnsi="Calibri" w:cs="Calibri"/>
           <w:lang w:val="en-US"/>
         </w:rPr>
         <w:t>willSet</w:t>
@@ -920,6 +1026,7 @@
       <w:proofErr w:type="spellEnd"/>
       <w:r>
         <w:rPr>
+          <w:rFonts w:ascii="Calibri" w:hAnsi="Calibri" w:cs="Calibri"/>
           <w:lang w:val="en-US"/>
         </w:rPr>
         <w:t>/</w:t>
@@ -927,6 +1034,7 @@
       <w:proofErr w:type="spellStart"/>
       <w:r>
         <w:rPr>
+          <w:rFonts w:ascii="Calibri" w:hAnsi="Calibri" w:cs="Calibri"/>
           <w:lang w:val="en-US"/>
         </w:rPr>
         <w:t>didSet</w:t>
@@ -934,24 +1042,28 @@
       <w:proofErr w:type="spellEnd"/>
       <w:r>
         <w:rPr>
+          <w:rFonts w:ascii="Calibri" w:hAnsi="Calibri" w:cs="Calibri"/>
           <w:lang w:val="en-US"/>
         </w:rPr>
         <w:t xml:space="preserve"> to inherited properties.</w:t>
       </w:r>
       <w:r>
         <w:rPr>
-          <w:lang w:val="en-US"/>
-        </w:rPr>
-        <w:br/>
-      </w:r>
-      <w:r>
-        <w:rPr>
-          <w:lang w:val="en-US"/>
-        </w:rPr>
-        <w:br/>
-      </w:r>
-      <w:r>
-        <w:rPr>
+          <w:rFonts w:ascii="Calibri" w:hAnsi="Calibri" w:cs="Calibri"/>
+          <w:lang w:val="en-US"/>
+        </w:rPr>
+        <w:br/>
+      </w:r>
+      <w:r>
+        <w:rPr>
+          <w:rFonts w:ascii="Calibri" w:hAnsi="Calibri" w:cs="Calibri"/>
+          <w:lang w:val="en-US"/>
+        </w:rPr>
+        <w:br/>
+      </w:r>
+      <w:r>
+        <w:rPr>
+          <w:rFonts w:ascii="Calibri" w:hAnsi="Calibri" w:cs="Calibri"/>
           <w:b/>
           <w:bCs/>
           <w:lang w:val="en-US"/>
@@ -960,24 +1072,28 @@
       </w:r>
       <w:r>
         <w:rPr>
+          <w:rFonts w:ascii="Calibri" w:hAnsi="Calibri" w:cs="Calibri"/>
           <w:lang w:val="en-US"/>
         </w:rPr>
         <w:t>prevent a class, method and properties from being inherited or overridden.</w:t>
       </w:r>
       <w:r>
         <w:rPr>
-          <w:lang w:val="en-US"/>
-        </w:rPr>
-        <w:br/>
-      </w:r>
-      <w:r>
-        <w:rPr>
-          <w:lang w:val="en-US"/>
-        </w:rPr>
-        <w:br/>
-      </w:r>
-      <w:r>
-        <w:rPr>
+          <w:rFonts w:ascii="Calibri" w:hAnsi="Calibri" w:cs="Calibri"/>
+          <w:lang w:val="en-US"/>
+        </w:rPr>
+        <w:br/>
+      </w:r>
+      <w:r>
+        <w:rPr>
+          <w:rFonts w:ascii="Calibri" w:hAnsi="Calibri" w:cs="Calibri"/>
+          <w:lang w:val="en-US"/>
+        </w:rPr>
+        <w:br/>
+      </w:r>
+      <w:r>
+        <w:rPr>
+          <w:rFonts w:ascii="Calibri" w:hAnsi="Calibri" w:cs="Calibri"/>
           <w:b/>
           <w:bCs/>
           <w:lang w:val="en-US"/>
@@ -986,6 +1102,7 @@
       </w:r>
       <w:r>
         <w:rPr>
+          <w:rFonts w:ascii="Calibri" w:hAnsi="Calibri" w:cs="Calibri"/>
           <w:lang w:val="en-US"/>
         </w:rPr>
         <w:t>Used to access superclass methods, properties, or initializer.</w:t>
@@ -994,6 +1111,7 @@
     <w:p>
       <w:pPr>
         <w:rPr>
+          <w:rFonts w:ascii="Calibri" w:hAnsi="Calibri" w:cs="Calibri"/>
           <w:lang w:val="en-US"/>
         </w:rPr>
       </w:pPr>
@@ -1001,6 +1119,7 @@
     <w:p>
       <w:pPr>
         <w:rPr>
+          <w:rFonts w:ascii="Calibri" w:hAnsi="Calibri" w:cs="Calibri"/>
           <w:lang w:val="en-US"/>
         </w:rPr>
       </w:pPr>
@@ -1008,69 +1127,77 @@
     <w:p>
       <w:pPr>
         <w:pStyle w:val="p1"/>
-      </w:pPr>
-      <w:r>
-        <w:rPr>
-          <w:b/>
-          <w:bCs/>
-          <w:lang w:val="en-US"/>
+        <w:rPr>
+          <w:rFonts w:ascii="Calibri" w:hAnsi="Calibri" w:cs="Calibri"/>
+        </w:rPr>
+      </w:pPr>
+      <w:r>
+        <w:rPr>
+          <w:rFonts w:ascii="Calibri" w:hAnsi="Calibri" w:cs="Calibri"/>
+          <w:b/>
+          <w:bCs/>
+          <w:lang w:val="en-US"/>
+        </w:rPr>
+        <w:t>Abstraction:</w:t>
+      </w:r>
+      <w:r>
+        <w:rPr>
+          <w:rFonts w:ascii="Calibri" w:hAnsi="Calibri" w:cs="Calibri"/>
+          <w:b/>
+          <w:bCs/>
+          <w:lang w:val="en-US"/>
+        </w:rPr>
+        <w:br/>
+      </w:r>
+      <w:r>
+        <w:rPr>
+          <w:rFonts w:ascii="Calibri" w:hAnsi="Calibri" w:cs="Calibri"/>
+          <w:b/>
+          <w:bCs/>
+          <w:lang w:val="en-US"/>
+        </w:rPr>
+        <w:br/>
+      </w:r>
+      <w:r>
+        <w:rPr>
+          <w:rStyle w:val="s1"/>
+          <w:rFonts w:ascii="Calibri" w:eastAsiaTheme="majorEastAsia" w:hAnsi="Calibri" w:cs="Calibri"/>
         </w:rPr>
         <w:lastRenderedPageBreak/>
-        <w:t>Abstraction:</w:t>
-      </w:r>
-      <w:r>
-        <w:rPr>
-          <w:b/>
-          <w:bCs/>
-          <w:lang w:val="en-US"/>
-        </w:rPr>
-        <w:br/>
-      </w:r>
-      <w:r>
-        <w:rPr>
-          <w:b/>
-          <w:bCs/>
-          <w:lang w:val="en-US"/>
-        </w:rPr>
-        <w:br/>
+        <w:t xml:space="preserve">Abstraction means </w:t>
+      </w:r>
+      <w:r>
+        <w:rPr>
+          <w:rFonts w:ascii="Calibri" w:hAnsi="Calibri" w:cs="Calibri"/>
+          <w:b/>
+          <w:bCs/>
+        </w:rPr>
+        <w:t>hiding complexity and showing only what’s needed to use something</w:t>
       </w:r>
       <w:r>
         <w:rPr>
           <w:rStyle w:val="s1"/>
-          <w:rFonts w:eastAsiaTheme="majorEastAsia"/>
-        </w:rPr>
-        <w:t xml:space="preserve">Abstraction means </w:t>
-      </w:r>
-      <w:r>
-        <w:rPr>
-          <w:b/>
-          <w:bCs/>
-        </w:rPr>
-        <w:t>hiding complexity and showing only what’s needed to use something</w:t>
+          <w:rFonts w:ascii="Calibri" w:eastAsiaTheme="majorEastAsia" w:hAnsi="Calibri" w:cs="Calibri"/>
+        </w:rPr>
+        <w:t>.</w:t>
       </w:r>
       <w:r>
         <w:rPr>
           <w:rStyle w:val="s1"/>
-          <w:rFonts w:eastAsiaTheme="majorEastAsia"/>
-        </w:rPr>
-        <w:t>.</w:t>
+          <w:rFonts w:ascii="Calibri" w:eastAsiaTheme="majorEastAsia" w:hAnsi="Calibri" w:cs="Calibri"/>
+        </w:rPr>
+        <w:br/>
       </w:r>
       <w:r>
         <w:rPr>
           <w:rStyle w:val="s1"/>
-          <w:rFonts w:eastAsiaTheme="majorEastAsia"/>
-        </w:rPr>
-        <w:br/>
-      </w:r>
-      <w:r>
-        <w:rPr>
-          <w:rStyle w:val="s1"/>
-          <w:rFonts w:eastAsiaTheme="majorEastAsia"/>
-        </w:rPr>
-        <w:br/>
-      </w:r>
-      <w:r>
-        <w:rPr>
+          <w:rFonts w:ascii="Calibri" w:eastAsiaTheme="majorEastAsia" w:hAnsi="Calibri" w:cs="Calibri"/>
+        </w:rPr>
+        <w:br/>
+      </w:r>
+      <w:r>
+        <w:rPr>
+          <w:rFonts w:ascii="Calibri" w:hAnsi="Calibri" w:cs="Calibri"/>
           <w:b/>
           <w:bCs/>
         </w:rPr>
@@ -1078,19 +1205,24 @@
       </w:r>
       <w:r>
         <w:rPr>
-          <w:b/>
-          <w:bCs/>
-        </w:rPr>
-        <w:br/>
-      </w:r>
-      <w:r>
-        <w:rPr>
-          <w:b/>
-          <w:bCs/>
-        </w:rPr>
-        <w:br/>
-      </w:r>
-      <w:r>
+          <w:rFonts w:ascii="Calibri" w:hAnsi="Calibri" w:cs="Calibri"/>
+          <w:b/>
+          <w:bCs/>
+        </w:rPr>
+        <w:br/>
+      </w:r>
+      <w:r>
+        <w:rPr>
+          <w:rFonts w:ascii="Calibri" w:hAnsi="Calibri" w:cs="Calibri"/>
+          <w:b/>
+          <w:bCs/>
+        </w:rPr>
+        <w:br/>
+      </w:r>
+      <w:r>
+        <w:rPr>
+          <w:rFonts w:ascii="Calibri" w:hAnsi="Calibri" w:cs="Calibri"/>
+        </w:rPr>
         <w:t>In Swift, it’s commonly achieved using:</w:t>
       </w:r>
     </w:p>
@@ -1098,12 +1230,14 @@
       <w:pPr>
         <w:pStyle w:val="p1"/>
         <w:rPr>
-          <w:b/>
-          <w:bCs/>
-        </w:rPr>
-      </w:pPr>
-      <w:r>
-        <w:rPr>
+          <w:rFonts w:ascii="Calibri" w:hAnsi="Calibri" w:cs="Calibri"/>
+          <w:b/>
+          <w:bCs/>
+        </w:rPr>
+      </w:pPr>
+      <w:r>
+        <w:rPr>
+          <w:rFonts w:ascii="Calibri" w:hAnsi="Calibri" w:cs="Calibri"/>
           <w:b/>
           <w:bCs/>
         </w:rPr>
@@ -1112,6 +1246,7 @@
       </w:r>
       <w:r>
         <w:rPr>
+          <w:rFonts w:ascii="Calibri" w:hAnsi="Calibri" w:cs="Calibri"/>
           <w:b/>
           <w:bCs/>
         </w:rPr>
@@ -1120,6 +1255,7 @@
       </w:r>
       <w:r>
         <w:rPr>
+          <w:rFonts w:ascii="Calibri" w:hAnsi="Calibri" w:cs="Calibri"/>
           <w:b/>
           <w:bCs/>
         </w:rPr>
@@ -1127,6 +1263,7 @@
       </w:r>
       <w:r>
         <w:rPr>
+          <w:rFonts w:ascii="Calibri" w:hAnsi="Calibri" w:cs="Calibri"/>
           <w:b/>
           <w:bCs/>
         </w:rPr>
@@ -1137,22 +1274,25 @@
       <w:pPr>
         <w:pStyle w:val="Heading3"/>
         <w:rPr>
-          <w:rFonts w:ascii="Times New Roman" w:eastAsia="Times New Roman" w:hAnsi="Times New Roman" w:cs="Times New Roman"/>
+          <w:rFonts w:ascii="Calibri" w:eastAsia="Times New Roman" w:hAnsi="Calibri" w:cs="Calibri"/>
           <w:b/>
           <w:bCs/>
           <w:color w:val="auto"/>
           <w:kern w:val="0"/>
-          <w:sz w:val="27"/>
-          <w:szCs w:val="27"/>
+          <w:sz w:val="24"/>
+          <w:szCs w:val="24"/>
           <w:lang w:eastAsia="en-GB"/>
           <w14:ligatures w14:val="none"/>
         </w:rPr>
       </w:pPr>
       <w:r>
         <w:rPr>
+          <w:rFonts w:ascii="Calibri" w:hAnsi="Calibri" w:cs="Calibri"/>
           <w:b/>
           <w:bCs/>
           <w:noProof/>
+          <w:sz w:val="24"/>
+          <w:szCs w:val="24"/>
         </w:rPr>
         <w:drawing>
           <wp:inline distT="0" distB="0" distL="0" distR="0" wp14:anchorId="7E7A6A7D" wp14:editId="4B71BAFF">
@@ -1198,23 +1338,32 @@
       </w:r>
       <w:r>
         <w:rPr>
-          <w:b/>
-          <w:bCs/>
-        </w:rPr>
-        <w:br/>
-      </w:r>
-      <w:r>
-        <w:rPr>
-          <w:b/>
-          <w:bCs/>
-        </w:rPr>
-        <w:br/>
-      </w:r>
-      <w:r>
-        <w:rPr>
+          <w:rFonts w:ascii="Calibri" w:hAnsi="Calibri" w:cs="Calibri"/>
+          <w:b/>
+          <w:bCs/>
+          <w:sz w:val="24"/>
+          <w:szCs w:val="24"/>
+        </w:rPr>
+        <w:br/>
+      </w:r>
+      <w:r>
+        <w:rPr>
+          <w:rFonts w:ascii="Calibri" w:hAnsi="Calibri" w:cs="Calibri"/>
+          <w:b/>
+          <w:bCs/>
+          <w:sz w:val="24"/>
+          <w:szCs w:val="24"/>
+        </w:rPr>
+        <w:br/>
+      </w:r>
+      <w:r>
+        <w:rPr>
+          <w:rFonts w:ascii="Calibri" w:hAnsi="Calibri" w:cs="Calibri"/>
           <w:b/>
           <w:bCs/>
           <w:noProof/>
+          <w:sz w:val="24"/>
+          <w:szCs w:val="24"/>
         </w:rPr>
         <w:drawing>
           <wp:inline distT="0" distB="0" distL="0" distR="0" wp14:anchorId="0BF7D56C" wp14:editId="13414E9E">
@@ -1260,8 +1409,11 @@
       </w:r>
       <w:r>
         <w:rPr>
-          <w:b/>
-          <w:bCs/>
+          <w:rFonts w:ascii="Calibri" w:hAnsi="Calibri" w:cs="Calibri"/>
+          <w:b/>
+          <w:bCs/>
+          <w:sz w:val="24"/>
+          <w:szCs w:val="24"/>
         </w:rPr>
         <w:br/>
       </w:r>
@@ -1270,26 +1422,26 @@
       <w:pPr>
         <w:pStyle w:val="Heading3"/>
         <w:rPr>
-          <w:rFonts w:ascii="Times New Roman" w:eastAsia="Times New Roman" w:hAnsi="Times New Roman" w:cs="Times New Roman"/>
+          <w:rFonts w:ascii="Calibri" w:eastAsia="Times New Roman" w:hAnsi="Calibri" w:cs="Calibri"/>
           <w:b/>
           <w:bCs/>
           <w:color w:val="auto"/>
           <w:kern w:val="0"/>
-          <w:sz w:val="27"/>
-          <w:szCs w:val="27"/>
+          <w:sz w:val="24"/>
+          <w:szCs w:val="24"/>
           <w:lang w:eastAsia="en-GB"/>
           <w14:ligatures w14:val="none"/>
         </w:rPr>
       </w:pPr>
       <w:r>
         <w:rPr>
-          <w:rFonts w:ascii="Times New Roman" w:eastAsia="Times New Roman" w:hAnsi="Times New Roman" w:cs="Times New Roman"/>
+          <w:rFonts w:ascii="Calibri" w:eastAsia="Times New Roman" w:hAnsi="Calibri" w:cs="Calibri"/>
           <w:b/>
           <w:bCs/>
           <w:color w:val="auto"/>
           <w:kern w:val="0"/>
-          <w:sz w:val="27"/>
-          <w:szCs w:val="27"/>
+          <w:sz w:val="24"/>
+          <w:szCs w:val="24"/>
           <w:lang w:eastAsia="en-GB"/>
           <w14:ligatures w14:val="none"/>
         </w:rPr>
@@ -1304,7 +1456,7 @@
         </w:numPr>
         <w:spacing w:before="100" w:beforeAutospacing="1" w:after="100" w:afterAutospacing="1" w:line="240" w:lineRule="auto"/>
         <w:rPr>
-          <w:rFonts w:ascii="Times New Roman" w:eastAsia="Times New Roman" w:hAnsi="Times New Roman" w:cs="Times New Roman"/>
+          <w:rFonts w:ascii="Calibri" w:eastAsia="Times New Roman" w:hAnsi="Calibri" w:cs="Calibri"/>
           <w:kern w:val="0"/>
           <w:lang w:eastAsia="en-GB"/>
           <w14:ligatures w14:val="none"/>
@@ -1312,7 +1464,7 @@
       </w:pPr>
       <w:r>
         <w:rPr>
-          <w:rFonts w:ascii="Times New Roman" w:eastAsia="Times New Roman" w:hAnsi="Times New Roman" w:cs="Times New Roman"/>
+          <w:rFonts w:ascii="Calibri" w:eastAsia="Times New Roman" w:hAnsi="Calibri" w:cs="Calibri"/>
           <w:b/>
           <w:bCs/>
           <w:kern w:val="0"/>
@@ -1323,7 +1475,7 @@
       </w:r>
       <w:r>
         <w:rPr>
-          <w:rFonts w:ascii="Times New Roman" w:eastAsia="Times New Roman" w:hAnsi="Times New Roman" w:cs="Times New Roman"/>
+          <w:rFonts w:ascii="Calibri" w:eastAsia="Times New Roman" w:hAnsi="Calibri" w:cs="Calibri"/>
           <w:kern w:val="0"/>
           <w:lang w:eastAsia="en-GB"/>
           <w14:ligatures w14:val="none"/>
@@ -1339,7 +1491,7 @@
         </w:numPr>
         <w:spacing w:before="100" w:beforeAutospacing="1" w:after="100" w:afterAutospacing="1" w:line="240" w:lineRule="auto"/>
         <w:rPr>
-          <w:rFonts w:ascii="Times New Roman" w:eastAsia="Times New Roman" w:hAnsi="Times New Roman" w:cs="Times New Roman"/>
+          <w:rFonts w:ascii="Calibri" w:eastAsia="Times New Roman" w:hAnsi="Calibri" w:cs="Calibri"/>
           <w:kern w:val="0"/>
           <w:lang w:eastAsia="en-GB"/>
           <w14:ligatures w14:val="none"/>
@@ -1347,7 +1499,7 @@
       </w:pPr>
       <w:r>
         <w:rPr>
-          <w:rFonts w:ascii="Times New Roman" w:eastAsia="Times New Roman" w:hAnsi="Times New Roman" w:cs="Times New Roman"/>
+          <w:rFonts w:ascii="Calibri" w:eastAsia="Times New Roman" w:hAnsi="Calibri" w:cs="Calibri"/>
           <w:b/>
           <w:bCs/>
           <w:kern w:val="0"/>
@@ -1358,7 +1510,7 @@
       </w:r>
       <w:r>
         <w:rPr>
-          <w:rFonts w:ascii="Times New Roman" w:eastAsia="Times New Roman" w:hAnsi="Times New Roman" w:cs="Times New Roman"/>
+          <w:rFonts w:ascii="Calibri" w:eastAsia="Times New Roman" w:hAnsi="Calibri" w:cs="Calibri"/>
           <w:b/>
           <w:bCs/>
           <w:kern w:val="0"/>
@@ -1372,7 +1524,7 @@
       <w:pPr>
         <w:spacing w:before="100" w:beforeAutospacing="1" w:after="100" w:afterAutospacing="1" w:line="240" w:lineRule="auto"/>
         <w:rPr>
-          <w:rFonts w:ascii="Times New Roman" w:eastAsia="Times New Roman" w:hAnsi="Times New Roman" w:cs="Times New Roman"/>
+          <w:rFonts w:ascii="Calibri" w:eastAsia="Times New Roman" w:hAnsi="Calibri" w:cs="Calibri"/>
           <w:b/>
           <w:bCs/>
           <w:kern w:val="0"/>
@@ -1382,64 +1534,72 @@
       </w:pPr>
       <w:r>
         <w:rPr>
-          <w:b/>
-          <w:bCs/>
-        </w:rPr>
-        <w:br/>
-      </w:r>
-      <w:r>
-        <w:rPr>
-          <w:b/>
-          <w:bCs/>
-        </w:rPr>
-        <w:br/>
-      </w:r>
-      <w:r>
-        <w:rPr>
-          <w:b/>
-          <w:bCs/>
-        </w:rPr>
-        <w:br/>
-      </w:r>
-      <w:r>
-        <w:rPr>
-          <w:b/>
-          <w:bCs/>
-        </w:rPr>
-        <w:br/>
-      </w:r>
-      <w:r>
-        <w:rPr>
+          <w:rFonts w:ascii="Calibri" w:hAnsi="Calibri" w:cs="Calibri"/>
+          <w:b/>
+          <w:bCs/>
+        </w:rPr>
+        <w:br/>
+      </w:r>
+      <w:r>
+        <w:rPr>
+          <w:rFonts w:ascii="Calibri" w:hAnsi="Calibri" w:cs="Calibri"/>
+          <w:b/>
+          <w:bCs/>
+        </w:rPr>
+        <w:br/>
+      </w:r>
+      <w:r>
+        <w:rPr>
+          <w:rFonts w:ascii="Calibri" w:hAnsi="Calibri" w:cs="Calibri"/>
+          <w:b/>
+          <w:bCs/>
+        </w:rPr>
+        <w:br/>
+      </w:r>
+      <w:r>
+        <w:rPr>
+          <w:rFonts w:ascii="Calibri" w:hAnsi="Calibri" w:cs="Calibri"/>
+          <w:b/>
+          <w:bCs/>
+        </w:rPr>
+        <w:br/>
+      </w:r>
+      <w:r>
+        <w:rPr>
+          <w:rFonts w:ascii="Calibri" w:hAnsi="Calibri" w:cs="Calibri"/>
+          <w:b/>
+          <w:bCs/>
+        </w:rPr>
+        <w:t>Polymorphism allows different objects to respond to the same method call in their own way.</w:t>
+      </w:r>
+      <w:r>
+        <w:rPr>
+          <w:rFonts w:ascii="Calibri" w:hAnsi="Calibri" w:cs="Calibri"/>
+          <w:b/>
+          <w:bCs/>
+        </w:rPr>
+        <w:br/>
+      </w:r>
+      <w:r>
+        <w:rPr>
+          <w:rFonts w:ascii="Calibri" w:hAnsi="Calibri" w:cs="Calibri"/>
           <w:b/>
           <w:bCs/>
         </w:rPr>
         <w:lastRenderedPageBreak/>
-        <w:t>Polymorphism allows different objects to respond to the same method call in their own way.</w:t>
-      </w:r>
-      <w:r>
-        <w:rPr>
-          <w:b/>
-          <w:bCs/>
-        </w:rPr>
-        <w:br/>
-      </w:r>
-      <w:r>
-        <w:rPr>
-          <w:b/>
-          <w:bCs/>
-        </w:rPr>
-        <w:br/>
-      </w:r>
-      <w:r>
-        <w:rPr>
-          <w:b/>
-          <w:bCs/>
-        </w:rPr>
-        <w:br/>
-      </w:r>
-      <w:r>
-        <w:rPr>
-          <w:rFonts w:ascii="Times New Roman" w:eastAsia="Times New Roman" w:hAnsi="Times New Roman" w:cs="Times New Roman"/>
+        <w:br/>
+      </w:r>
+      <w:r>
+        <w:rPr>
+          <w:rFonts w:ascii="Calibri" w:hAnsi="Calibri" w:cs="Calibri"/>
+          <w:b/>
+          <w:bCs/>
+        </w:rPr>
+        <w:br/>
+      </w:r>
+      <w:r>
+        <w:rPr>
+          <w:rFonts w:ascii="Calibri" w:eastAsia="Times New Roman" w:hAnsi="Calibri" w:cs="Calibri"/>
           <w:b/>
           <w:bCs/>
           <w:kern w:val="0"/>
@@ -1450,7 +1610,7 @@
       </w:r>
       <w:r>
         <w:rPr>
-          <w:rFonts w:ascii="Times New Roman" w:eastAsia="Times New Roman" w:hAnsi="Times New Roman" w:cs="Times New Roman"/>
+          <w:rFonts w:ascii="Calibri" w:eastAsia="Times New Roman" w:hAnsi="Calibri" w:cs="Calibri"/>
           <w:b/>
           <w:bCs/>
           <w:kern w:val="0"/>
@@ -1461,7 +1621,7 @@
       </w:r>
       <w:r>
         <w:rPr>
-          <w:rFonts w:ascii="Times New Roman" w:eastAsia="Times New Roman" w:hAnsi="Times New Roman" w:cs="Times New Roman"/>
+          <w:rFonts w:ascii="Calibri" w:eastAsia="Times New Roman" w:hAnsi="Calibri" w:cs="Calibri"/>
           <w:b/>
           <w:bCs/>
           <w:kern w:val="0"/>
@@ -1472,7 +1632,7 @@
       </w:r>
       <w:r>
         <w:rPr>
-          <w:rFonts w:ascii="Times New Roman" w:eastAsia="Times New Roman" w:hAnsi="Times New Roman" w:cs="Times New Roman"/>
+          <w:rFonts w:ascii="Calibri" w:eastAsia="Times New Roman" w:hAnsi="Calibri" w:cs="Calibri"/>
           <w:b/>
           <w:bCs/>
           <w:noProof/>
@@ -1526,7 +1686,7 @@
       <w:pPr>
         <w:spacing w:before="100" w:beforeAutospacing="1" w:after="100" w:afterAutospacing="1" w:line="240" w:lineRule="auto"/>
         <w:rPr>
-          <w:rFonts w:ascii="Times New Roman" w:eastAsia="Times New Roman" w:hAnsi="Times New Roman" w:cs="Times New Roman"/>
+          <w:rFonts w:ascii="Calibri" w:eastAsia="Times New Roman" w:hAnsi="Calibri" w:cs="Calibri"/>
           <w:b/>
           <w:bCs/>
           <w:kern w:val="0"/>
@@ -1536,7 +1696,7 @@
       </w:pPr>
       <w:r>
         <w:rPr>
-          <w:rFonts w:ascii="Times New Roman" w:eastAsia="Times New Roman" w:hAnsi="Times New Roman" w:cs="Times New Roman"/>
+          <w:rFonts w:ascii="Calibri" w:eastAsia="Times New Roman" w:hAnsi="Calibri" w:cs="Calibri"/>
           <w:b/>
           <w:bCs/>
           <w:kern w:val="0"/>
@@ -1547,7 +1707,7 @@
       </w:r>
       <w:r>
         <w:rPr>
-          <w:rFonts w:ascii="Times New Roman" w:eastAsia="Times New Roman" w:hAnsi="Times New Roman" w:cs="Times New Roman"/>
+          <w:rFonts w:ascii="Calibri" w:eastAsia="Times New Roman" w:hAnsi="Calibri" w:cs="Calibri"/>
           <w:b/>
           <w:bCs/>
           <w:kern w:val="0"/>
@@ -1561,12 +1721,14 @@
       <w:pPr>
         <w:pStyle w:val="p1"/>
         <w:rPr>
-          <w:b/>
-          <w:bCs/>
-        </w:rPr>
-      </w:pPr>
-      <w:r>
-        <w:rPr>
+          <w:rFonts w:ascii="Calibri" w:hAnsi="Calibri" w:cs="Calibri"/>
+          <w:b/>
+          <w:bCs/>
+        </w:rPr>
+      </w:pPr>
+      <w:r>
+        <w:rPr>
+          <w:rFonts w:ascii="Calibri" w:hAnsi="Calibri" w:cs="Calibri"/>
           <w:b/>
           <w:bCs/>
           <w:noProof/>
@@ -1616,6 +1778,7 @@
       </w:r>
       <w:r>
         <w:rPr>
+          <w:rFonts w:ascii="Calibri" w:hAnsi="Calibri" w:cs="Calibri"/>
           <w:b/>
           <w:bCs/>
           <w:noProof/>
@@ -1668,12 +1831,14 @@
       <w:pPr>
         <w:pStyle w:val="p1"/>
         <w:rPr>
-          <w:b/>
-          <w:bCs/>
-        </w:rPr>
-      </w:pPr>
-      <w:r>
-        <w:rPr>
+          <w:rFonts w:ascii="Calibri" w:hAnsi="Calibri" w:cs="Calibri"/>
+          <w:b/>
+          <w:bCs/>
+        </w:rPr>
+      </w:pPr>
+      <w:r>
+        <w:rPr>
+          <w:rFonts w:ascii="Calibri" w:hAnsi="Calibri" w:cs="Calibri"/>
           <w:b/>
           <w:bCs/>
         </w:rPr>
@@ -1683,31 +1848,416 @@
     <w:p>
       <w:pPr>
         <w:pStyle w:val="p1"/>
+        <w:rPr>
+          <w:rFonts w:ascii="Calibri" w:hAnsi="Calibri" w:cs="Calibri"/>
+        </w:rPr>
       </w:pPr>
     </w:p>
     <w:p>
       <w:pPr>
         <w:rPr>
-          <w:b/>
-          <w:bCs/>
-          <w:lang w:val="en-US"/>
-        </w:rPr>
-      </w:pPr>
+          <w:rFonts w:ascii="Calibri" w:hAnsi="Calibri" w:cs="Calibri"/>
+          <w:lang w:val="en-US"/>
+        </w:rPr>
+      </w:pPr>
+      <w:r>
+        <w:rPr>
+          <w:rFonts w:ascii="Calibri" w:hAnsi="Calibri" w:cs="Calibri"/>
+          <w:b/>
+          <w:bCs/>
+          <w:lang w:val="en-US"/>
+        </w:rPr>
+        <w:lastRenderedPageBreak/>
+        <w:t>Value type and reference type:</w:t>
+      </w:r>
+      <w:r>
+        <w:rPr>
+          <w:rFonts w:ascii="Calibri" w:hAnsi="Calibri" w:cs="Calibri"/>
+          <w:lang w:val="en-US"/>
+        </w:rPr>
+        <w:br/>
+      </w:r>
+      <w:r>
+        <w:rPr>
+          <w:rFonts w:ascii="Calibri" w:hAnsi="Calibri" w:cs="Calibri"/>
+          <w:lang w:val="en-US"/>
+        </w:rPr>
+        <w:br/>
+      </w:r>
+      <w:r>
+        <w:rPr>
+          <w:rFonts w:ascii="Calibri" w:hAnsi="Calibri" w:cs="Calibri"/>
+          <w:b/>
+          <w:bCs/>
+          <w:lang w:val="en-US"/>
+        </w:rPr>
+        <w:t>Value type:</w:t>
+      </w:r>
+      <w:r>
+        <w:rPr>
+          <w:rFonts w:ascii="Calibri" w:hAnsi="Calibri" w:cs="Calibri"/>
+          <w:lang w:val="en-US"/>
+        </w:rPr>
+        <w:t xml:space="preserve"> Each instance </w:t>
+      </w:r>
+      <w:proofErr w:type="gramStart"/>
+      <w:r>
+        <w:rPr>
+          <w:rFonts w:ascii="Calibri" w:hAnsi="Calibri" w:cs="Calibri"/>
+          <w:lang w:val="en-US"/>
+        </w:rPr>
+        <w:t>keep</w:t>
+      </w:r>
+      <w:proofErr w:type="gramEnd"/>
+      <w:r>
+        <w:rPr>
+          <w:rFonts w:ascii="Calibri" w:hAnsi="Calibri" w:cs="Calibri"/>
+          <w:lang w:val="en-US"/>
+        </w:rPr>
+        <w:t xml:space="preserve"> its own copy.</w:t>
+      </w:r>
     </w:p>
     <w:p>
       <w:pPr>
         <w:rPr>
-          <w:lang w:val="en-US"/>
-        </w:rPr>
-      </w:pPr>
-      <w:r>
-        <w:rPr>
-          <w:b/>
-          <w:bCs/>
-          <w:lang w:val="en-US"/>
-        </w:rPr>
-        <w:br/>
-      </w:r>
+          <w:rFonts w:ascii="Calibri" w:hAnsi="Calibri" w:cs="Calibri"/>
+          <w:lang w:val="en-US"/>
+        </w:rPr>
+      </w:pPr>
+      <w:r>
+        <w:rPr>
+          <w:rFonts w:ascii="Calibri" w:hAnsi="Calibri" w:cs="Calibri"/>
+          <w:b/>
+          <w:bCs/>
+          <w:lang w:val="en-US"/>
+        </w:rPr>
+        <w:t>Example:</w:t>
+      </w:r>
+      <w:r>
+        <w:rPr>
+          <w:rFonts w:ascii="Calibri" w:hAnsi="Calibri" w:cs="Calibri"/>
+          <w:lang w:val="en-US"/>
+        </w:rPr>
+        <w:br/>
+      </w:r>
+      <w:r>
+        <w:rPr>
+          <w:rFonts w:ascii="Calibri" w:hAnsi="Calibri" w:cs="Calibri"/>
+          <w:lang w:val="en-US"/>
+        </w:rPr>
+        <w:br/>
+        <w:t xml:space="preserve">struct, </w:t>
+      </w:r>
+      <w:proofErr w:type="spellStart"/>
+      <w:r>
+        <w:rPr>
+          <w:rFonts w:ascii="Calibri" w:hAnsi="Calibri" w:cs="Calibri"/>
+          <w:lang w:val="en-US"/>
+        </w:rPr>
+        <w:t>enum</w:t>
+      </w:r>
+      <w:proofErr w:type="spellEnd"/>
+      <w:r>
+        <w:rPr>
+          <w:rFonts w:ascii="Calibri" w:hAnsi="Calibri" w:cs="Calibri"/>
+          <w:lang w:val="en-US"/>
+        </w:rPr>
+        <w:t>, tuple.</w:t>
+      </w:r>
+      <w:r>
+        <w:rPr>
+          <w:rFonts w:ascii="Calibri" w:hAnsi="Calibri" w:cs="Calibri"/>
+          <w:lang w:val="en-US"/>
+        </w:rPr>
+        <w:br/>
+        <w:t xml:space="preserve">Int, String, Double, </w:t>
+      </w:r>
+      <w:r>
+        <w:rPr>
+          <w:rFonts w:ascii="Calibri" w:hAnsi="Calibri" w:cs="Calibri"/>
+          <w:lang w:val="en-US"/>
+        </w:rPr>
+        <w:t xml:space="preserve">Array, Dictionary are </w:t>
+      </w:r>
+      <w:proofErr w:type="gramStart"/>
+      <w:r>
+        <w:rPr>
+          <w:rFonts w:ascii="Calibri" w:hAnsi="Calibri" w:cs="Calibri"/>
+          <w:lang w:val="en-US"/>
+        </w:rPr>
+        <w:t>struct</w:t>
+      </w:r>
+      <w:proofErr w:type="gramEnd"/>
+      <w:r>
+        <w:rPr>
+          <w:rFonts w:ascii="Calibri" w:hAnsi="Calibri" w:cs="Calibri"/>
+          <w:lang w:val="en-US"/>
+        </w:rPr>
+        <w:t xml:space="preserve"> type.</w:t>
+      </w:r>
+    </w:p>
+    <w:p>
+      <w:pPr>
+        <w:rPr>
+          <w:rFonts w:ascii="Calibri" w:hAnsi="Calibri" w:cs="Calibri"/>
+          <w:lang w:val="en-US"/>
+        </w:rPr>
+      </w:pPr>
+    </w:p>
+    <w:p>
+      <w:pPr>
+        <w:rPr>
+          <w:rFonts w:ascii="Calibri" w:hAnsi="Calibri" w:cs="Calibri"/>
+          <w:b/>
+          <w:bCs/>
+          <w:lang w:val="en-US"/>
+        </w:rPr>
+      </w:pPr>
+      <w:r>
+        <w:rPr>
+          <w:rFonts w:ascii="Calibri" w:hAnsi="Calibri" w:cs="Calibri"/>
+          <w:b/>
+          <w:bCs/>
+          <w:lang w:val="en-US"/>
+        </w:rPr>
+        <w:t>Reference type:</w:t>
+      </w:r>
+    </w:p>
+    <w:p>
+      <w:pPr>
+        <w:rPr>
+          <w:rFonts w:ascii="Calibri" w:hAnsi="Calibri" w:cs="Calibri"/>
+          <w:lang w:val="en-US"/>
+        </w:rPr>
+      </w:pPr>
+      <w:r>
+        <w:rPr>
+          <w:rFonts w:ascii="Calibri" w:hAnsi="Calibri" w:cs="Calibri"/>
+          <w:lang w:val="en-US"/>
+        </w:rPr>
+        <w:t>Each reference shared the same data while assign and passing to the function.</w:t>
+      </w:r>
+    </w:p>
+    <w:p>
+      <w:pPr>
+        <w:rPr>
+          <w:rFonts w:ascii="Calibri" w:hAnsi="Calibri" w:cs="Calibri"/>
+          <w:b/>
+          <w:bCs/>
+          <w:lang w:val="en-US"/>
+        </w:rPr>
+      </w:pPr>
+      <w:r>
+        <w:rPr>
+          <w:rFonts w:ascii="Calibri" w:hAnsi="Calibri" w:cs="Calibri"/>
+          <w:b/>
+          <w:bCs/>
+          <w:lang w:val="en-US"/>
+        </w:rPr>
+        <w:t>Example:</w:t>
+      </w:r>
+    </w:p>
+    <w:p>
+      <w:pPr>
+        <w:rPr>
+          <w:rFonts w:ascii="Calibri" w:hAnsi="Calibri" w:cs="Calibri"/>
+          <w:lang w:val="en-US"/>
+        </w:rPr>
+      </w:pPr>
+      <w:r>
+        <w:rPr>
+          <w:rFonts w:ascii="Calibri" w:hAnsi="Calibri" w:cs="Calibri"/>
+          <w:lang w:val="en-US"/>
+        </w:rPr>
+        <w:t xml:space="preserve">Class, Closure, </w:t>
+      </w:r>
+      <w:proofErr w:type="spellStart"/>
+      <w:r>
+        <w:rPr>
+          <w:rFonts w:ascii="Calibri" w:hAnsi="Calibri" w:cs="Calibri"/>
+          <w:lang w:val="en-US"/>
+        </w:rPr>
+        <w:t>AnyObject</w:t>
+      </w:r>
+      <w:proofErr w:type="spellEnd"/>
+      <w:r>
+        <w:rPr>
+          <w:rFonts w:ascii="Calibri" w:hAnsi="Calibri" w:cs="Calibri"/>
+          <w:lang w:val="en-US"/>
+        </w:rPr>
+        <w:t>, actor.</w:t>
+      </w:r>
+    </w:p>
+    <w:p>
+      <w:pPr>
+        <w:rPr>
+          <w:rFonts w:ascii="Calibri" w:hAnsi="Calibri" w:cs="Calibri"/>
+          <w:lang w:val="en-US"/>
+        </w:rPr>
+      </w:pPr>
+    </w:p>
+    <w:p>
+      <w:pPr>
+        <w:rPr>
+          <w:rFonts w:ascii="Calibri" w:hAnsi="Calibri" w:cs="Calibri"/>
+          <w:b/>
+          <w:bCs/>
+          <w:lang w:val="en-US"/>
+        </w:rPr>
+      </w:pPr>
+      <w:r>
+        <w:rPr>
+          <w:rFonts w:ascii="Calibri" w:hAnsi="Calibri" w:cs="Calibri"/>
+          <w:b/>
+          <w:bCs/>
+          <w:lang w:val="en-US"/>
+        </w:rPr>
+        <w:t>actor:</w:t>
+      </w:r>
+      <w:r>
+        <w:rPr>
+          <w:rFonts w:ascii="Calibri" w:hAnsi="Calibri" w:cs="Calibri"/>
+          <w:b/>
+          <w:bCs/>
+          <w:lang w:val="en-US"/>
+        </w:rPr>
+        <w:br/>
+      </w:r>
+      <w:r>
+        <w:rPr>
+          <w:rFonts w:ascii="Calibri" w:hAnsi="Calibri" w:cs="Calibri"/>
+          <w:b/>
+          <w:bCs/>
+          <w:lang w:val="en-US"/>
+        </w:rPr>
+        <w:br/>
+      </w:r>
+      <w:r>
+        <w:rPr>
+          <w:rFonts w:ascii="Calibri" w:hAnsi="Calibri" w:cs="Calibri"/>
+          <w:lang w:val="en-US"/>
+        </w:rPr>
+        <w:t>actor is a reference type which is used to providing thread safe environment in multithreading.</w:t>
+      </w:r>
+      <w:r>
+        <w:rPr>
+          <w:rFonts w:ascii="Calibri" w:hAnsi="Calibri" w:cs="Calibri"/>
+          <w:b/>
+          <w:bCs/>
+          <w:lang w:val="en-US"/>
+        </w:rPr>
+        <w:br/>
+      </w:r>
+      <w:r>
+        <w:rPr>
+          <w:rFonts w:ascii="Calibri" w:hAnsi="Calibri" w:cs="Calibri"/>
+          <w:b/>
+          <w:bCs/>
+          <w:lang w:val="en-US"/>
+        </w:rPr>
+        <w:br/>
+      </w:r>
+      <w:r>
+        <w:rPr>
+          <w:rFonts w:ascii="Calibri" w:hAnsi="Calibri" w:cs="Calibri"/>
+          <w:lang w:val="en-US"/>
+        </w:rPr>
+        <w:t>- reference type</w:t>
+      </w:r>
+      <w:r>
+        <w:rPr>
+          <w:rFonts w:ascii="Calibri" w:hAnsi="Calibri" w:cs="Calibri"/>
+          <w:lang w:val="en-US"/>
+        </w:rPr>
+        <w:br/>
+        <w:t xml:space="preserve">- </w:t>
+      </w:r>
+      <w:r>
+        <w:rPr>
+          <w:rFonts w:ascii="Calibri" w:hAnsi="Calibri" w:cs="Calibri"/>
+          <w:lang w:val="en-US"/>
+        </w:rPr>
+        <w:t>‘</w:t>
+      </w:r>
+      <w:r>
+        <w:rPr>
+          <w:rFonts w:ascii="Calibri" w:hAnsi="Calibri" w:cs="Calibri"/>
+          <w:lang w:val="en-US"/>
+        </w:rPr>
+        <w:t>actor</w:t>
+      </w:r>
+      <w:r>
+        <w:rPr>
+          <w:rFonts w:ascii="Calibri" w:hAnsi="Calibri" w:cs="Calibri"/>
+          <w:lang w:val="en-US"/>
+        </w:rPr>
+        <w:t>’</w:t>
+      </w:r>
+      <w:r>
+        <w:rPr>
+          <w:rFonts w:ascii="Calibri" w:hAnsi="Calibri" w:cs="Calibri"/>
+          <w:lang w:val="en-US"/>
+        </w:rPr>
+        <w:t xml:space="preserve"> keyword</w:t>
+      </w:r>
+      <w:r>
+        <w:rPr>
+          <w:rFonts w:ascii="Calibri" w:hAnsi="Calibri" w:cs="Calibri"/>
+          <w:lang w:val="en-US"/>
+        </w:rPr>
+        <w:br/>
+        <w:t xml:space="preserve">- </w:t>
+      </w:r>
+      <w:r>
+        <w:rPr>
+          <w:rFonts w:ascii="Calibri" w:hAnsi="Calibri" w:cs="Calibri"/>
+          <w:lang w:val="en-US"/>
+        </w:rPr>
+        <w:t>Methods are isolated.</w:t>
+      </w:r>
+      <w:r>
+        <w:rPr>
+          <w:rFonts w:ascii="Calibri" w:hAnsi="Calibri" w:cs="Calibri"/>
+          <w:lang w:val="en-US"/>
+        </w:rPr>
+        <w:br/>
+        <w:t>- await keyword use to call the method</w:t>
+      </w:r>
+      <w:r>
+        <w:rPr>
+          <w:rFonts w:ascii="Calibri" w:hAnsi="Calibri" w:cs="Calibri"/>
+          <w:lang w:val="en-US"/>
+        </w:rPr>
+        <w:br/>
+        <w:t>- no inheritance.</w:t>
+      </w:r>
+      <w:r>
+        <w:rPr>
+          <w:rFonts w:ascii="Calibri" w:hAnsi="Calibri" w:cs="Calibri"/>
+          <w:lang w:val="en-US"/>
+        </w:rPr>
+        <w:br/>
+        <w:t>- Stored in heap memory.</w:t>
+      </w:r>
+      <w:r>
+        <w:rPr>
+          <w:rFonts w:ascii="Calibri" w:hAnsi="Calibri" w:cs="Calibri"/>
+          <w:b/>
+          <w:bCs/>
+          <w:lang w:val="en-US"/>
+        </w:rPr>
+        <w:br/>
+      </w:r>
+    </w:p>
+    <w:p>
+      <w:pPr>
+        <w:rPr>
+          <w:rFonts w:ascii="Calibri" w:hAnsi="Calibri" w:cs="Calibri"/>
+          <w:b/>
+          <w:bCs/>
+          <w:lang w:val="en-US"/>
+        </w:rPr>
+      </w:pPr>
     </w:p>
     <w:sectPr>
       <w:pgSz w:w="11906" w:h="16838"/>

</xml_diff>

<commit_message>
Doc-Interview-2026 - Properteis - P.28-34
</commit_message>
<xml_diff>
--- a/Documents/Interview-2026.docx
+++ b/Documents/Interview-2026.docx
@@ -8,14 +8,18 @@
           <w:rFonts w:ascii="Calibri" w:hAnsi="Calibri" w:cs="Calibri"/>
           <w:b/>
           <w:bCs/>
-          <w:lang w:val="en-US"/>
-        </w:rPr>
-      </w:pPr>
-      <w:r>
-        <w:rPr>
-          <w:rFonts w:ascii="Calibri" w:hAnsi="Calibri" w:cs="Calibri"/>
-          <w:b/>
-          <w:bCs/>
+          <w:sz w:val="22"/>
+          <w:szCs w:val="22"/>
+          <w:lang w:val="en-US"/>
+        </w:rPr>
+      </w:pPr>
+      <w:r>
+        <w:rPr>
+          <w:rFonts w:ascii="Calibri" w:hAnsi="Calibri" w:cs="Calibri"/>
+          <w:b/>
+          <w:bCs/>
+          <w:sz w:val="22"/>
+          <w:szCs w:val="22"/>
           <w:lang w:val="en-US"/>
         </w:rPr>
         <w:t>Oop</w:t>
@@ -25,6 +29,8 @@
           <w:rFonts w:ascii="Calibri" w:hAnsi="Calibri" w:cs="Calibri"/>
           <w:b/>
           <w:bCs/>
+          <w:sz w:val="22"/>
+          <w:szCs w:val="22"/>
           <w:lang w:val="en-US"/>
         </w:rPr>
         <w:t>s:</w:t>
@@ -34,12 +40,16 @@
       <w:pPr>
         <w:rPr>
           <w:rFonts w:ascii="Calibri" w:hAnsi="Calibri" w:cs="Calibri"/>
-          <w:lang w:val="en-US"/>
-        </w:rPr>
-      </w:pPr>
-      <w:r>
-        <w:rPr>
-          <w:rFonts w:ascii="Calibri" w:hAnsi="Calibri" w:cs="Calibri"/>
+          <w:sz w:val="22"/>
+          <w:szCs w:val="22"/>
+          <w:lang w:val="en-US"/>
+        </w:rPr>
+      </w:pPr>
+      <w:r>
+        <w:rPr>
+          <w:rFonts w:ascii="Calibri" w:hAnsi="Calibri" w:cs="Calibri"/>
+          <w:sz w:val="22"/>
+          <w:szCs w:val="22"/>
           <w:lang w:val="en-US"/>
         </w:rPr>
         <w:t>Oop</w:t>
@@ -47,6 +57,8 @@
       <w:r>
         <w:rPr>
           <w:rFonts w:ascii="Calibri" w:hAnsi="Calibri" w:cs="Calibri"/>
+          <w:sz w:val="22"/>
+          <w:szCs w:val="22"/>
           <w:lang w:val="en-US"/>
         </w:rPr>
         <w:t>s</w:t>
@@ -54,6 +66,8 @@
       <w:r>
         <w:rPr>
           <w:rFonts w:ascii="Calibri" w:hAnsi="Calibri" w:cs="Calibri"/>
+          <w:sz w:val="22"/>
+          <w:szCs w:val="22"/>
           <w:lang w:val="en-US"/>
         </w:rPr>
         <w:t xml:space="preserve"> </w:t>
@@ -61,6 +75,8 @@
       <w:r>
         <w:rPr>
           <w:rFonts w:ascii="Calibri" w:hAnsi="Calibri" w:cs="Calibri"/>
+          <w:sz w:val="22"/>
+          <w:szCs w:val="22"/>
           <w:lang w:val="en-US"/>
         </w:rPr>
         <w:t>(Object oriented programming) is programming paradigm which is using to designed software using Object that combine data(properties) and behavior (methods).</w:t>
@@ -68,13 +84,17 @@
       <w:r>
         <w:rPr>
           <w:rFonts w:ascii="Calibri" w:hAnsi="Calibri" w:cs="Calibri"/>
-          <w:lang w:val="en-US"/>
-        </w:rPr>
-        <w:br/>
-      </w:r>
-      <w:r>
-        <w:rPr>
-          <w:rFonts w:ascii="Calibri" w:hAnsi="Calibri" w:cs="Calibri"/>
+          <w:sz w:val="22"/>
+          <w:szCs w:val="22"/>
+          <w:lang w:val="en-US"/>
+        </w:rPr>
+        <w:br/>
+      </w:r>
+      <w:r>
+        <w:rPr>
+          <w:rFonts w:ascii="Calibri" w:hAnsi="Calibri" w:cs="Calibri"/>
+          <w:sz w:val="22"/>
+          <w:szCs w:val="22"/>
           <w:lang w:val="en-US"/>
         </w:rPr>
         <w:br/>
@@ -83,13 +103,17 @@
       <w:r>
         <w:rPr>
           <w:rFonts w:ascii="Calibri" w:hAnsi="Calibri" w:cs="Calibri"/>
-          <w:lang w:val="en-US"/>
-        </w:rPr>
-        <w:br/>
-      </w:r>
-      <w:r>
-        <w:rPr>
-          <w:rFonts w:ascii="Calibri" w:hAnsi="Calibri" w:cs="Calibri"/>
+          <w:sz w:val="22"/>
+          <w:szCs w:val="22"/>
+          <w:lang w:val="en-US"/>
+        </w:rPr>
+        <w:br/>
+      </w:r>
+      <w:r>
+        <w:rPr>
+          <w:rFonts w:ascii="Calibri" w:hAnsi="Calibri" w:cs="Calibri"/>
+          <w:sz w:val="22"/>
+          <w:szCs w:val="22"/>
           <w:lang w:val="en-US"/>
         </w:rPr>
         <w:t xml:space="preserve">Methods: </w:t>
@@ -98,6 +122,8 @@
       <w:r>
         <w:rPr>
           <w:rFonts w:ascii="Calibri" w:hAnsi="Calibri" w:cs="Calibri"/>
+          <w:sz w:val="22"/>
+          <w:szCs w:val="22"/>
           <w:lang w:val="en-US"/>
         </w:rPr>
         <w:t>talking(</w:t>
@@ -106,6 +132,8 @@
       <w:r>
         <w:rPr>
           <w:rFonts w:ascii="Calibri" w:hAnsi="Calibri" w:cs="Calibri"/>
+          <w:sz w:val="22"/>
+          <w:szCs w:val="22"/>
           <w:lang w:val="en-US"/>
         </w:rPr>
         <w:t xml:space="preserve">), </w:t>
@@ -114,6 +142,8 @@
       <w:r>
         <w:rPr>
           <w:rFonts w:ascii="Calibri" w:hAnsi="Calibri" w:cs="Calibri"/>
+          <w:sz w:val="22"/>
+          <w:szCs w:val="22"/>
           <w:lang w:val="en-US"/>
         </w:rPr>
         <w:t>saving(</w:t>
@@ -122,6 +152,8 @@
       <w:r>
         <w:rPr>
           <w:rFonts w:ascii="Calibri" w:hAnsi="Calibri" w:cs="Calibri"/>
+          <w:sz w:val="22"/>
+          <w:szCs w:val="22"/>
           <w:lang w:val="en-US"/>
         </w:rPr>
         <w:t xml:space="preserve">), </w:t>
@@ -130,6 +162,8 @@
       <w:r>
         <w:rPr>
           <w:rFonts w:ascii="Calibri" w:hAnsi="Calibri" w:cs="Calibri"/>
+          <w:sz w:val="22"/>
+          <w:szCs w:val="22"/>
           <w:lang w:val="en-US"/>
         </w:rPr>
         <w:t>running(</w:t>
@@ -138,6 +172,8 @@
       <w:r>
         <w:rPr>
           <w:rFonts w:ascii="Calibri" w:hAnsi="Calibri" w:cs="Calibri"/>
+          <w:sz w:val="22"/>
+          <w:szCs w:val="22"/>
           <w:lang w:val="en-US"/>
         </w:rPr>
         <w:t>).</w:t>
@@ -145,22 +181,28 @@
       <w:r>
         <w:rPr>
           <w:rFonts w:ascii="Calibri" w:hAnsi="Calibri" w:cs="Calibri"/>
-          <w:lang w:val="en-US"/>
-        </w:rPr>
-        <w:br/>
-      </w:r>
-      <w:r>
-        <w:rPr>
-          <w:rFonts w:ascii="Calibri" w:hAnsi="Calibri" w:cs="Calibri"/>
-          <w:lang w:val="en-US"/>
-        </w:rPr>
-        <w:br/>
-      </w:r>
-      <w:r>
-        <w:rPr>
-          <w:rFonts w:ascii="Calibri" w:hAnsi="Calibri" w:cs="Calibri"/>
-          <w:b/>
-          <w:bCs/>
+          <w:sz w:val="22"/>
+          <w:szCs w:val="22"/>
+          <w:lang w:val="en-US"/>
+        </w:rPr>
+        <w:br/>
+      </w:r>
+      <w:r>
+        <w:rPr>
+          <w:rFonts w:ascii="Calibri" w:hAnsi="Calibri" w:cs="Calibri"/>
+          <w:sz w:val="22"/>
+          <w:szCs w:val="22"/>
+          <w:lang w:val="en-US"/>
+        </w:rPr>
+        <w:br/>
+      </w:r>
+      <w:r>
+        <w:rPr>
+          <w:rFonts w:ascii="Calibri" w:hAnsi="Calibri" w:cs="Calibri"/>
+          <w:b/>
+          <w:bCs/>
+          <w:sz w:val="22"/>
+          <w:szCs w:val="22"/>
           <w:lang w:val="en-US"/>
         </w:rPr>
         <w:t>Core concepts of OOP:</w:t>
@@ -168,22 +210,28 @@
       <w:r>
         <w:rPr>
           <w:rFonts w:ascii="Calibri" w:hAnsi="Calibri" w:cs="Calibri"/>
-          <w:lang w:val="en-US"/>
-        </w:rPr>
-        <w:br/>
-      </w:r>
-      <w:r>
-        <w:rPr>
-          <w:rFonts w:ascii="Calibri" w:hAnsi="Calibri" w:cs="Calibri"/>
-          <w:lang w:val="en-US"/>
-        </w:rPr>
-        <w:br/>
-      </w:r>
-      <w:r>
-        <w:rPr>
-          <w:rFonts w:ascii="Calibri" w:hAnsi="Calibri" w:cs="Calibri"/>
-          <w:b/>
-          <w:bCs/>
+          <w:sz w:val="22"/>
+          <w:szCs w:val="22"/>
+          <w:lang w:val="en-US"/>
+        </w:rPr>
+        <w:br/>
+      </w:r>
+      <w:r>
+        <w:rPr>
+          <w:rFonts w:ascii="Calibri" w:hAnsi="Calibri" w:cs="Calibri"/>
+          <w:sz w:val="22"/>
+          <w:szCs w:val="22"/>
+          <w:lang w:val="en-US"/>
+        </w:rPr>
+        <w:br/>
+      </w:r>
+      <w:r>
+        <w:rPr>
+          <w:rFonts w:ascii="Calibri" w:hAnsi="Calibri" w:cs="Calibri"/>
+          <w:b/>
+          <w:bCs/>
+          <w:sz w:val="22"/>
+          <w:szCs w:val="22"/>
           <w:lang w:val="en-US"/>
         </w:rPr>
         <w:t>1. Class:</w:t>
@@ -191,6 +239,8 @@
       <w:r>
         <w:rPr>
           <w:rFonts w:ascii="Calibri" w:hAnsi="Calibri" w:cs="Calibri"/>
+          <w:sz w:val="22"/>
+          <w:szCs w:val="22"/>
           <w:lang w:val="en-US"/>
         </w:rPr>
         <w:t xml:space="preserve"> Class is a blueprint or template for creating object. It defines properties (data) and behavior (method).</w:t>
@@ -198,13 +248,17 @@
       <w:r>
         <w:rPr>
           <w:rFonts w:ascii="Calibri" w:hAnsi="Calibri" w:cs="Calibri"/>
-          <w:lang w:val="en-US"/>
-        </w:rPr>
-        <w:br/>
-      </w:r>
-      <w:r>
-        <w:rPr>
-          <w:rFonts w:ascii="Calibri" w:hAnsi="Calibri" w:cs="Calibri"/>
+          <w:sz w:val="22"/>
+          <w:szCs w:val="22"/>
+          <w:lang w:val="en-US"/>
+        </w:rPr>
+        <w:br/>
+      </w:r>
+      <w:r>
+        <w:rPr>
+          <w:rFonts w:ascii="Calibri" w:hAnsi="Calibri" w:cs="Calibri"/>
+          <w:sz w:val="22"/>
+          <w:szCs w:val="22"/>
           <w:lang w:val="en-US"/>
         </w:rPr>
         <w:br/>
@@ -213,6 +267,8 @@
         <w:rPr>
           <w:rFonts w:ascii="Calibri" w:hAnsi="Calibri" w:cs="Calibri"/>
           <w:noProof/>
+          <w:sz w:val="22"/>
+          <w:szCs w:val="22"/>
           <w:lang w:val="en-US"/>
         </w:rPr>
         <w:drawing>
@@ -262,12 +318,16 @@
       <w:pPr>
         <w:rPr>
           <w:rFonts w:ascii="Calibri" w:hAnsi="Calibri" w:cs="Calibri"/>
-          <w:lang w:val="en-US"/>
-        </w:rPr>
-      </w:pPr>
-      <w:r>
-        <w:rPr>
-          <w:rFonts w:ascii="Calibri" w:hAnsi="Calibri" w:cs="Calibri"/>
+          <w:sz w:val="22"/>
+          <w:szCs w:val="22"/>
+          <w:lang w:val="en-US"/>
+        </w:rPr>
+      </w:pPr>
+      <w:r>
+        <w:rPr>
+          <w:rFonts w:ascii="Calibri" w:hAnsi="Calibri" w:cs="Calibri"/>
+          <w:sz w:val="22"/>
+          <w:szCs w:val="22"/>
           <w:lang w:val="en-US"/>
         </w:rPr>
         <w:t xml:space="preserve">2. </w:t>
@@ -277,6 +337,8 @@
           <w:rFonts w:ascii="Calibri" w:hAnsi="Calibri" w:cs="Calibri"/>
           <w:b/>
           <w:bCs/>
+          <w:sz w:val="22"/>
+          <w:szCs w:val="22"/>
           <w:lang w:val="en-US"/>
         </w:rPr>
         <w:t>Object:</w:t>
@@ -284,6 +346,8 @@
       <w:r>
         <w:rPr>
           <w:rFonts w:ascii="Calibri" w:hAnsi="Calibri" w:cs="Calibri"/>
+          <w:sz w:val="22"/>
+          <w:szCs w:val="22"/>
           <w:lang w:val="en-US"/>
         </w:rPr>
         <w:t xml:space="preserve"> Object is instance of any class </w:t>
@@ -291,6 +355,8 @@
       <w:r>
         <w:rPr>
           <w:rFonts w:ascii="Calibri" w:hAnsi="Calibri" w:cs="Calibri"/>
+          <w:sz w:val="22"/>
+          <w:szCs w:val="22"/>
           <w:lang w:val="en-US"/>
         </w:rPr>
         <w:t>that holds the data and perform actions on data defined by class.</w:t>
@@ -298,13 +364,17 @@
       <w:r>
         <w:rPr>
           <w:rFonts w:ascii="Calibri" w:hAnsi="Calibri" w:cs="Calibri"/>
-          <w:lang w:val="en-US"/>
-        </w:rPr>
-        <w:br/>
-      </w:r>
-      <w:r>
-        <w:rPr>
-          <w:rFonts w:ascii="Calibri" w:hAnsi="Calibri" w:cs="Calibri"/>
+          <w:sz w:val="22"/>
+          <w:szCs w:val="22"/>
+          <w:lang w:val="en-US"/>
+        </w:rPr>
+        <w:br/>
+      </w:r>
+      <w:r>
+        <w:rPr>
+          <w:rFonts w:ascii="Calibri" w:hAnsi="Calibri" w:cs="Calibri"/>
+          <w:sz w:val="22"/>
+          <w:szCs w:val="22"/>
           <w:lang w:val="en-US"/>
         </w:rPr>
         <w:br/>
@@ -313,6 +383,8 @@
         <w:rPr>
           <w:rFonts w:ascii="Calibri" w:hAnsi="Calibri" w:cs="Calibri"/>
           <w:noProof/>
+          <w:sz w:val="22"/>
+          <w:szCs w:val="22"/>
           <w:lang w:val="en-US"/>
         </w:rPr>
         <w:drawing>
@@ -362,12 +434,16 @@
       <w:pPr>
         <w:rPr>
           <w:rFonts w:ascii="Calibri" w:hAnsi="Calibri" w:cs="Calibri"/>
-          <w:lang w:val="en-US"/>
-        </w:rPr>
-      </w:pPr>
-      <w:r>
-        <w:rPr>
-          <w:rFonts w:ascii="Calibri" w:hAnsi="Calibri" w:cs="Calibri"/>
+          <w:sz w:val="22"/>
+          <w:szCs w:val="22"/>
+          <w:lang w:val="en-US"/>
+        </w:rPr>
+      </w:pPr>
+      <w:r>
+        <w:rPr>
+          <w:rFonts w:ascii="Calibri" w:hAnsi="Calibri" w:cs="Calibri"/>
+          <w:sz w:val="22"/>
+          <w:szCs w:val="22"/>
           <w:lang w:val="en-US"/>
         </w:rPr>
         <w:t xml:space="preserve">3. </w:t>
@@ -377,6 +453,8 @@
           <w:rFonts w:ascii="Calibri" w:hAnsi="Calibri" w:cs="Calibri"/>
           <w:b/>
           <w:bCs/>
+          <w:sz w:val="22"/>
+          <w:szCs w:val="22"/>
           <w:lang w:val="en-US"/>
         </w:rPr>
         <w:t xml:space="preserve">Encapsulation: </w:t>
@@ -384,6 +462,8 @@
       <w:r>
         <w:rPr>
           <w:rFonts w:ascii="Calibri" w:hAnsi="Calibri" w:cs="Calibri"/>
+          <w:sz w:val="22"/>
+          <w:szCs w:val="22"/>
           <w:lang w:val="en-US"/>
         </w:rPr>
         <w:t xml:space="preserve">Encapsulation is the concept of binding data and methods together, hiding internal details from outside the world and control access of data and methods using </w:t>
@@ -393,6 +473,8 @@
           <w:rFonts w:ascii="Calibri" w:hAnsi="Calibri" w:cs="Calibri"/>
           <w:b/>
           <w:bCs/>
+          <w:sz w:val="22"/>
+          <w:szCs w:val="22"/>
           <w:lang w:val="en-US"/>
         </w:rPr>
         <w:t xml:space="preserve">access </w:t>
@@ -402,6 +484,8 @@
           <w:rFonts w:ascii="Calibri" w:hAnsi="Calibri" w:cs="Calibri"/>
           <w:b/>
           <w:bCs/>
+          <w:sz w:val="22"/>
+          <w:szCs w:val="22"/>
           <w:lang w:val="en-US"/>
         </w:rPr>
         <w:t>modifier</w:t>
@@ -409,6 +493,8 @@
       <w:r>
         <w:rPr>
           <w:rFonts w:ascii="Calibri" w:hAnsi="Calibri" w:cs="Calibri"/>
+          <w:sz w:val="22"/>
+          <w:szCs w:val="22"/>
           <w:lang w:val="en-US"/>
         </w:rPr>
         <w:t xml:space="preserve"> -</w:t>
@@ -416,6 +502,8 @@
       <w:r>
         <w:rPr>
           <w:rFonts w:ascii="Calibri" w:hAnsi="Calibri" w:cs="Calibri"/>
+          <w:sz w:val="22"/>
+          <w:szCs w:val="22"/>
           <w:lang w:val="en-US"/>
         </w:rPr>
         <w:t xml:space="preserve"> </w:t>
@@ -425,6 +513,8 @@
           <w:rFonts w:ascii="Calibri" w:hAnsi="Calibri" w:cs="Calibri"/>
           <w:b/>
           <w:bCs/>
+          <w:sz w:val="22"/>
+          <w:szCs w:val="22"/>
           <w:lang w:val="en-US"/>
         </w:rPr>
         <w:t xml:space="preserve">open, public, internal, </w:t>
@@ -435,6 +525,8 @@
           <w:rFonts w:ascii="Calibri" w:hAnsi="Calibri" w:cs="Calibri"/>
           <w:b/>
           <w:bCs/>
+          <w:sz w:val="22"/>
+          <w:szCs w:val="22"/>
           <w:lang w:val="en-US"/>
         </w:rPr>
         <w:t>filePrivate</w:t>
@@ -445,6 +537,8 @@
           <w:rFonts w:ascii="Calibri" w:hAnsi="Calibri" w:cs="Calibri"/>
           <w:b/>
           <w:bCs/>
+          <w:sz w:val="22"/>
+          <w:szCs w:val="22"/>
           <w:lang w:val="en-US"/>
         </w:rPr>
         <w:t>, private.</w:t>
@@ -454,13 +548,17 @@
           <w:rFonts w:ascii="Calibri" w:hAnsi="Calibri" w:cs="Calibri"/>
           <w:b/>
           <w:bCs/>
-          <w:lang w:val="en-US"/>
-        </w:rPr>
-        <w:br/>
-      </w:r>
-      <w:r>
-        <w:rPr>
-          <w:rFonts w:ascii="Calibri" w:hAnsi="Calibri" w:cs="Calibri"/>
+          <w:sz w:val="22"/>
+          <w:szCs w:val="22"/>
+          <w:lang w:val="en-US"/>
+        </w:rPr>
+        <w:br/>
+      </w:r>
+      <w:r>
+        <w:rPr>
+          <w:rFonts w:ascii="Calibri" w:hAnsi="Calibri" w:cs="Calibri"/>
+          <w:sz w:val="22"/>
+          <w:szCs w:val="22"/>
           <w:lang w:val="en-US"/>
         </w:rPr>
         <w:br/>
@@ -470,6 +568,8 @@
       <w:pPr>
         <w:rPr>
           <w:rFonts w:ascii="Calibri" w:hAnsi="Calibri" w:cs="Calibri"/>
+          <w:sz w:val="22"/>
+          <w:szCs w:val="22"/>
           <w:lang w:val="en-US"/>
         </w:rPr>
       </w:pPr>
@@ -478,6 +578,8 @@
       <w:pPr>
         <w:rPr>
           <w:rFonts w:ascii="Calibri" w:hAnsi="Calibri" w:cs="Calibri"/>
+          <w:sz w:val="22"/>
+          <w:szCs w:val="22"/>
           <w:lang w:val="en-US"/>
         </w:rPr>
       </w:pPr>
@@ -501,12 +603,16 @@
             <w:pPr>
               <w:rPr>
                 <w:rFonts w:ascii="Calibri" w:hAnsi="Calibri" w:cs="Calibri"/>
+                <w:sz w:val="22"/>
+                <w:szCs w:val="22"/>
                 <w:lang w:val="en-US"/>
               </w:rPr>
             </w:pPr>
             <w:r>
               <w:rPr>
                 <w:rFonts w:ascii="Calibri" w:hAnsi="Calibri" w:cs="Calibri"/>
+                <w:sz w:val="22"/>
+                <w:szCs w:val="22"/>
                 <w:lang w:val="en-US"/>
               </w:rPr>
               <w:t>Open</w:t>
@@ -521,12 +627,16 @@
             <w:pPr>
               <w:rPr>
                 <w:rFonts w:ascii="Calibri" w:hAnsi="Calibri" w:cs="Calibri"/>
+                <w:sz w:val="22"/>
+                <w:szCs w:val="22"/>
                 <w:lang w:val="en-US"/>
               </w:rPr>
             </w:pPr>
             <w:r>
               <w:rPr>
                 <w:rFonts w:ascii="Calibri" w:hAnsi="Calibri" w:cs="Calibri"/>
+                <w:sz w:val="22"/>
+                <w:szCs w:val="22"/>
                 <w:lang w:val="en-US"/>
               </w:rPr>
               <w:t>Accessible anywhere + can be subclassed/overridden outside the module</w:t>
@@ -543,15 +653,18 @@
             <w:pPr>
               <w:rPr>
                 <w:rFonts w:ascii="Calibri" w:hAnsi="Calibri" w:cs="Calibri"/>
+                <w:sz w:val="22"/>
+                <w:szCs w:val="22"/>
                 <w:lang w:val="en-US"/>
               </w:rPr>
             </w:pPr>
             <w:r>
               <w:rPr>
                 <w:rFonts w:ascii="Calibri" w:hAnsi="Calibri" w:cs="Calibri"/>
+                <w:sz w:val="22"/>
+                <w:szCs w:val="22"/>
                 <w:lang w:val="en-US"/>
               </w:rPr>
-              <w:lastRenderedPageBreak/>
               <w:t>Public</w:t>
             </w:r>
           </w:p>
@@ -564,12 +677,16 @@
             <w:pPr>
               <w:rPr>
                 <w:rFonts w:ascii="Calibri" w:hAnsi="Calibri" w:cs="Calibri"/>
+                <w:sz w:val="22"/>
+                <w:szCs w:val="22"/>
                 <w:lang w:val="en-US"/>
               </w:rPr>
             </w:pPr>
             <w:r>
               <w:rPr>
                 <w:rFonts w:ascii="Calibri" w:hAnsi="Calibri" w:cs="Calibri"/>
+                <w:sz w:val="22"/>
+                <w:szCs w:val="22"/>
                 <w:lang w:val="en-US"/>
               </w:rPr>
               <w:t>Accessible anywhere + cannot be subclassed/overridden outside the module</w:t>
@@ -586,12 +703,16 @@
             <w:pPr>
               <w:rPr>
                 <w:rFonts w:ascii="Calibri" w:hAnsi="Calibri" w:cs="Calibri"/>
+                <w:sz w:val="22"/>
+                <w:szCs w:val="22"/>
                 <w:lang w:val="en-US"/>
               </w:rPr>
             </w:pPr>
             <w:r>
               <w:rPr>
                 <w:rFonts w:ascii="Calibri" w:hAnsi="Calibri" w:cs="Calibri"/>
+                <w:sz w:val="22"/>
+                <w:szCs w:val="22"/>
                 <w:lang w:val="en-US"/>
               </w:rPr>
               <w:t>Internal</w:t>
@@ -606,12 +727,16 @@
             <w:pPr>
               <w:rPr>
                 <w:rFonts w:ascii="Calibri" w:hAnsi="Calibri" w:cs="Calibri"/>
+                <w:sz w:val="22"/>
+                <w:szCs w:val="22"/>
                 <w:lang w:val="en-US"/>
               </w:rPr>
             </w:pPr>
             <w:r>
               <w:rPr>
                 <w:rFonts w:ascii="Calibri" w:hAnsi="Calibri" w:cs="Calibri"/>
+                <w:sz w:val="22"/>
+                <w:szCs w:val="22"/>
                 <w:lang w:val="en-US"/>
               </w:rPr>
               <w:t>Default: accessible only inside the module</w:t>
@@ -628,6 +753,8 @@
             <w:pPr>
               <w:rPr>
                 <w:rFonts w:ascii="Calibri" w:hAnsi="Calibri" w:cs="Calibri"/>
+                <w:sz w:val="22"/>
+                <w:szCs w:val="22"/>
                 <w:lang w:val="en-US"/>
               </w:rPr>
             </w:pPr>
@@ -635,6 +762,8 @@
             <w:r>
               <w:rPr>
                 <w:rFonts w:ascii="Calibri" w:hAnsi="Calibri" w:cs="Calibri"/>
+                <w:sz w:val="22"/>
+                <w:szCs w:val="22"/>
                 <w:lang w:val="en-US"/>
               </w:rPr>
               <w:t>fileprivate</w:t>
@@ -650,12 +779,16 @@
             <w:pPr>
               <w:rPr>
                 <w:rFonts w:ascii="Calibri" w:hAnsi="Calibri" w:cs="Calibri"/>
+                <w:sz w:val="22"/>
+                <w:szCs w:val="22"/>
                 <w:lang w:val="en-US"/>
               </w:rPr>
             </w:pPr>
             <w:r>
               <w:rPr>
                 <w:rFonts w:ascii="Calibri" w:hAnsi="Calibri" w:cs="Calibri"/>
+                <w:sz w:val="22"/>
+                <w:szCs w:val="22"/>
                 <w:lang w:val="en-US"/>
               </w:rPr>
               <w:t>Accessible only inside the same file</w:t>
@@ -672,14 +805,19 @@
             <w:pPr>
               <w:rPr>
                 <w:rFonts w:ascii="Calibri" w:hAnsi="Calibri" w:cs="Calibri"/>
+                <w:sz w:val="22"/>
+                <w:szCs w:val="22"/>
                 <w:lang w:val="en-US"/>
               </w:rPr>
             </w:pPr>
             <w:r>
               <w:rPr>
                 <w:rFonts w:ascii="Calibri" w:hAnsi="Calibri" w:cs="Calibri"/>
+                <w:sz w:val="22"/>
+                <w:szCs w:val="22"/>
                 <w:lang w:val="en-US"/>
               </w:rPr>
+              <w:lastRenderedPageBreak/>
               <w:t>private</w:t>
             </w:r>
           </w:p>
@@ -692,12 +830,16 @@
             <w:pPr>
               <w:rPr>
                 <w:rFonts w:ascii="Calibri" w:hAnsi="Calibri" w:cs="Calibri"/>
+                <w:sz w:val="22"/>
+                <w:szCs w:val="22"/>
                 <w:lang w:val="en-US"/>
               </w:rPr>
             </w:pPr>
             <w:r>
               <w:rPr>
                 <w:rFonts w:ascii="Calibri" w:hAnsi="Calibri" w:cs="Calibri"/>
+                <w:sz w:val="22"/>
+                <w:szCs w:val="22"/>
                 <w:lang w:val="en-US"/>
               </w:rPr>
               <w:t>accessible only withing the same declaration.</w:t>
@@ -710,12 +852,16 @@
       <w:pPr>
         <w:rPr>
           <w:rFonts w:ascii="Calibri" w:hAnsi="Calibri" w:cs="Calibri"/>
-          <w:lang w:val="en-US"/>
-        </w:rPr>
-      </w:pPr>
-      <w:r>
-        <w:rPr>
-          <w:rFonts w:ascii="Calibri" w:hAnsi="Calibri" w:cs="Calibri"/>
+          <w:sz w:val="22"/>
+          <w:szCs w:val="22"/>
+          <w:lang w:val="en-US"/>
+        </w:rPr>
+      </w:pPr>
+      <w:r>
+        <w:rPr>
+          <w:rFonts w:ascii="Calibri" w:hAnsi="Calibri" w:cs="Calibri"/>
+          <w:sz w:val="22"/>
+          <w:szCs w:val="22"/>
           <w:lang w:val="en-US"/>
         </w:rPr>
         <w:br/>
@@ -724,6 +870,8 @@
         <w:rPr>
           <w:rFonts w:ascii="Calibri" w:hAnsi="Calibri" w:cs="Calibri"/>
           <w:noProof/>
+          <w:sz w:val="22"/>
+          <w:szCs w:val="22"/>
           <w:lang w:val="en-US"/>
         </w:rPr>
         <w:drawing>
@@ -771,15 +919,19 @@
       <w:r>
         <w:rPr>
           <w:rFonts w:ascii="Calibri" w:hAnsi="Calibri" w:cs="Calibri"/>
-          <w:lang w:val="en-US"/>
-        </w:rPr>
-        <w:br/>
-      </w:r>
-      <w:r>
-        <w:rPr>
-          <w:rFonts w:ascii="Calibri" w:hAnsi="Calibri" w:cs="Calibri"/>
-          <w:b/>
-          <w:bCs/>
+          <w:sz w:val="22"/>
+          <w:szCs w:val="22"/>
+          <w:lang w:val="en-US"/>
+        </w:rPr>
+        <w:br/>
+      </w:r>
+      <w:r>
+        <w:rPr>
+          <w:rFonts w:ascii="Calibri" w:hAnsi="Calibri" w:cs="Calibri"/>
+          <w:b/>
+          <w:bCs/>
+          <w:sz w:val="22"/>
+          <w:szCs w:val="22"/>
           <w:lang w:val="en-US"/>
         </w:rPr>
         <w:t xml:space="preserve">4. Inheritance: </w:t>
@@ -789,13 +941,17 @@
           <w:rFonts w:ascii="Calibri" w:hAnsi="Calibri" w:cs="Calibri"/>
           <w:b/>
           <w:bCs/>
-          <w:lang w:val="en-US"/>
-        </w:rPr>
-        <w:br/>
-      </w:r>
-      <w:r>
-        <w:rPr>
-          <w:rFonts w:ascii="Calibri" w:hAnsi="Calibri" w:cs="Calibri"/>
+          <w:sz w:val="22"/>
+          <w:szCs w:val="22"/>
+          <w:lang w:val="en-US"/>
+        </w:rPr>
+        <w:br/>
+      </w:r>
+      <w:r>
+        <w:rPr>
+          <w:rFonts w:ascii="Calibri" w:hAnsi="Calibri" w:cs="Calibri"/>
+          <w:sz w:val="22"/>
+          <w:szCs w:val="22"/>
           <w:lang w:val="en-US"/>
         </w:rPr>
         <w:t>Inheritance is mechanism where one class can access property and method from another class. Inheritance it used for code reusability.</w:t>
@@ -803,22 +959,28 @@
       <w:r>
         <w:rPr>
           <w:rFonts w:ascii="Calibri" w:hAnsi="Calibri" w:cs="Calibri"/>
-          <w:lang w:val="en-US"/>
-        </w:rPr>
-        <w:br/>
-      </w:r>
-      <w:r>
-        <w:rPr>
-          <w:rFonts w:ascii="Calibri" w:hAnsi="Calibri" w:cs="Calibri"/>
-          <w:lang w:val="en-US"/>
-        </w:rPr>
-        <w:br/>
-      </w:r>
-      <w:r>
-        <w:rPr>
-          <w:rFonts w:ascii="Calibri" w:hAnsi="Calibri" w:cs="Calibri"/>
-          <w:b/>
-          <w:bCs/>
+          <w:sz w:val="22"/>
+          <w:szCs w:val="22"/>
+          <w:lang w:val="en-US"/>
+        </w:rPr>
+        <w:br/>
+      </w:r>
+      <w:r>
+        <w:rPr>
+          <w:rFonts w:ascii="Calibri" w:hAnsi="Calibri" w:cs="Calibri"/>
+          <w:sz w:val="22"/>
+          <w:szCs w:val="22"/>
+          <w:lang w:val="en-US"/>
+        </w:rPr>
+        <w:br/>
+      </w:r>
+      <w:r>
+        <w:rPr>
+          <w:rFonts w:ascii="Calibri" w:hAnsi="Calibri" w:cs="Calibri"/>
+          <w:b/>
+          <w:bCs/>
+          <w:sz w:val="22"/>
+          <w:szCs w:val="22"/>
           <w:lang w:val="en-US"/>
         </w:rPr>
         <w:t>Base class/Superclass:</w:t>
@@ -826,6 +988,8 @@
       <w:r>
         <w:rPr>
           <w:rFonts w:ascii="Calibri" w:hAnsi="Calibri" w:cs="Calibri"/>
+          <w:sz w:val="22"/>
+          <w:szCs w:val="22"/>
           <w:lang w:val="en-US"/>
         </w:rPr>
         <w:t xml:space="preserve"> The class whose properties and methods are inherited by another class.</w:t>
@@ -833,22 +997,28 @@
       <w:r>
         <w:rPr>
           <w:rFonts w:ascii="Calibri" w:hAnsi="Calibri" w:cs="Calibri"/>
-          <w:lang w:val="en-US"/>
-        </w:rPr>
-        <w:br/>
-      </w:r>
-      <w:r>
-        <w:rPr>
-          <w:rFonts w:ascii="Calibri" w:hAnsi="Calibri" w:cs="Calibri"/>
-          <w:lang w:val="en-US"/>
-        </w:rPr>
-        <w:br/>
-      </w:r>
-      <w:r>
-        <w:rPr>
-          <w:rFonts w:ascii="Calibri" w:hAnsi="Calibri" w:cs="Calibri"/>
-          <w:b/>
-          <w:bCs/>
+          <w:sz w:val="22"/>
+          <w:szCs w:val="22"/>
+          <w:lang w:val="en-US"/>
+        </w:rPr>
+        <w:br/>
+      </w:r>
+      <w:r>
+        <w:rPr>
+          <w:rFonts w:ascii="Calibri" w:hAnsi="Calibri" w:cs="Calibri"/>
+          <w:sz w:val="22"/>
+          <w:szCs w:val="22"/>
+          <w:lang w:val="en-US"/>
+        </w:rPr>
+        <w:br/>
+      </w:r>
+      <w:r>
+        <w:rPr>
+          <w:rFonts w:ascii="Calibri" w:hAnsi="Calibri" w:cs="Calibri"/>
+          <w:b/>
+          <w:bCs/>
+          <w:sz w:val="22"/>
+          <w:szCs w:val="22"/>
           <w:lang w:val="en-US"/>
         </w:rPr>
         <w:t xml:space="preserve">Subclass/Derived class: </w:t>
@@ -856,6 +1026,8 @@
       <w:r>
         <w:rPr>
           <w:rFonts w:ascii="Calibri" w:hAnsi="Calibri" w:cs="Calibri"/>
+          <w:sz w:val="22"/>
+          <w:szCs w:val="22"/>
           <w:lang w:val="en-US"/>
         </w:rPr>
         <w:t>The class that inherits from a superclass and adds/overrides functionality.</w:t>
@@ -863,22 +1035,28 @@
       <w:r>
         <w:rPr>
           <w:rFonts w:ascii="Calibri" w:hAnsi="Calibri" w:cs="Calibri"/>
-          <w:lang w:val="en-US"/>
-        </w:rPr>
-        <w:br/>
-      </w:r>
-      <w:r>
-        <w:rPr>
-          <w:rFonts w:ascii="Calibri" w:hAnsi="Calibri" w:cs="Calibri"/>
-          <w:lang w:val="en-US"/>
-        </w:rPr>
-        <w:br/>
-      </w:r>
-      <w:r>
-        <w:rPr>
-          <w:rFonts w:ascii="Calibri" w:hAnsi="Calibri" w:cs="Calibri"/>
-          <w:b/>
-          <w:bCs/>
+          <w:sz w:val="22"/>
+          <w:szCs w:val="22"/>
+          <w:lang w:val="en-US"/>
+        </w:rPr>
+        <w:br/>
+      </w:r>
+      <w:r>
+        <w:rPr>
+          <w:rFonts w:ascii="Calibri" w:hAnsi="Calibri" w:cs="Calibri"/>
+          <w:sz w:val="22"/>
+          <w:szCs w:val="22"/>
+          <w:lang w:val="en-US"/>
+        </w:rPr>
+        <w:br/>
+      </w:r>
+      <w:r>
+        <w:rPr>
+          <w:rFonts w:ascii="Calibri" w:hAnsi="Calibri" w:cs="Calibri"/>
+          <w:b/>
+          <w:bCs/>
+          <w:sz w:val="22"/>
+          <w:szCs w:val="22"/>
           <w:lang w:val="en-US"/>
         </w:rPr>
         <w:t xml:space="preserve">Method </w:t>
@@ -888,6 +1066,8 @@
           <w:rFonts w:ascii="Calibri" w:hAnsi="Calibri" w:cs="Calibri"/>
           <w:b/>
           <w:bCs/>
+          <w:sz w:val="22"/>
+          <w:szCs w:val="22"/>
           <w:lang w:val="en-US"/>
         </w:rPr>
         <w:t>overriding</w:t>
@@ -897,6 +1077,8 @@
           <w:rFonts w:ascii="Calibri" w:hAnsi="Calibri" w:cs="Calibri"/>
           <w:b/>
           <w:bCs/>
+          <w:sz w:val="22"/>
+          <w:szCs w:val="22"/>
           <w:lang w:val="en-US"/>
         </w:rPr>
         <w:t xml:space="preserve"> </w:t>
@@ -904,6 +1086,8 @@
       <w:r>
         <w:rPr>
           <w:rFonts w:ascii="Calibri" w:hAnsi="Calibri" w:cs="Calibri"/>
+          <w:sz w:val="22"/>
+          <w:szCs w:val="22"/>
           <w:lang w:val="en-US"/>
         </w:rPr>
         <w:t>Subclass provides its own version of superclass method using override.</w:t>
@@ -911,22 +1095,28 @@
       <w:r>
         <w:rPr>
           <w:rFonts w:ascii="Calibri" w:hAnsi="Calibri" w:cs="Calibri"/>
-          <w:lang w:val="en-US"/>
-        </w:rPr>
-        <w:br/>
-      </w:r>
-      <w:r>
-        <w:rPr>
-          <w:rFonts w:ascii="Calibri" w:hAnsi="Calibri" w:cs="Calibri"/>
-          <w:lang w:val="en-US"/>
-        </w:rPr>
-        <w:br/>
-      </w:r>
-      <w:r>
-        <w:rPr>
-          <w:rFonts w:ascii="Calibri" w:hAnsi="Calibri" w:cs="Calibri"/>
-          <w:b/>
-          <w:bCs/>
+          <w:sz w:val="22"/>
+          <w:szCs w:val="22"/>
+          <w:lang w:val="en-US"/>
+        </w:rPr>
+        <w:br/>
+      </w:r>
+      <w:r>
+        <w:rPr>
+          <w:rFonts w:ascii="Calibri" w:hAnsi="Calibri" w:cs="Calibri"/>
+          <w:sz w:val="22"/>
+          <w:szCs w:val="22"/>
+          <w:lang w:val="en-US"/>
+        </w:rPr>
+        <w:br/>
+      </w:r>
+      <w:r>
+        <w:rPr>
+          <w:rFonts w:ascii="Calibri" w:hAnsi="Calibri" w:cs="Calibri"/>
+          <w:b/>
+          <w:bCs/>
+          <w:sz w:val="22"/>
+          <w:szCs w:val="22"/>
           <w:lang w:val="en-US"/>
         </w:rPr>
         <w:t xml:space="preserve">Property </w:t>
@@ -937,6 +1127,8 @@
           <w:rFonts w:ascii="Calibri" w:hAnsi="Calibri" w:cs="Calibri"/>
           <w:b/>
           <w:bCs/>
+          <w:sz w:val="22"/>
+          <w:szCs w:val="22"/>
           <w:lang w:val="en-US"/>
         </w:rPr>
         <w:t>overriding:</w:t>
@@ -945,6 +1137,8 @@
       <w:r>
         <w:rPr>
           <w:rFonts w:ascii="Calibri" w:hAnsi="Calibri" w:cs="Calibri"/>
+          <w:sz w:val="22"/>
+          <w:szCs w:val="22"/>
           <w:lang w:val="en-US"/>
         </w:rPr>
         <w:t xml:space="preserve"> Subclass override computed property. (stored property </w:t>
@@ -953,6 +1147,8 @@
       <w:r>
         <w:rPr>
           <w:rFonts w:ascii="Calibri" w:hAnsi="Calibri" w:cs="Calibri"/>
+          <w:sz w:val="22"/>
+          <w:szCs w:val="22"/>
           <w:lang w:val="en-US"/>
         </w:rPr>
         <w:t>can not</w:t>
@@ -961,6 +1157,8 @@
       <w:r>
         <w:rPr>
           <w:rFonts w:ascii="Calibri" w:hAnsi="Calibri" w:cs="Calibri"/>
+          <w:sz w:val="22"/>
+          <w:szCs w:val="22"/>
           <w:lang w:val="en-US"/>
         </w:rPr>
         <w:t xml:space="preserve"> be overridden)</w:t>
@@ -968,22 +1166,28 @@
       <w:r>
         <w:rPr>
           <w:rFonts w:ascii="Calibri" w:hAnsi="Calibri" w:cs="Calibri"/>
-          <w:lang w:val="en-US"/>
-        </w:rPr>
-        <w:br/>
-      </w:r>
-      <w:r>
-        <w:rPr>
-          <w:rFonts w:ascii="Calibri" w:hAnsi="Calibri" w:cs="Calibri"/>
-          <w:lang w:val="en-US"/>
-        </w:rPr>
-        <w:br/>
-      </w:r>
-      <w:r>
-        <w:rPr>
-          <w:rFonts w:ascii="Calibri" w:hAnsi="Calibri" w:cs="Calibri"/>
-          <w:b/>
-          <w:bCs/>
+          <w:sz w:val="22"/>
+          <w:szCs w:val="22"/>
+          <w:lang w:val="en-US"/>
+        </w:rPr>
+        <w:br/>
+      </w:r>
+      <w:r>
+        <w:rPr>
+          <w:rFonts w:ascii="Calibri" w:hAnsi="Calibri" w:cs="Calibri"/>
+          <w:sz w:val="22"/>
+          <w:szCs w:val="22"/>
+          <w:lang w:val="en-US"/>
+        </w:rPr>
+        <w:br/>
+      </w:r>
+      <w:r>
+        <w:rPr>
+          <w:rFonts w:ascii="Calibri" w:hAnsi="Calibri" w:cs="Calibri"/>
+          <w:b/>
+          <w:bCs/>
+          <w:sz w:val="22"/>
+          <w:szCs w:val="22"/>
           <w:lang w:val="en-US"/>
         </w:rPr>
         <w:t xml:space="preserve">Property observers </w:t>
@@ -994,6 +1198,8 @@
           <w:rFonts w:ascii="Calibri" w:hAnsi="Calibri" w:cs="Calibri"/>
           <w:b/>
           <w:bCs/>
+          <w:sz w:val="22"/>
+          <w:szCs w:val="22"/>
           <w:lang w:val="en-US"/>
         </w:rPr>
         <w:t>override:</w:t>
@@ -1004,6 +1210,8 @@
           <w:rFonts w:ascii="Calibri" w:hAnsi="Calibri" w:cs="Calibri"/>
           <w:b/>
           <w:bCs/>
+          <w:sz w:val="22"/>
+          <w:szCs w:val="22"/>
           <w:lang w:val="en-US"/>
         </w:rPr>
         <w:t xml:space="preserve"> </w:t>
@@ -1011,6 +1219,8 @@
       <w:r>
         <w:rPr>
           <w:rFonts w:ascii="Calibri" w:hAnsi="Calibri" w:cs="Calibri"/>
+          <w:sz w:val="22"/>
+          <w:szCs w:val="22"/>
           <w:lang w:val="en-US"/>
         </w:rPr>
         <w:t xml:space="preserve">Subclass adds </w:t>
@@ -1019,6 +1229,8 @@
       <w:r>
         <w:rPr>
           <w:rFonts w:ascii="Calibri" w:hAnsi="Calibri" w:cs="Calibri"/>
+          <w:sz w:val="22"/>
+          <w:szCs w:val="22"/>
           <w:lang w:val="en-US"/>
         </w:rPr>
         <w:t>willSet</w:t>
@@ -1027,6 +1239,8 @@
       <w:r>
         <w:rPr>
           <w:rFonts w:ascii="Calibri" w:hAnsi="Calibri" w:cs="Calibri"/>
+          <w:sz w:val="22"/>
+          <w:szCs w:val="22"/>
           <w:lang w:val="en-US"/>
         </w:rPr>
         <w:t>/</w:t>
@@ -1035,6 +1249,8 @@
       <w:r>
         <w:rPr>
           <w:rFonts w:ascii="Calibri" w:hAnsi="Calibri" w:cs="Calibri"/>
+          <w:sz w:val="22"/>
+          <w:szCs w:val="22"/>
           <w:lang w:val="en-US"/>
         </w:rPr>
         <w:t>didSet</w:t>
@@ -1043,6 +1259,8 @@
       <w:r>
         <w:rPr>
           <w:rFonts w:ascii="Calibri" w:hAnsi="Calibri" w:cs="Calibri"/>
+          <w:sz w:val="22"/>
+          <w:szCs w:val="22"/>
           <w:lang w:val="en-US"/>
         </w:rPr>
         <w:t xml:space="preserve"> to inherited properties.</w:t>
@@ -1050,22 +1268,28 @@
       <w:r>
         <w:rPr>
           <w:rFonts w:ascii="Calibri" w:hAnsi="Calibri" w:cs="Calibri"/>
-          <w:lang w:val="en-US"/>
-        </w:rPr>
-        <w:br/>
-      </w:r>
-      <w:r>
-        <w:rPr>
-          <w:rFonts w:ascii="Calibri" w:hAnsi="Calibri" w:cs="Calibri"/>
-          <w:lang w:val="en-US"/>
-        </w:rPr>
-        <w:br/>
-      </w:r>
-      <w:r>
-        <w:rPr>
-          <w:rFonts w:ascii="Calibri" w:hAnsi="Calibri" w:cs="Calibri"/>
-          <w:b/>
-          <w:bCs/>
+          <w:sz w:val="22"/>
+          <w:szCs w:val="22"/>
+          <w:lang w:val="en-US"/>
+        </w:rPr>
+        <w:br/>
+      </w:r>
+      <w:r>
+        <w:rPr>
+          <w:rFonts w:ascii="Calibri" w:hAnsi="Calibri" w:cs="Calibri"/>
+          <w:sz w:val="22"/>
+          <w:szCs w:val="22"/>
+          <w:lang w:val="en-US"/>
+        </w:rPr>
+        <w:br/>
+      </w:r>
+      <w:r>
+        <w:rPr>
+          <w:rFonts w:ascii="Calibri" w:hAnsi="Calibri" w:cs="Calibri"/>
+          <w:b/>
+          <w:bCs/>
+          <w:sz w:val="22"/>
+          <w:szCs w:val="22"/>
           <w:lang w:val="en-US"/>
         </w:rPr>
         <w:t xml:space="preserve">final: </w:t>
@@ -1073,6 +1297,8 @@
       <w:r>
         <w:rPr>
           <w:rFonts w:ascii="Calibri" w:hAnsi="Calibri" w:cs="Calibri"/>
+          <w:sz w:val="22"/>
+          <w:szCs w:val="22"/>
           <w:lang w:val="en-US"/>
         </w:rPr>
         <w:t>prevent a class, method and properties from being inherited or overridden.</w:t>
@@ -1080,22 +1306,28 @@
       <w:r>
         <w:rPr>
           <w:rFonts w:ascii="Calibri" w:hAnsi="Calibri" w:cs="Calibri"/>
-          <w:lang w:val="en-US"/>
-        </w:rPr>
-        <w:br/>
-      </w:r>
-      <w:r>
-        <w:rPr>
-          <w:rFonts w:ascii="Calibri" w:hAnsi="Calibri" w:cs="Calibri"/>
-          <w:lang w:val="en-US"/>
-        </w:rPr>
-        <w:br/>
-      </w:r>
-      <w:r>
-        <w:rPr>
-          <w:rFonts w:ascii="Calibri" w:hAnsi="Calibri" w:cs="Calibri"/>
-          <w:b/>
-          <w:bCs/>
+          <w:sz w:val="22"/>
+          <w:szCs w:val="22"/>
+          <w:lang w:val="en-US"/>
+        </w:rPr>
+        <w:br/>
+      </w:r>
+      <w:r>
+        <w:rPr>
+          <w:rFonts w:ascii="Calibri" w:hAnsi="Calibri" w:cs="Calibri"/>
+          <w:sz w:val="22"/>
+          <w:szCs w:val="22"/>
+          <w:lang w:val="en-US"/>
+        </w:rPr>
+        <w:br/>
+      </w:r>
+      <w:r>
+        <w:rPr>
+          <w:rFonts w:ascii="Calibri" w:hAnsi="Calibri" w:cs="Calibri"/>
+          <w:b/>
+          <w:bCs/>
+          <w:sz w:val="22"/>
+          <w:szCs w:val="22"/>
           <w:lang w:val="en-US"/>
         </w:rPr>
         <w:t xml:space="preserve">‘super’ keyword: </w:t>
@@ -1103,6 +1335,8 @@
       <w:r>
         <w:rPr>
           <w:rFonts w:ascii="Calibri" w:hAnsi="Calibri" w:cs="Calibri"/>
+          <w:sz w:val="22"/>
+          <w:szCs w:val="22"/>
           <w:lang w:val="en-US"/>
         </w:rPr>
         <w:t>Used to access superclass methods, properties, or initializer.</w:t>
@@ -1112,6 +1346,8 @@
       <w:pPr>
         <w:rPr>
           <w:rFonts w:ascii="Calibri" w:hAnsi="Calibri" w:cs="Calibri"/>
+          <w:sz w:val="22"/>
+          <w:szCs w:val="22"/>
           <w:lang w:val="en-US"/>
         </w:rPr>
       </w:pPr>
@@ -1120,6 +1356,8 @@
       <w:pPr>
         <w:rPr>
           <w:rFonts w:ascii="Calibri" w:hAnsi="Calibri" w:cs="Calibri"/>
+          <w:sz w:val="22"/>
+          <w:szCs w:val="22"/>
           <w:lang w:val="en-US"/>
         </w:rPr>
       </w:pPr>
@@ -1129,13 +1367,17 @@
         <w:pStyle w:val="p1"/>
         <w:rPr>
           <w:rFonts w:ascii="Calibri" w:hAnsi="Calibri" w:cs="Calibri"/>
-        </w:rPr>
-      </w:pPr>
-      <w:r>
-        <w:rPr>
-          <w:rFonts w:ascii="Calibri" w:hAnsi="Calibri" w:cs="Calibri"/>
-          <w:b/>
-          <w:bCs/>
+          <w:sz w:val="22"/>
+          <w:szCs w:val="22"/>
+        </w:rPr>
+      </w:pPr>
+      <w:r>
+        <w:rPr>
+          <w:rFonts w:ascii="Calibri" w:hAnsi="Calibri" w:cs="Calibri"/>
+          <w:b/>
+          <w:bCs/>
+          <w:sz w:val="22"/>
+          <w:szCs w:val="22"/>
           <w:lang w:val="en-US"/>
         </w:rPr>
         <w:t>Abstraction:</w:t>
@@ -1145,15 +1387,19 @@
           <w:rFonts w:ascii="Calibri" w:hAnsi="Calibri" w:cs="Calibri"/>
           <w:b/>
           <w:bCs/>
-          <w:lang w:val="en-US"/>
-        </w:rPr>
-        <w:br/>
-      </w:r>
-      <w:r>
-        <w:rPr>
-          <w:rFonts w:ascii="Calibri" w:hAnsi="Calibri" w:cs="Calibri"/>
-          <w:b/>
-          <w:bCs/>
+          <w:sz w:val="22"/>
+          <w:szCs w:val="22"/>
+          <w:lang w:val="en-US"/>
+        </w:rPr>
+        <w:br/>
+      </w:r>
+      <w:r>
+        <w:rPr>
+          <w:rFonts w:ascii="Calibri" w:hAnsi="Calibri" w:cs="Calibri"/>
+          <w:b/>
+          <w:bCs/>
+          <w:sz w:val="22"/>
+          <w:szCs w:val="22"/>
           <w:lang w:val="en-US"/>
         </w:rPr>
         <w:br/>
@@ -1162,8 +1408,9 @@
         <w:rPr>
           <w:rStyle w:val="s1"/>
           <w:rFonts w:ascii="Calibri" w:eastAsiaTheme="majorEastAsia" w:hAnsi="Calibri" w:cs="Calibri"/>
-        </w:rPr>
-        <w:lastRenderedPageBreak/>
+          <w:sz w:val="22"/>
+          <w:szCs w:val="22"/>
+        </w:rPr>
         <w:t xml:space="preserve">Abstraction means </w:t>
       </w:r>
       <w:r>
@@ -1171,6 +1418,8 @@
           <w:rFonts w:ascii="Calibri" w:hAnsi="Calibri" w:cs="Calibri"/>
           <w:b/>
           <w:bCs/>
+          <w:sz w:val="22"/>
+          <w:szCs w:val="22"/>
         </w:rPr>
         <w:t>hiding complexity and showing only what’s needed to use something</w:t>
       </w:r>
@@ -1178,6 +1427,8 @@
         <w:rPr>
           <w:rStyle w:val="s1"/>
           <w:rFonts w:ascii="Calibri" w:eastAsiaTheme="majorEastAsia" w:hAnsi="Calibri" w:cs="Calibri"/>
+          <w:sz w:val="22"/>
+          <w:szCs w:val="22"/>
         </w:rPr>
         <w:t>.</w:t>
       </w:r>
@@ -1185,6 +1436,8 @@
         <w:rPr>
           <w:rStyle w:val="s1"/>
           <w:rFonts w:ascii="Calibri" w:eastAsiaTheme="majorEastAsia" w:hAnsi="Calibri" w:cs="Calibri"/>
+          <w:sz w:val="22"/>
+          <w:szCs w:val="22"/>
         </w:rPr>
         <w:br/>
       </w:r>
@@ -1192,14 +1445,18 @@
         <w:rPr>
           <w:rStyle w:val="s1"/>
           <w:rFonts w:ascii="Calibri" w:eastAsiaTheme="majorEastAsia" w:hAnsi="Calibri" w:cs="Calibri"/>
-        </w:rPr>
-        <w:br/>
-      </w:r>
-      <w:r>
-        <w:rPr>
-          <w:rFonts w:ascii="Calibri" w:hAnsi="Calibri" w:cs="Calibri"/>
-          <w:b/>
-          <w:bCs/>
+          <w:sz w:val="22"/>
+          <w:szCs w:val="22"/>
+        </w:rPr>
+        <w:br/>
+      </w:r>
+      <w:r>
+        <w:rPr>
+          <w:rFonts w:ascii="Calibri" w:hAnsi="Calibri" w:cs="Calibri"/>
+          <w:b/>
+          <w:bCs/>
+          <w:sz w:val="22"/>
+          <w:szCs w:val="22"/>
         </w:rPr>
         <w:t>Abstraction focuses on what an object does, not how it does it.</w:t>
       </w:r>
@@ -1208,20 +1465,26 @@
           <w:rFonts w:ascii="Calibri" w:hAnsi="Calibri" w:cs="Calibri"/>
           <w:b/>
           <w:bCs/>
-        </w:rPr>
-        <w:br/>
-      </w:r>
-      <w:r>
-        <w:rPr>
-          <w:rFonts w:ascii="Calibri" w:hAnsi="Calibri" w:cs="Calibri"/>
-          <w:b/>
-          <w:bCs/>
-        </w:rPr>
-        <w:br/>
-      </w:r>
-      <w:r>
-        <w:rPr>
-          <w:rFonts w:ascii="Calibri" w:hAnsi="Calibri" w:cs="Calibri"/>
+          <w:sz w:val="22"/>
+          <w:szCs w:val="22"/>
+        </w:rPr>
+        <w:br/>
+      </w:r>
+      <w:r>
+        <w:rPr>
+          <w:rFonts w:ascii="Calibri" w:hAnsi="Calibri" w:cs="Calibri"/>
+          <w:b/>
+          <w:bCs/>
+          <w:sz w:val="22"/>
+          <w:szCs w:val="22"/>
+        </w:rPr>
+        <w:br/>
+      </w:r>
+      <w:r>
+        <w:rPr>
+          <w:rFonts w:ascii="Calibri" w:hAnsi="Calibri" w:cs="Calibri"/>
+          <w:sz w:val="22"/>
+          <w:szCs w:val="22"/>
         </w:rPr>
         <w:t>In Swift, it’s commonly achieved using:</w:t>
       </w:r>
@@ -1233,13 +1496,17 @@
           <w:rFonts w:ascii="Calibri" w:hAnsi="Calibri" w:cs="Calibri"/>
           <w:b/>
           <w:bCs/>
-        </w:rPr>
-      </w:pPr>
-      <w:r>
-        <w:rPr>
-          <w:rFonts w:ascii="Calibri" w:hAnsi="Calibri" w:cs="Calibri"/>
-          <w:b/>
-          <w:bCs/>
+          <w:sz w:val="22"/>
+          <w:szCs w:val="22"/>
+        </w:rPr>
+      </w:pPr>
+      <w:r>
+        <w:rPr>
+          <w:rFonts w:ascii="Calibri" w:hAnsi="Calibri" w:cs="Calibri"/>
+          <w:b/>
+          <w:bCs/>
+          <w:sz w:val="22"/>
+          <w:szCs w:val="22"/>
         </w:rPr>
         <w:br/>
         <w:t>1. Protocol</w:t>
@@ -1249,6 +1516,8 @@
           <w:rFonts w:ascii="Calibri" w:hAnsi="Calibri" w:cs="Calibri"/>
           <w:b/>
           <w:bCs/>
+          <w:sz w:val="22"/>
+          <w:szCs w:val="22"/>
         </w:rPr>
         <w:br/>
         <w:t xml:space="preserve">2. </w:t>
@@ -1258,6 +1527,8 @@
           <w:rFonts w:ascii="Calibri" w:hAnsi="Calibri" w:cs="Calibri"/>
           <w:b/>
           <w:bCs/>
+          <w:sz w:val="22"/>
+          <w:szCs w:val="22"/>
         </w:rPr>
         <w:t xml:space="preserve">Abstract like base class - </w:t>
       </w:r>
@@ -1266,6 +1537,8 @@
           <w:rFonts w:ascii="Calibri" w:hAnsi="Calibri" w:cs="Calibri"/>
           <w:b/>
           <w:bCs/>
+          <w:sz w:val="22"/>
+          <w:szCs w:val="22"/>
         </w:rPr>
         <w:t>Inheritance and method overloading.</w:t>
       </w:r>
@@ -1279,8 +1552,8 @@
           <w:bCs/>
           <w:color w:val="auto"/>
           <w:kern w:val="0"/>
-          <w:sz w:val="24"/>
-          <w:szCs w:val="24"/>
+          <w:sz w:val="22"/>
+          <w:szCs w:val="22"/>
           <w:lang w:eastAsia="en-GB"/>
           <w14:ligatures w14:val="none"/>
         </w:rPr>
@@ -1291,9 +1564,10 @@
           <w:b/>
           <w:bCs/>
           <w:noProof/>
-          <w:sz w:val="24"/>
-          <w:szCs w:val="24"/>
-        </w:rPr>
+          <w:sz w:val="22"/>
+          <w:szCs w:val="22"/>
+        </w:rPr>
+        <w:lastRenderedPageBreak/>
         <w:drawing>
           <wp:inline distT="0" distB="0" distL="0" distR="0" wp14:anchorId="7E7A6A7D" wp14:editId="4B71BAFF">
             <wp:extent cx="3415729" cy="2025748"/>
@@ -1341,18 +1615,18 @@
           <w:rFonts w:ascii="Calibri" w:hAnsi="Calibri" w:cs="Calibri"/>
           <w:b/>
           <w:bCs/>
-          <w:sz w:val="24"/>
-          <w:szCs w:val="24"/>
-        </w:rPr>
-        <w:br/>
-      </w:r>
-      <w:r>
-        <w:rPr>
-          <w:rFonts w:ascii="Calibri" w:hAnsi="Calibri" w:cs="Calibri"/>
-          <w:b/>
-          <w:bCs/>
-          <w:sz w:val="24"/>
-          <w:szCs w:val="24"/>
+          <w:sz w:val="22"/>
+          <w:szCs w:val="22"/>
+        </w:rPr>
+        <w:br/>
+      </w:r>
+      <w:r>
+        <w:rPr>
+          <w:rFonts w:ascii="Calibri" w:hAnsi="Calibri" w:cs="Calibri"/>
+          <w:b/>
+          <w:bCs/>
+          <w:sz w:val="22"/>
+          <w:szCs w:val="22"/>
         </w:rPr>
         <w:br/>
       </w:r>
@@ -1362,8 +1636,8 @@
           <w:b/>
           <w:bCs/>
           <w:noProof/>
-          <w:sz w:val="24"/>
-          <w:szCs w:val="24"/>
+          <w:sz w:val="22"/>
+          <w:szCs w:val="22"/>
         </w:rPr>
         <w:drawing>
           <wp:inline distT="0" distB="0" distL="0" distR="0" wp14:anchorId="0BF7D56C" wp14:editId="13414E9E">
@@ -1412,8 +1686,8 @@
           <w:rFonts w:ascii="Calibri" w:hAnsi="Calibri" w:cs="Calibri"/>
           <w:b/>
           <w:bCs/>
-          <w:sz w:val="24"/>
-          <w:szCs w:val="24"/>
+          <w:sz w:val="22"/>
+          <w:szCs w:val="22"/>
         </w:rPr>
         <w:br/>
       </w:r>
@@ -1427,8 +1701,8 @@
           <w:bCs/>
           <w:color w:val="auto"/>
           <w:kern w:val="0"/>
-          <w:sz w:val="24"/>
-          <w:szCs w:val="24"/>
+          <w:sz w:val="22"/>
+          <w:szCs w:val="22"/>
           <w:lang w:eastAsia="en-GB"/>
           <w14:ligatures w14:val="none"/>
         </w:rPr>
@@ -1440,8 +1714,8 @@
           <w:bCs/>
           <w:color w:val="auto"/>
           <w:kern w:val="0"/>
-          <w:sz w:val="24"/>
-          <w:szCs w:val="24"/>
+          <w:sz w:val="22"/>
+          <w:szCs w:val="22"/>
           <w:lang w:eastAsia="en-GB"/>
           <w14:ligatures w14:val="none"/>
         </w:rPr>
@@ -1458,6 +1732,8 @@
         <w:rPr>
           <w:rFonts w:ascii="Calibri" w:eastAsia="Times New Roman" w:hAnsi="Calibri" w:cs="Calibri"/>
           <w:kern w:val="0"/>
+          <w:sz w:val="22"/>
+          <w:szCs w:val="22"/>
           <w:lang w:eastAsia="en-GB"/>
           <w14:ligatures w14:val="none"/>
         </w:rPr>
@@ -1468,6 +1744,8 @@
           <w:b/>
           <w:bCs/>
           <w:kern w:val="0"/>
+          <w:sz w:val="22"/>
+          <w:szCs w:val="22"/>
           <w:lang w:eastAsia="en-GB"/>
           <w14:ligatures w14:val="none"/>
         </w:rPr>
@@ -1477,6 +1755,8 @@
         <w:rPr>
           <w:rFonts w:ascii="Calibri" w:eastAsia="Times New Roman" w:hAnsi="Calibri" w:cs="Calibri"/>
           <w:kern w:val="0"/>
+          <w:sz w:val="22"/>
+          <w:szCs w:val="22"/>
           <w:lang w:eastAsia="en-GB"/>
           <w14:ligatures w14:val="none"/>
         </w:rPr>
@@ -1493,6 +1773,8 @@
         <w:rPr>
           <w:rFonts w:ascii="Calibri" w:eastAsia="Times New Roman" w:hAnsi="Calibri" w:cs="Calibri"/>
           <w:kern w:val="0"/>
+          <w:sz w:val="22"/>
+          <w:szCs w:val="22"/>
           <w:lang w:eastAsia="en-GB"/>
           <w14:ligatures w14:val="none"/>
         </w:rPr>
@@ -1503,6 +1785,8 @@
           <w:b/>
           <w:bCs/>
           <w:kern w:val="0"/>
+          <w:sz w:val="22"/>
+          <w:szCs w:val="22"/>
           <w:lang w:eastAsia="en-GB"/>
           <w14:ligatures w14:val="none"/>
         </w:rPr>
@@ -1514,6 +1798,8 @@
           <w:b/>
           <w:bCs/>
           <w:kern w:val="0"/>
+          <w:sz w:val="22"/>
+          <w:szCs w:val="22"/>
           <w:lang w:eastAsia="en-GB"/>
           <w14:ligatures w14:val="none"/>
         </w:rPr>
@@ -1528,6 +1814,8 @@
           <w:b/>
           <w:bCs/>
           <w:kern w:val="0"/>
+          <w:sz w:val="22"/>
+          <w:szCs w:val="22"/>
           <w:lang w:eastAsia="en-GB"/>
           <w14:ligatures w14:val="none"/>
         </w:rPr>
@@ -1537,38 +1825,48 @@
           <w:rFonts w:ascii="Calibri" w:hAnsi="Calibri" w:cs="Calibri"/>
           <w:b/>
           <w:bCs/>
-        </w:rPr>
-        <w:br/>
-      </w:r>
-      <w:r>
-        <w:rPr>
-          <w:rFonts w:ascii="Calibri" w:hAnsi="Calibri" w:cs="Calibri"/>
-          <w:b/>
-          <w:bCs/>
-        </w:rPr>
-        <w:br/>
-      </w:r>
-      <w:r>
-        <w:rPr>
-          <w:rFonts w:ascii="Calibri" w:hAnsi="Calibri" w:cs="Calibri"/>
-          <w:b/>
-          <w:bCs/>
-        </w:rPr>
-        <w:br/>
-      </w:r>
-      <w:r>
-        <w:rPr>
-          <w:rFonts w:ascii="Calibri" w:hAnsi="Calibri" w:cs="Calibri"/>
-          <w:b/>
-          <w:bCs/>
-        </w:rPr>
-        <w:br/>
-      </w:r>
-      <w:r>
-        <w:rPr>
-          <w:rFonts w:ascii="Calibri" w:hAnsi="Calibri" w:cs="Calibri"/>
-          <w:b/>
-          <w:bCs/>
+          <w:sz w:val="22"/>
+          <w:szCs w:val="22"/>
+        </w:rPr>
+        <w:br/>
+      </w:r>
+      <w:r>
+        <w:rPr>
+          <w:rFonts w:ascii="Calibri" w:hAnsi="Calibri" w:cs="Calibri"/>
+          <w:b/>
+          <w:bCs/>
+          <w:sz w:val="22"/>
+          <w:szCs w:val="22"/>
+        </w:rPr>
+        <w:br/>
+      </w:r>
+      <w:r>
+        <w:rPr>
+          <w:rFonts w:ascii="Calibri" w:hAnsi="Calibri" w:cs="Calibri"/>
+          <w:b/>
+          <w:bCs/>
+          <w:sz w:val="22"/>
+          <w:szCs w:val="22"/>
+        </w:rPr>
+        <w:br/>
+      </w:r>
+      <w:r>
+        <w:rPr>
+          <w:rFonts w:ascii="Calibri" w:hAnsi="Calibri" w:cs="Calibri"/>
+          <w:b/>
+          <w:bCs/>
+          <w:sz w:val="22"/>
+          <w:szCs w:val="22"/>
+        </w:rPr>
+        <w:br/>
+      </w:r>
+      <w:r>
+        <w:rPr>
+          <w:rFonts w:ascii="Calibri" w:hAnsi="Calibri" w:cs="Calibri"/>
+          <w:b/>
+          <w:bCs/>
+          <w:sz w:val="22"/>
+          <w:szCs w:val="22"/>
         </w:rPr>
         <w:t>Polymorphism allows different objects to respond to the same method call in their own way.</w:t>
       </w:r>
@@ -1577,23 +1875,28 @@
           <w:rFonts w:ascii="Calibri" w:hAnsi="Calibri" w:cs="Calibri"/>
           <w:b/>
           <w:bCs/>
-        </w:rPr>
-        <w:br/>
-      </w:r>
-      <w:r>
-        <w:rPr>
-          <w:rFonts w:ascii="Calibri" w:hAnsi="Calibri" w:cs="Calibri"/>
-          <w:b/>
-          <w:bCs/>
-        </w:rPr>
-        <w:lastRenderedPageBreak/>
-        <w:br/>
-      </w:r>
-      <w:r>
-        <w:rPr>
-          <w:rFonts w:ascii="Calibri" w:hAnsi="Calibri" w:cs="Calibri"/>
-          <w:b/>
-          <w:bCs/>
+          <w:sz w:val="22"/>
+          <w:szCs w:val="22"/>
+        </w:rPr>
+        <w:br/>
+      </w:r>
+      <w:r>
+        <w:rPr>
+          <w:rFonts w:ascii="Calibri" w:hAnsi="Calibri" w:cs="Calibri"/>
+          <w:b/>
+          <w:bCs/>
+          <w:sz w:val="22"/>
+          <w:szCs w:val="22"/>
+        </w:rPr>
+        <w:br/>
+      </w:r>
+      <w:r>
+        <w:rPr>
+          <w:rFonts w:ascii="Calibri" w:hAnsi="Calibri" w:cs="Calibri"/>
+          <w:b/>
+          <w:bCs/>
+          <w:sz w:val="22"/>
+          <w:szCs w:val="22"/>
         </w:rPr>
         <w:br/>
       </w:r>
@@ -1603,6 +1906,8 @@
           <w:b/>
           <w:bCs/>
           <w:kern w:val="0"/>
+          <w:sz w:val="22"/>
+          <w:szCs w:val="22"/>
           <w:lang w:eastAsia="en-GB"/>
           <w14:ligatures w14:val="none"/>
         </w:rPr>
@@ -1614,6 +1919,8 @@
           <w:b/>
           <w:bCs/>
           <w:kern w:val="0"/>
+          <w:sz w:val="22"/>
+          <w:szCs w:val="22"/>
           <w:lang w:eastAsia="en-GB"/>
           <w14:ligatures w14:val="none"/>
         </w:rPr>
@@ -1625,9 +1932,12 @@
           <w:b/>
           <w:bCs/>
           <w:kern w:val="0"/>
+          <w:sz w:val="22"/>
+          <w:szCs w:val="22"/>
           <w:lang w:eastAsia="en-GB"/>
           <w14:ligatures w14:val="none"/>
         </w:rPr>
+        <w:lastRenderedPageBreak/>
         <w:br/>
       </w:r>
       <w:r>
@@ -1637,6 +1947,8 @@
           <w:bCs/>
           <w:noProof/>
           <w:kern w:val="0"/>
+          <w:sz w:val="22"/>
+          <w:szCs w:val="22"/>
           <w:lang w:eastAsia="en-GB"/>
         </w:rPr>
         <w:drawing>
@@ -1690,6 +2002,8 @@
           <w:b/>
           <w:bCs/>
           <w:kern w:val="0"/>
+          <w:sz w:val="22"/>
+          <w:szCs w:val="22"/>
           <w:lang w:eastAsia="en-GB"/>
           <w14:ligatures w14:val="none"/>
         </w:rPr>
@@ -1700,6 +2014,8 @@
           <w:b/>
           <w:bCs/>
           <w:kern w:val="0"/>
+          <w:sz w:val="22"/>
+          <w:szCs w:val="22"/>
           <w:lang w:eastAsia="en-GB"/>
           <w14:ligatures w14:val="none"/>
         </w:rPr>
@@ -1711,6 +2027,8 @@
           <w:b/>
           <w:bCs/>
           <w:kern w:val="0"/>
+          <w:sz w:val="22"/>
+          <w:szCs w:val="22"/>
           <w:lang w:eastAsia="en-GB"/>
           <w14:ligatures w14:val="none"/>
         </w:rPr>
@@ -1724,6 +2042,8 @@
           <w:rFonts w:ascii="Calibri" w:hAnsi="Calibri" w:cs="Calibri"/>
           <w:b/>
           <w:bCs/>
+          <w:sz w:val="22"/>
+          <w:szCs w:val="22"/>
         </w:rPr>
       </w:pPr>
       <w:r>
@@ -1732,6 +2052,8 @@
           <w:b/>
           <w:bCs/>
           <w:noProof/>
+          <w:sz w:val="22"/>
+          <w:szCs w:val="22"/>
           <w14:ligatures w14:val="standardContextual"/>
         </w:rPr>
         <w:drawing>
@@ -1782,6 +2104,8 @@
           <w:b/>
           <w:bCs/>
           <w:noProof/>
+          <w:sz w:val="22"/>
+          <w:szCs w:val="22"/>
           <w14:ligatures w14:val="standardContextual"/>
         </w:rPr>
         <w:drawing>
@@ -1834,13 +2158,17 @@
           <w:rFonts w:ascii="Calibri" w:hAnsi="Calibri" w:cs="Calibri"/>
           <w:b/>
           <w:bCs/>
-        </w:rPr>
-      </w:pPr>
-      <w:r>
-        <w:rPr>
-          <w:rFonts w:ascii="Calibri" w:hAnsi="Calibri" w:cs="Calibri"/>
-          <w:b/>
-          <w:bCs/>
+          <w:sz w:val="22"/>
+          <w:szCs w:val="22"/>
+        </w:rPr>
+      </w:pPr>
+      <w:r>
+        <w:rPr>
+          <w:rFonts w:ascii="Calibri" w:hAnsi="Calibri" w:cs="Calibri"/>
+          <w:b/>
+          <w:bCs/>
+          <w:sz w:val="22"/>
+          <w:szCs w:val="22"/>
         </w:rPr>
         <w:br/>
       </w:r>
@@ -1850,6 +2178,8 @@
         <w:pStyle w:val="p1"/>
         <w:rPr>
           <w:rFonts w:ascii="Calibri" w:hAnsi="Calibri" w:cs="Calibri"/>
+          <w:sz w:val="22"/>
+          <w:szCs w:val="22"/>
         </w:rPr>
       </w:pPr>
     </w:p>
@@ -1857,38 +2187,47 @@
       <w:pPr>
         <w:rPr>
           <w:rFonts w:ascii="Calibri" w:hAnsi="Calibri" w:cs="Calibri"/>
-          <w:lang w:val="en-US"/>
-        </w:rPr>
-      </w:pPr>
-      <w:r>
-        <w:rPr>
-          <w:rFonts w:ascii="Calibri" w:hAnsi="Calibri" w:cs="Calibri"/>
-          <w:b/>
-          <w:bCs/>
-          <w:lang w:val="en-US"/>
-        </w:rPr>
-        <w:lastRenderedPageBreak/>
+          <w:sz w:val="22"/>
+          <w:szCs w:val="22"/>
+          <w:lang w:val="en-US"/>
+        </w:rPr>
+      </w:pPr>
+      <w:r>
+        <w:rPr>
+          <w:rFonts w:ascii="Calibri" w:hAnsi="Calibri" w:cs="Calibri"/>
+          <w:b/>
+          <w:bCs/>
+          <w:sz w:val="22"/>
+          <w:szCs w:val="22"/>
+          <w:lang w:val="en-US"/>
+        </w:rPr>
         <w:t>Value type and reference type:</w:t>
       </w:r>
       <w:r>
         <w:rPr>
           <w:rFonts w:ascii="Calibri" w:hAnsi="Calibri" w:cs="Calibri"/>
-          <w:lang w:val="en-US"/>
-        </w:rPr>
-        <w:br/>
-      </w:r>
-      <w:r>
-        <w:rPr>
-          <w:rFonts w:ascii="Calibri" w:hAnsi="Calibri" w:cs="Calibri"/>
-          <w:lang w:val="en-US"/>
-        </w:rPr>
-        <w:br/>
-      </w:r>
-      <w:r>
-        <w:rPr>
-          <w:rFonts w:ascii="Calibri" w:hAnsi="Calibri" w:cs="Calibri"/>
-          <w:b/>
-          <w:bCs/>
+          <w:sz w:val="22"/>
+          <w:szCs w:val="22"/>
+          <w:lang w:val="en-US"/>
+        </w:rPr>
+        <w:br/>
+      </w:r>
+      <w:r>
+        <w:rPr>
+          <w:rFonts w:ascii="Calibri" w:hAnsi="Calibri" w:cs="Calibri"/>
+          <w:sz w:val="22"/>
+          <w:szCs w:val="22"/>
+          <w:lang w:val="en-US"/>
+        </w:rPr>
+        <w:br/>
+      </w:r>
+      <w:r>
+        <w:rPr>
+          <w:rFonts w:ascii="Calibri" w:hAnsi="Calibri" w:cs="Calibri"/>
+          <w:b/>
+          <w:bCs/>
+          <w:sz w:val="22"/>
+          <w:szCs w:val="22"/>
           <w:lang w:val="en-US"/>
         </w:rPr>
         <w:t>Value type:</w:t>
@@ -1896,6 +2235,8 @@
       <w:r>
         <w:rPr>
           <w:rFonts w:ascii="Calibri" w:hAnsi="Calibri" w:cs="Calibri"/>
+          <w:sz w:val="22"/>
+          <w:szCs w:val="22"/>
           <w:lang w:val="en-US"/>
         </w:rPr>
         <w:t xml:space="preserve"> Each instance </w:t>
@@ -1904,6 +2245,8 @@
       <w:r>
         <w:rPr>
           <w:rFonts w:ascii="Calibri" w:hAnsi="Calibri" w:cs="Calibri"/>
+          <w:sz w:val="22"/>
+          <w:szCs w:val="22"/>
           <w:lang w:val="en-US"/>
         </w:rPr>
         <w:t>keep</w:t>
@@ -1912,6 +2255,8 @@
       <w:r>
         <w:rPr>
           <w:rFonts w:ascii="Calibri" w:hAnsi="Calibri" w:cs="Calibri"/>
+          <w:sz w:val="22"/>
+          <w:szCs w:val="22"/>
           <w:lang w:val="en-US"/>
         </w:rPr>
         <w:t xml:space="preserve"> its own copy.</w:t>
@@ -1921,28 +2266,37 @@
       <w:pPr>
         <w:rPr>
           <w:rFonts w:ascii="Calibri" w:hAnsi="Calibri" w:cs="Calibri"/>
-          <w:lang w:val="en-US"/>
-        </w:rPr>
-      </w:pPr>
-      <w:r>
-        <w:rPr>
-          <w:rFonts w:ascii="Calibri" w:hAnsi="Calibri" w:cs="Calibri"/>
-          <w:b/>
-          <w:bCs/>
-          <w:lang w:val="en-US"/>
-        </w:rPr>
+          <w:sz w:val="22"/>
+          <w:szCs w:val="22"/>
+          <w:lang w:val="en-US"/>
+        </w:rPr>
+      </w:pPr>
+      <w:r>
+        <w:rPr>
+          <w:rFonts w:ascii="Calibri" w:hAnsi="Calibri" w:cs="Calibri"/>
+          <w:b/>
+          <w:bCs/>
+          <w:sz w:val="22"/>
+          <w:szCs w:val="22"/>
+          <w:lang w:val="en-US"/>
+        </w:rPr>
+        <w:lastRenderedPageBreak/>
         <w:t>Example:</w:t>
       </w:r>
       <w:r>
         <w:rPr>
           <w:rFonts w:ascii="Calibri" w:hAnsi="Calibri" w:cs="Calibri"/>
-          <w:lang w:val="en-US"/>
-        </w:rPr>
-        <w:br/>
-      </w:r>
-      <w:r>
-        <w:rPr>
-          <w:rFonts w:ascii="Calibri" w:hAnsi="Calibri" w:cs="Calibri"/>
+          <w:sz w:val="22"/>
+          <w:szCs w:val="22"/>
+          <w:lang w:val="en-US"/>
+        </w:rPr>
+        <w:br/>
+      </w:r>
+      <w:r>
+        <w:rPr>
+          <w:rFonts w:ascii="Calibri" w:hAnsi="Calibri" w:cs="Calibri"/>
+          <w:sz w:val="22"/>
+          <w:szCs w:val="22"/>
           <w:lang w:val="en-US"/>
         </w:rPr>
         <w:br/>
@@ -1952,6 +2306,8 @@
       <w:r>
         <w:rPr>
           <w:rFonts w:ascii="Calibri" w:hAnsi="Calibri" w:cs="Calibri"/>
+          <w:sz w:val="22"/>
+          <w:szCs w:val="22"/>
           <w:lang w:val="en-US"/>
         </w:rPr>
         <w:t>enum</w:t>
@@ -1960,6 +2316,8 @@
       <w:r>
         <w:rPr>
           <w:rFonts w:ascii="Calibri" w:hAnsi="Calibri" w:cs="Calibri"/>
+          <w:sz w:val="22"/>
+          <w:szCs w:val="22"/>
           <w:lang w:val="en-US"/>
         </w:rPr>
         <w:t>, tuple.</w:t>
@@ -1967,6 +2325,8 @@
       <w:r>
         <w:rPr>
           <w:rFonts w:ascii="Calibri" w:hAnsi="Calibri" w:cs="Calibri"/>
+          <w:sz w:val="22"/>
+          <w:szCs w:val="22"/>
           <w:lang w:val="en-US"/>
         </w:rPr>
         <w:br/>
@@ -1975,6 +2335,8 @@
       <w:r>
         <w:rPr>
           <w:rFonts w:ascii="Calibri" w:hAnsi="Calibri" w:cs="Calibri"/>
+          <w:sz w:val="22"/>
+          <w:szCs w:val="22"/>
           <w:lang w:val="en-US"/>
         </w:rPr>
         <w:t xml:space="preserve">Array, Dictionary are </w:t>
@@ -1983,6 +2345,8 @@
       <w:r>
         <w:rPr>
           <w:rFonts w:ascii="Calibri" w:hAnsi="Calibri" w:cs="Calibri"/>
+          <w:sz w:val="22"/>
+          <w:szCs w:val="22"/>
           <w:lang w:val="en-US"/>
         </w:rPr>
         <w:t>struct</w:t>
@@ -1991,6 +2355,8 @@
       <w:r>
         <w:rPr>
           <w:rFonts w:ascii="Calibri" w:hAnsi="Calibri" w:cs="Calibri"/>
+          <w:sz w:val="22"/>
+          <w:szCs w:val="22"/>
           <w:lang w:val="en-US"/>
         </w:rPr>
         <w:t xml:space="preserve"> type.</w:t>
@@ -2000,6 +2366,8 @@
       <w:pPr>
         <w:rPr>
           <w:rFonts w:ascii="Calibri" w:hAnsi="Calibri" w:cs="Calibri"/>
+          <w:sz w:val="22"/>
+          <w:szCs w:val="22"/>
           <w:lang w:val="en-US"/>
         </w:rPr>
       </w:pPr>
@@ -2010,14 +2378,18 @@
           <w:rFonts w:ascii="Calibri" w:hAnsi="Calibri" w:cs="Calibri"/>
           <w:b/>
           <w:bCs/>
-          <w:lang w:val="en-US"/>
-        </w:rPr>
-      </w:pPr>
-      <w:r>
-        <w:rPr>
-          <w:rFonts w:ascii="Calibri" w:hAnsi="Calibri" w:cs="Calibri"/>
-          <w:b/>
-          <w:bCs/>
+          <w:sz w:val="22"/>
+          <w:szCs w:val="22"/>
+          <w:lang w:val="en-US"/>
+        </w:rPr>
+      </w:pPr>
+      <w:r>
+        <w:rPr>
+          <w:rFonts w:ascii="Calibri" w:hAnsi="Calibri" w:cs="Calibri"/>
+          <w:b/>
+          <w:bCs/>
+          <w:sz w:val="22"/>
+          <w:szCs w:val="22"/>
           <w:lang w:val="en-US"/>
         </w:rPr>
         <w:t>Reference type:</w:t>
@@ -2027,12 +2399,16 @@
       <w:pPr>
         <w:rPr>
           <w:rFonts w:ascii="Calibri" w:hAnsi="Calibri" w:cs="Calibri"/>
-          <w:lang w:val="en-US"/>
-        </w:rPr>
-      </w:pPr>
-      <w:r>
-        <w:rPr>
-          <w:rFonts w:ascii="Calibri" w:hAnsi="Calibri" w:cs="Calibri"/>
+          <w:sz w:val="22"/>
+          <w:szCs w:val="22"/>
+          <w:lang w:val="en-US"/>
+        </w:rPr>
+      </w:pPr>
+      <w:r>
+        <w:rPr>
+          <w:rFonts w:ascii="Calibri" w:hAnsi="Calibri" w:cs="Calibri"/>
+          <w:sz w:val="22"/>
+          <w:szCs w:val="22"/>
           <w:lang w:val="en-US"/>
         </w:rPr>
         <w:t>Each reference shared the same data while assign and passing to the function.</w:t>
@@ -2044,14 +2420,18 @@
           <w:rFonts w:ascii="Calibri" w:hAnsi="Calibri" w:cs="Calibri"/>
           <w:b/>
           <w:bCs/>
-          <w:lang w:val="en-US"/>
-        </w:rPr>
-      </w:pPr>
-      <w:r>
-        <w:rPr>
-          <w:rFonts w:ascii="Calibri" w:hAnsi="Calibri" w:cs="Calibri"/>
-          <w:b/>
-          <w:bCs/>
+          <w:sz w:val="22"/>
+          <w:szCs w:val="22"/>
+          <w:lang w:val="en-US"/>
+        </w:rPr>
+      </w:pPr>
+      <w:r>
+        <w:rPr>
+          <w:rFonts w:ascii="Calibri" w:hAnsi="Calibri" w:cs="Calibri"/>
+          <w:b/>
+          <w:bCs/>
+          <w:sz w:val="22"/>
+          <w:szCs w:val="22"/>
           <w:lang w:val="en-US"/>
         </w:rPr>
         <w:t>Example:</w:t>
@@ -2061,12 +2441,16 @@
       <w:pPr>
         <w:rPr>
           <w:rFonts w:ascii="Calibri" w:hAnsi="Calibri" w:cs="Calibri"/>
-          <w:lang w:val="en-US"/>
-        </w:rPr>
-      </w:pPr>
-      <w:r>
-        <w:rPr>
-          <w:rFonts w:ascii="Calibri" w:hAnsi="Calibri" w:cs="Calibri"/>
+          <w:sz w:val="22"/>
+          <w:szCs w:val="22"/>
+          <w:lang w:val="en-US"/>
+        </w:rPr>
+      </w:pPr>
+      <w:r>
+        <w:rPr>
+          <w:rFonts w:ascii="Calibri" w:hAnsi="Calibri" w:cs="Calibri"/>
+          <w:sz w:val="22"/>
+          <w:szCs w:val="22"/>
           <w:lang w:val="en-US"/>
         </w:rPr>
         <w:t xml:space="preserve">Class, Closure, </w:t>
@@ -2075,6 +2459,8 @@
       <w:r>
         <w:rPr>
           <w:rFonts w:ascii="Calibri" w:hAnsi="Calibri" w:cs="Calibri"/>
+          <w:sz w:val="22"/>
+          <w:szCs w:val="22"/>
           <w:lang w:val="en-US"/>
         </w:rPr>
         <w:t>AnyObject</w:t>
@@ -2083,6 +2469,8 @@
       <w:r>
         <w:rPr>
           <w:rFonts w:ascii="Calibri" w:hAnsi="Calibri" w:cs="Calibri"/>
+          <w:sz w:val="22"/>
+          <w:szCs w:val="22"/>
           <w:lang w:val="en-US"/>
         </w:rPr>
         <w:t>, actor.</w:t>
@@ -2092,24 +2480,28 @@
       <w:pPr>
         <w:rPr>
           <w:rFonts w:ascii="Calibri" w:hAnsi="Calibri" w:cs="Calibri"/>
+          <w:sz w:val="22"/>
+          <w:szCs w:val="22"/>
           <w:lang w:val="en-US"/>
         </w:rPr>
       </w:pPr>
     </w:p>
     <w:p>
       <w:pPr>
-        <w:rPr>
-          <w:rFonts w:ascii="Calibri" w:hAnsi="Calibri" w:cs="Calibri"/>
-          <w:b/>
-          <w:bCs/>
-          <w:lang w:val="en-US"/>
-        </w:rPr>
-      </w:pPr>
-      <w:r>
-        <w:rPr>
-          <w:rFonts w:ascii="Calibri" w:hAnsi="Calibri" w:cs="Calibri"/>
-          <w:b/>
-          <w:bCs/>
+        <w:pStyle w:val="p1"/>
+        <w:rPr>
+          <w:rFonts w:ascii="Calibri" w:hAnsi="Calibri" w:cs="Calibri"/>
+          <w:sz w:val="22"/>
+          <w:szCs w:val="22"/>
+        </w:rPr>
+      </w:pPr>
+      <w:r>
+        <w:rPr>
+          <w:rFonts w:ascii="Calibri" w:hAnsi="Calibri" w:cs="Calibri"/>
+          <w:b/>
+          <w:bCs/>
+          <w:sz w:val="22"/>
+          <w:szCs w:val="22"/>
           <w:lang w:val="en-US"/>
         </w:rPr>
         <w:t>actor:</w:t>
@@ -2119,22 +2511,28 @@
           <w:rFonts w:ascii="Calibri" w:hAnsi="Calibri" w:cs="Calibri"/>
           <w:b/>
           <w:bCs/>
-          <w:lang w:val="en-US"/>
-        </w:rPr>
-        <w:br/>
-      </w:r>
-      <w:r>
-        <w:rPr>
-          <w:rFonts w:ascii="Calibri" w:hAnsi="Calibri" w:cs="Calibri"/>
-          <w:b/>
-          <w:bCs/>
-          <w:lang w:val="en-US"/>
-        </w:rPr>
-        <w:br/>
-      </w:r>
-      <w:r>
-        <w:rPr>
-          <w:rFonts w:ascii="Calibri" w:hAnsi="Calibri" w:cs="Calibri"/>
+          <w:sz w:val="22"/>
+          <w:szCs w:val="22"/>
+          <w:lang w:val="en-US"/>
+        </w:rPr>
+        <w:br/>
+      </w:r>
+      <w:r>
+        <w:rPr>
+          <w:rFonts w:ascii="Calibri" w:hAnsi="Calibri" w:cs="Calibri"/>
+          <w:b/>
+          <w:bCs/>
+          <w:sz w:val="22"/>
+          <w:szCs w:val="22"/>
+          <w:lang w:val="en-US"/>
+        </w:rPr>
+        <w:br/>
+      </w:r>
+      <w:r>
+        <w:rPr>
+          <w:rFonts w:ascii="Calibri" w:hAnsi="Calibri" w:cs="Calibri"/>
+          <w:sz w:val="22"/>
+          <w:szCs w:val="22"/>
           <w:lang w:val="en-US"/>
         </w:rPr>
         <w:t>actor is a reference type which is used to providing thread safe environment in multithreading.</w:t>
@@ -2144,22 +2542,28 @@
           <w:rFonts w:ascii="Calibri" w:hAnsi="Calibri" w:cs="Calibri"/>
           <w:b/>
           <w:bCs/>
-          <w:lang w:val="en-US"/>
-        </w:rPr>
-        <w:br/>
-      </w:r>
-      <w:r>
-        <w:rPr>
-          <w:rFonts w:ascii="Calibri" w:hAnsi="Calibri" w:cs="Calibri"/>
-          <w:b/>
-          <w:bCs/>
-          <w:lang w:val="en-US"/>
-        </w:rPr>
-        <w:br/>
-      </w:r>
-      <w:r>
-        <w:rPr>
-          <w:rFonts w:ascii="Calibri" w:hAnsi="Calibri" w:cs="Calibri"/>
+          <w:sz w:val="22"/>
+          <w:szCs w:val="22"/>
+          <w:lang w:val="en-US"/>
+        </w:rPr>
+        <w:br/>
+      </w:r>
+      <w:r>
+        <w:rPr>
+          <w:rFonts w:ascii="Calibri" w:hAnsi="Calibri" w:cs="Calibri"/>
+          <w:b/>
+          <w:bCs/>
+          <w:sz w:val="22"/>
+          <w:szCs w:val="22"/>
+          <w:lang w:val="en-US"/>
+        </w:rPr>
+        <w:br/>
+      </w:r>
+      <w:r>
+        <w:rPr>
+          <w:rFonts w:ascii="Calibri" w:hAnsi="Calibri" w:cs="Calibri"/>
+          <w:sz w:val="22"/>
+          <w:szCs w:val="22"/>
           <w:lang w:val="en-US"/>
         </w:rPr>
         <w:t>- reference type</w:t>
@@ -2167,6 +2571,8 @@
       <w:r>
         <w:rPr>
           <w:rFonts w:ascii="Calibri" w:hAnsi="Calibri" w:cs="Calibri"/>
+          <w:sz w:val="22"/>
+          <w:szCs w:val="22"/>
           <w:lang w:val="en-US"/>
         </w:rPr>
         <w:br/>
@@ -2175,6 +2581,8 @@
       <w:r>
         <w:rPr>
           <w:rFonts w:ascii="Calibri" w:hAnsi="Calibri" w:cs="Calibri"/>
+          <w:sz w:val="22"/>
+          <w:szCs w:val="22"/>
           <w:lang w:val="en-US"/>
         </w:rPr>
         <w:t>‘</w:t>
@@ -2182,6 +2590,8 @@
       <w:r>
         <w:rPr>
           <w:rFonts w:ascii="Calibri" w:hAnsi="Calibri" w:cs="Calibri"/>
+          <w:sz w:val="22"/>
+          <w:szCs w:val="22"/>
           <w:lang w:val="en-US"/>
         </w:rPr>
         <w:t>actor</w:t>
@@ -2189,6 +2599,8 @@
       <w:r>
         <w:rPr>
           <w:rFonts w:ascii="Calibri" w:hAnsi="Calibri" w:cs="Calibri"/>
+          <w:sz w:val="22"/>
+          <w:szCs w:val="22"/>
           <w:lang w:val="en-US"/>
         </w:rPr>
         <w:t>’</w:t>
@@ -2196,6 +2608,8 @@
       <w:r>
         <w:rPr>
           <w:rFonts w:ascii="Calibri" w:hAnsi="Calibri" w:cs="Calibri"/>
+          <w:sz w:val="22"/>
+          <w:szCs w:val="22"/>
           <w:lang w:val="en-US"/>
         </w:rPr>
         <w:t xml:space="preserve"> keyword</w:t>
@@ -2203,6 +2617,8 @@
       <w:r>
         <w:rPr>
           <w:rFonts w:ascii="Calibri" w:hAnsi="Calibri" w:cs="Calibri"/>
+          <w:sz w:val="22"/>
+          <w:szCs w:val="22"/>
           <w:lang w:val="en-US"/>
         </w:rPr>
         <w:br/>
@@ -2211,6 +2627,8 @@
       <w:r>
         <w:rPr>
           <w:rFonts w:ascii="Calibri" w:hAnsi="Calibri" w:cs="Calibri"/>
+          <w:sz w:val="22"/>
+          <w:szCs w:val="22"/>
           <w:lang w:val="en-US"/>
         </w:rPr>
         <w:t>Methods are isolated.</w:t>
@@ -2218,6 +2636,8 @@
       <w:r>
         <w:rPr>
           <w:rFonts w:ascii="Calibri" w:hAnsi="Calibri" w:cs="Calibri"/>
+          <w:sz w:val="22"/>
+          <w:szCs w:val="22"/>
           <w:lang w:val="en-US"/>
         </w:rPr>
         <w:br/>
@@ -2226,6 +2646,8 @@
       <w:r>
         <w:rPr>
           <w:rFonts w:ascii="Calibri" w:hAnsi="Calibri" w:cs="Calibri"/>
+          <w:sz w:val="22"/>
+          <w:szCs w:val="22"/>
           <w:lang w:val="en-US"/>
         </w:rPr>
         <w:br/>
@@ -2234,6 +2656,8 @@
       <w:r>
         <w:rPr>
           <w:rFonts w:ascii="Calibri" w:hAnsi="Calibri" w:cs="Calibri"/>
+          <w:sz w:val="22"/>
+          <w:szCs w:val="22"/>
           <w:lang w:val="en-US"/>
         </w:rPr>
         <w:br/>
@@ -2244,20 +2668,260 @@
           <w:rFonts w:ascii="Calibri" w:hAnsi="Calibri" w:cs="Calibri"/>
           <w:b/>
           <w:bCs/>
-          <w:lang w:val="en-US"/>
-        </w:rPr>
-        <w:br/>
+          <w:sz w:val="22"/>
+          <w:szCs w:val="22"/>
+          <w:lang w:val="en-US"/>
+        </w:rPr>
+        <w:br/>
+      </w:r>
+      <w:r>
+        <w:rPr>
+          <w:rFonts w:ascii="Calibri" w:hAnsi="Calibri" w:cs="Calibri"/>
+          <w:b/>
+          <w:bCs/>
+          <w:sz w:val="22"/>
+          <w:szCs w:val="22"/>
+          <w:lang w:val="en-US"/>
+        </w:rPr>
+        <w:br/>
+      </w:r>
+      <w:r>
+        <w:rPr>
+          <w:rFonts w:ascii="Calibri" w:hAnsi="Calibri" w:cs="Calibri"/>
+          <w:sz w:val="22"/>
+          <w:szCs w:val="22"/>
+        </w:rPr>
+        <w:t xml:space="preserve">In swift why we need to create </w:t>
+      </w:r>
+      <w:proofErr w:type="spellStart"/>
+      <w:r>
+        <w:rPr>
+          <w:rFonts w:ascii="Calibri" w:hAnsi="Calibri" w:cs="Calibri"/>
+          <w:sz w:val="22"/>
+          <w:szCs w:val="22"/>
+        </w:rPr>
+        <w:t>init</w:t>
+      </w:r>
+      <w:proofErr w:type="spellEnd"/>
+      <w:r>
+        <w:rPr>
+          <w:rFonts w:ascii="Calibri" w:hAnsi="Calibri" w:cs="Calibri"/>
+          <w:sz w:val="22"/>
+          <w:szCs w:val="22"/>
+        </w:rPr>
+        <w:t xml:space="preserve"> for class but not for struct ?</w:t>
       </w:r>
     </w:p>
     <w:p>
       <w:pPr>
-        <w:rPr>
-          <w:rFonts w:ascii="Calibri" w:hAnsi="Calibri" w:cs="Calibri"/>
-          <w:b/>
-          <w:bCs/>
-          <w:lang w:val="en-US"/>
-        </w:rPr>
-      </w:pPr>
+        <w:spacing w:after="0" w:line="240" w:lineRule="auto"/>
+        <w:rPr>
+          <w:rFonts w:ascii="Calibri" w:eastAsia="Times New Roman" w:hAnsi="Calibri" w:cs="Calibri"/>
+          <w:color w:val="0E0E0E"/>
+          <w:kern w:val="0"/>
+          <w:sz w:val="22"/>
+          <w:szCs w:val="22"/>
+          <w:lang w:eastAsia="en-GB"/>
+          <w14:ligatures w14:val="none"/>
+        </w:rPr>
+      </w:pPr>
+      <w:r>
+        <w:rPr>
+          <w:rFonts w:ascii="Calibri" w:eastAsia="Times New Roman" w:hAnsi="Calibri" w:cs="Calibri"/>
+          <w:color w:val="0E0E0E"/>
+          <w:kern w:val="0"/>
+          <w:sz w:val="22"/>
+          <w:szCs w:val="22"/>
+          <w:lang w:eastAsia="en-GB"/>
+          <w14:ligatures w14:val="none"/>
+        </w:rPr>
+        <w:t xml:space="preserve">Structs get a free </w:t>
+      </w:r>
+      <w:proofErr w:type="spellStart"/>
+      <w:r>
+        <w:rPr>
+          <w:rFonts w:ascii="Calibri" w:eastAsia="Times New Roman" w:hAnsi="Calibri" w:cs="Calibri"/>
+          <w:color w:val="0E0E0E"/>
+          <w:kern w:val="0"/>
+          <w:sz w:val="22"/>
+          <w:szCs w:val="22"/>
+          <w:lang w:eastAsia="en-GB"/>
+          <w14:ligatures w14:val="none"/>
+        </w:rPr>
+        <w:t>memberwise</w:t>
+      </w:r>
+      <w:proofErr w:type="spellEnd"/>
+      <w:r>
+        <w:rPr>
+          <w:rFonts w:ascii="Calibri" w:eastAsia="Times New Roman" w:hAnsi="Calibri" w:cs="Calibri"/>
+          <w:color w:val="0E0E0E"/>
+          <w:kern w:val="0"/>
+          <w:sz w:val="22"/>
+          <w:szCs w:val="22"/>
+          <w:lang w:eastAsia="en-GB"/>
+          <w14:ligatures w14:val="none"/>
+        </w:rPr>
+        <w:t xml:space="preserve"> initializer because they are simple value types without inheritance, while classes don’t because they support inheritance and require controlled initialization, so Swift forces explicit initializers.</w:t>
+      </w:r>
+    </w:p>
+    <w:p>
+      <w:pPr>
+        <w:rPr>
+          <w:rFonts w:ascii="Calibri" w:hAnsi="Calibri" w:cs="Calibri"/>
+          <w:b/>
+          <w:bCs/>
+          <w:sz w:val="22"/>
+          <w:szCs w:val="22"/>
+          <w:lang w:val="en-US"/>
+        </w:rPr>
+      </w:pPr>
+      <w:r>
+        <w:rPr>
+          <w:rFonts w:ascii="Calibri" w:hAnsi="Calibri" w:cs="Calibri"/>
+          <w:b/>
+          <w:bCs/>
+          <w:sz w:val="22"/>
+          <w:szCs w:val="22"/>
+          <w:lang w:val="en-US"/>
+        </w:rPr>
+        <w:br/>
+        <w:t>Properties:</w:t>
+      </w:r>
+      <w:r>
+        <w:rPr>
+          <w:rFonts w:ascii="Calibri" w:hAnsi="Calibri" w:cs="Calibri"/>
+          <w:b/>
+          <w:bCs/>
+          <w:sz w:val="22"/>
+          <w:szCs w:val="22"/>
+          <w:lang w:val="en-US"/>
+        </w:rPr>
+        <w:br/>
+      </w:r>
+      <w:r>
+        <w:rPr>
+          <w:rFonts w:ascii="Calibri" w:hAnsi="Calibri" w:cs="Calibri"/>
+          <w:b/>
+          <w:bCs/>
+          <w:sz w:val="22"/>
+          <w:szCs w:val="22"/>
+          <w:lang w:val="en-US"/>
+        </w:rPr>
+        <w:br/>
+        <w:t>Properties are variable and constant associated with class, struct and actors.</w:t>
+      </w:r>
+    </w:p>
+    <w:p>
+      <w:pPr>
+        <w:pStyle w:val="ListParagraph"/>
+        <w:numPr>
+          <w:ilvl w:val="0"/>
+          <w:numId w:val="3"/>
+        </w:numPr>
+        <w:rPr>
+          <w:rFonts w:ascii="Calibri" w:hAnsi="Calibri" w:cs="Calibri"/>
+          <w:b/>
+          <w:bCs/>
+          <w:sz w:val="22"/>
+          <w:szCs w:val="22"/>
+          <w:lang w:val="en-US"/>
+        </w:rPr>
+      </w:pPr>
+      <w:r>
+        <w:rPr>
+          <w:rFonts w:ascii="Calibri" w:hAnsi="Calibri" w:cs="Calibri"/>
+          <w:b/>
+          <w:bCs/>
+          <w:sz w:val="22"/>
+          <w:szCs w:val="22"/>
+          <w:lang w:val="en-US"/>
+        </w:rPr>
+        <w:t>Stored properties</w:t>
+      </w:r>
+    </w:p>
+    <w:p>
+      <w:pPr>
+        <w:pStyle w:val="ListParagraph"/>
+        <w:numPr>
+          <w:ilvl w:val="0"/>
+          <w:numId w:val="3"/>
+        </w:numPr>
+        <w:rPr>
+          <w:rFonts w:ascii="Calibri" w:hAnsi="Calibri" w:cs="Calibri"/>
+          <w:b/>
+          <w:bCs/>
+          <w:sz w:val="22"/>
+          <w:szCs w:val="22"/>
+          <w:lang w:val="en-US"/>
+        </w:rPr>
+      </w:pPr>
+      <w:r>
+        <w:rPr>
+          <w:rFonts w:ascii="Calibri" w:hAnsi="Calibri" w:cs="Calibri"/>
+          <w:b/>
+          <w:bCs/>
+          <w:sz w:val="22"/>
+          <w:szCs w:val="22"/>
+          <w:lang w:val="en-US"/>
+        </w:rPr>
+        <w:t>Computed properties</w:t>
+      </w:r>
+    </w:p>
+    <w:p>
+      <w:pPr>
+        <w:pStyle w:val="ListParagraph"/>
+        <w:numPr>
+          <w:ilvl w:val="0"/>
+          <w:numId w:val="3"/>
+        </w:numPr>
+        <w:rPr>
+          <w:rFonts w:ascii="Calibri" w:hAnsi="Calibri" w:cs="Calibri"/>
+          <w:b/>
+          <w:bCs/>
+          <w:sz w:val="22"/>
+          <w:szCs w:val="22"/>
+          <w:lang w:val="en-US"/>
+        </w:rPr>
+      </w:pPr>
+      <w:r>
+        <w:rPr>
+          <w:rFonts w:ascii="Calibri" w:hAnsi="Calibri" w:cs="Calibri"/>
+          <w:b/>
+          <w:bCs/>
+          <w:sz w:val="22"/>
+          <w:szCs w:val="22"/>
+          <w:lang w:val="en-US"/>
+        </w:rPr>
+        <w:t>Lazy stored properties.</w:t>
+      </w:r>
+    </w:p>
+    <w:p>
+      <w:pPr>
+        <w:pStyle w:val="ListParagraph"/>
+        <w:numPr>
+          <w:ilvl w:val="0"/>
+          <w:numId w:val="3"/>
+        </w:numPr>
+        <w:rPr>
+          <w:rFonts w:ascii="Calibri" w:hAnsi="Calibri" w:cs="Calibri"/>
+          <w:b/>
+          <w:bCs/>
+          <w:sz w:val="22"/>
+          <w:szCs w:val="22"/>
+          <w:lang w:val="en-US"/>
+        </w:rPr>
+      </w:pPr>
+      <w:r>
+        <w:rPr>
+          <w:rFonts w:ascii="Calibri" w:hAnsi="Calibri" w:cs="Calibri"/>
+          <w:b/>
+          <w:bCs/>
+          <w:sz w:val="22"/>
+          <w:szCs w:val="22"/>
+          <w:lang w:val="en-US"/>
+        </w:rPr>
+        <w:t>Type properties (Static/Class properties)</w:t>
+      </w:r>
     </w:p>
     <w:sectPr>
       <w:pgSz w:w="11906" w:h="16838"/>
@@ -2533,11 +3197,103 @@
       </w:rPr>
     </w:lvl>
   </w:abstractNum>
+  <w:abstractNum w:abstractNumId="2" w15:restartNumberingAfterBreak="0">
+    <w:nsid w:val="5102069B"/>
+    <w:multiLevelType w:val="hybridMultilevel"/>
+    <w:tmpl w:val="0526F6AE"/>
+    <w:lvl w:ilvl="0" w:tplc="0809000F">
+      <w:start w:val="1"/>
+      <w:numFmt w:val="decimal"/>
+      <w:lvlText w:val="%1."/>
+      <w:lvlJc w:val="left"/>
+      <w:pPr>
+        <w:ind w:left="720" w:hanging="360"/>
+      </w:pPr>
+      <w:rPr>
+        <w:rFonts w:hint="default"/>
+      </w:rPr>
+    </w:lvl>
+    <w:lvl w:ilvl="1" w:tplc="08090019" w:tentative="1">
+      <w:start w:val="1"/>
+      <w:numFmt w:val="lowerLetter"/>
+      <w:lvlText w:val="%2."/>
+      <w:lvlJc w:val="left"/>
+      <w:pPr>
+        <w:ind w:left="1440" w:hanging="360"/>
+      </w:pPr>
+    </w:lvl>
+    <w:lvl w:ilvl="2" w:tplc="0809001B" w:tentative="1">
+      <w:start w:val="1"/>
+      <w:numFmt w:val="lowerRoman"/>
+      <w:lvlText w:val="%3."/>
+      <w:lvlJc w:val="right"/>
+      <w:pPr>
+        <w:ind w:left="2160" w:hanging="180"/>
+      </w:pPr>
+    </w:lvl>
+    <w:lvl w:ilvl="3" w:tplc="0809000F" w:tentative="1">
+      <w:start w:val="1"/>
+      <w:numFmt w:val="decimal"/>
+      <w:lvlText w:val="%4."/>
+      <w:lvlJc w:val="left"/>
+      <w:pPr>
+        <w:ind w:left="2880" w:hanging="360"/>
+      </w:pPr>
+    </w:lvl>
+    <w:lvl w:ilvl="4" w:tplc="08090019" w:tentative="1">
+      <w:start w:val="1"/>
+      <w:numFmt w:val="lowerLetter"/>
+      <w:lvlText w:val="%5."/>
+      <w:lvlJc w:val="left"/>
+      <w:pPr>
+        <w:ind w:left="3600" w:hanging="360"/>
+      </w:pPr>
+    </w:lvl>
+    <w:lvl w:ilvl="5" w:tplc="0809001B" w:tentative="1">
+      <w:start w:val="1"/>
+      <w:numFmt w:val="lowerRoman"/>
+      <w:lvlText w:val="%6."/>
+      <w:lvlJc w:val="right"/>
+      <w:pPr>
+        <w:ind w:left="4320" w:hanging="180"/>
+      </w:pPr>
+    </w:lvl>
+    <w:lvl w:ilvl="6" w:tplc="0809000F" w:tentative="1">
+      <w:start w:val="1"/>
+      <w:numFmt w:val="decimal"/>
+      <w:lvlText w:val="%7."/>
+      <w:lvlJc w:val="left"/>
+      <w:pPr>
+        <w:ind w:left="5040" w:hanging="360"/>
+      </w:pPr>
+    </w:lvl>
+    <w:lvl w:ilvl="7" w:tplc="08090019" w:tentative="1">
+      <w:start w:val="1"/>
+      <w:numFmt w:val="lowerLetter"/>
+      <w:lvlText w:val="%8."/>
+      <w:lvlJc w:val="left"/>
+      <w:pPr>
+        <w:ind w:left="5760" w:hanging="360"/>
+      </w:pPr>
+    </w:lvl>
+    <w:lvl w:ilvl="8" w:tplc="0809001B" w:tentative="1">
+      <w:start w:val="1"/>
+      <w:numFmt w:val="lowerRoman"/>
+      <w:lvlText w:val="%9."/>
+      <w:lvlJc w:val="right"/>
+      <w:pPr>
+        <w:ind w:left="6480" w:hanging="180"/>
+      </w:pPr>
+    </w:lvl>
+  </w:abstractNum>
   <w:num w:numId="1" w16cid:durableId="990326400">
     <w:abstractNumId w:val="1"/>
   </w:num>
   <w:num w:numId="2" w16cid:durableId="1781946669">
     <w:abstractNumId w:val="0"/>
+  </w:num>
+  <w:num w:numId="3" w16cid:durableId="169491993">
+    <w:abstractNumId w:val="2"/>
   </w:num>
 </w:numbering>
 </file>

</xml_diff>

<commit_message>
Doc-Interview-2026 - Properties and enum - P.35-42
</commit_message>
<xml_diff>
--- a/Documents/Interview-2026.docx
+++ b/Documents/Interview-2026.docx
@@ -2921,6 +2921,129 @@
           <w:lang w:val="en-US"/>
         </w:rPr>
         <w:t>Type properties (Static/Class properties)</w:t>
+      </w:r>
+    </w:p>
+    <w:p>
+      <w:pPr>
+        <w:rPr>
+          <w:rFonts w:ascii="Calibri" w:hAnsi="Calibri" w:cs="Calibri"/>
+          <w:b/>
+          <w:bCs/>
+          <w:sz w:val="22"/>
+          <w:szCs w:val="22"/>
+          <w:lang w:val="en-US"/>
+        </w:rPr>
+      </w:pPr>
+    </w:p>
+    <w:p>
+      <w:pPr>
+        <w:pStyle w:val="p1"/>
+      </w:pPr>
+      <w:r>
+        <w:rPr>
+          <w:rStyle w:val="s1"/>
+          <w:rFonts w:eastAsiaTheme="majorEastAsia"/>
+        </w:rPr>
+        <w:t xml:space="preserve">Enums </w:t>
+      </w:r>
+      <w:r>
+        <w:rPr>
+          <w:b/>
+          <w:bCs/>
+        </w:rPr>
+        <w:t>cannot have stored properties</w:t>
+      </w:r>
+      <w:r>
+        <w:rPr>
+          <w:rStyle w:val="s1"/>
+          <w:rFonts w:eastAsiaTheme="majorEastAsia"/>
+        </w:rPr>
+        <w:t>:</w:t>
+      </w:r>
+    </w:p>
+    <w:p>
+      <w:pPr>
+        <w:pStyle w:val="p1"/>
+      </w:pPr>
+      <w:r>
+        <w:t xml:space="preserve">Enums can store data using </w:t>
+      </w:r>
+      <w:r>
+        <w:rPr>
+          <w:rStyle w:val="s1"/>
+          <w:rFonts w:eastAsiaTheme="majorEastAsia"/>
+          <w:b/>
+          <w:bCs/>
+        </w:rPr>
+        <w:t>associated values</w:t>
+      </w:r>
+      <w:r>
+        <w:t>:</w:t>
+      </w:r>
+    </w:p>
+    <w:p>
+      <w:pPr>
+        <w:rPr>
+          <w:rFonts w:ascii="Calibri" w:hAnsi="Calibri" w:cs="Calibri"/>
+          <w:b/>
+          <w:bCs/>
+          <w:sz w:val="22"/>
+          <w:szCs w:val="22"/>
+          <w:lang w:val="en-US"/>
+        </w:rPr>
+      </w:pPr>
+      <w:r>
+        <w:rPr>
+          <w:rFonts w:ascii="Calibri" w:hAnsi="Calibri" w:cs="Calibri"/>
+          <w:b/>
+          <w:bCs/>
+          <w:noProof/>
+          <w:sz w:val="22"/>
+          <w:szCs w:val="22"/>
+          <w:lang w:val="en-US"/>
+        </w:rPr>
+        <w:lastRenderedPageBreak/>
+        <w:drawing>
+          <wp:inline distT="0" distB="0" distL="0" distR="0" wp14:anchorId="7E6F6FC6" wp14:editId="269FF6DB">
+            <wp:extent cx="3095469" cy="1155742"/>
+            <wp:effectExtent l="0" t="0" r="3810" b="0"/>
+            <wp:docPr id="2086554819" name="Picture 1"/>
+            <wp:cNvGraphicFramePr>
+              <a:graphicFrameLocks xmlns:a="http://schemas.openxmlformats.org/drawingml/2006/main" noChangeAspect="1"/>
+            </wp:cNvGraphicFramePr>
+            <a:graphic xmlns:a="http://schemas.openxmlformats.org/drawingml/2006/main">
+              <a:graphicData uri="http://schemas.openxmlformats.org/drawingml/2006/picture">
+                <pic:pic xmlns:pic="http://schemas.openxmlformats.org/drawingml/2006/picture">
+                  <pic:nvPicPr>
+                    <pic:cNvPr id="2086554819" name="Picture 2086554819"/>
+                    <pic:cNvPicPr/>
+                  </pic:nvPicPr>
+                  <pic:blipFill>
+                    <a:blip r:embed="rId13" cstate="print">
+                      <a:extLst>
+                        <a:ext uri="{28A0092B-C50C-407E-A947-70E740481C1C}">
+                          <a14:useLocalDpi xmlns:a14="http://schemas.microsoft.com/office/drawing/2010/main" val="0"/>
+                        </a:ext>
+                      </a:extLst>
+                    </a:blip>
+                    <a:stretch>
+                      <a:fillRect/>
+                    </a:stretch>
+                  </pic:blipFill>
+                  <pic:spPr>
+                    <a:xfrm>
+                      <a:off x="0" y="0"/>
+                      <a:ext cx="3116340" cy="1163535"/>
+                    </a:xfrm>
+                    <a:prstGeom prst="rect">
+                      <a:avLst/>
+                    </a:prstGeom>
+                  </pic:spPr>
+                </pic:pic>
+              </a:graphicData>
+            </a:graphic>
+          </wp:inline>
+        </w:drawing>
       </w:r>
     </w:p>
     <w:sectPr>

</xml_diff>

<commit_message>
Doc-Interview-2026- Inheritance vs POP
</commit_message>
<xml_diff>
--- a/Documents/Interview-2026.docx
+++ b/Documents/Interview-2026.docx
@@ -3045,6 +3045,436 @@
           </wp:inline>
         </w:drawing>
       </w:r>
+      <w:r>
+        <w:rPr>
+          <w:rFonts w:ascii="Calibri" w:hAnsi="Calibri" w:cs="Calibri"/>
+          <w:b/>
+          <w:bCs/>
+          <w:sz w:val="22"/>
+          <w:szCs w:val="22"/>
+          <w:lang w:val="en-US"/>
+        </w:rPr>
+        <w:br/>
+      </w:r>
+    </w:p>
+    <w:tbl>
+      <w:tblPr>
+        <w:tblStyle w:val="TableGrid"/>
+        <w:tblW w:w="0" w:type="auto"/>
+        <w:tblLook w:val="04A0" w:firstRow="1" w:lastRow="0" w:firstColumn="1" w:lastColumn="0" w:noHBand="0" w:noVBand="1"/>
+      </w:tblPr>
+      <w:tblGrid>
+        <w:gridCol w:w="4508"/>
+        <w:gridCol w:w="4508"/>
+      </w:tblGrid>
+      <w:tr>
+        <w:tc>
+          <w:tcPr>
+            <w:tcW w:w="4508" w:type="dxa"/>
+          </w:tcPr>
+          <w:p>
+            <w:pPr>
+              <w:rPr>
+                <w:rFonts w:ascii="Calibri" w:hAnsi="Calibri" w:cs="Calibri"/>
+                <w:b/>
+                <w:bCs/>
+                <w:sz w:val="22"/>
+                <w:szCs w:val="22"/>
+                <w:lang w:val="en-US"/>
+              </w:rPr>
+            </w:pPr>
+            <w:r>
+              <w:rPr>
+                <w:rFonts w:ascii="Calibri" w:hAnsi="Calibri" w:cs="Calibri"/>
+                <w:b/>
+                <w:bCs/>
+                <w:sz w:val="22"/>
+                <w:szCs w:val="22"/>
+                <w:lang w:val="en-US"/>
+              </w:rPr>
+              <w:t>Inheritance</w:t>
+            </w:r>
+          </w:p>
+        </w:tc>
+        <w:tc>
+          <w:tcPr>
+            <w:tcW w:w="4508" w:type="dxa"/>
+          </w:tcPr>
+          <w:p>
+            <w:pPr>
+              <w:rPr>
+                <w:rFonts w:ascii="Calibri" w:hAnsi="Calibri" w:cs="Calibri"/>
+                <w:b/>
+                <w:bCs/>
+                <w:sz w:val="22"/>
+                <w:szCs w:val="22"/>
+                <w:lang w:val="en-US"/>
+              </w:rPr>
+            </w:pPr>
+            <w:r>
+              <w:rPr>
+                <w:rFonts w:ascii="Calibri" w:hAnsi="Calibri" w:cs="Calibri"/>
+                <w:b/>
+                <w:bCs/>
+                <w:sz w:val="22"/>
+                <w:szCs w:val="22"/>
+                <w:lang w:val="en-US"/>
+              </w:rPr>
+              <w:t>Protocol oriented programming</w:t>
+            </w:r>
+          </w:p>
+        </w:tc>
+      </w:tr>
+      <w:tr>
+        <w:tc>
+          <w:tcPr>
+            <w:tcW w:w="4508" w:type="dxa"/>
+          </w:tcPr>
+          <w:p>
+            <w:pPr>
+              <w:rPr>
+                <w:rFonts w:ascii="Calibri" w:hAnsi="Calibri" w:cs="Calibri"/>
+                <w:b/>
+                <w:bCs/>
+                <w:sz w:val="22"/>
+                <w:szCs w:val="22"/>
+                <w:lang w:val="en-US"/>
+              </w:rPr>
+            </w:pPr>
+            <w:r>
+              <w:rPr>
+                <w:rFonts w:ascii="Calibri" w:hAnsi="Calibri" w:cs="Calibri"/>
+                <w:b/>
+                <w:bCs/>
+                <w:sz w:val="22"/>
+                <w:szCs w:val="22"/>
+                <w:lang w:val="en-US"/>
+              </w:rPr>
+              <w:t xml:space="preserve">One class access properties and methods from </w:t>
+            </w:r>
+            <w:proofErr w:type="gramStart"/>
+            <w:r>
+              <w:rPr>
+                <w:rFonts w:ascii="Calibri" w:hAnsi="Calibri" w:cs="Calibri"/>
+                <w:b/>
+                <w:bCs/>
+                <w:sz w:val="22"/>
+                <w:szCs w:val="22"/>
+                <w:lang w:val="en-US"/>
+              </w:rPr>
+              <w:t>the another</w:t>
+            </w:r>
+            <w:proofErr w:type="gramEnd"/>
+            <w:r>
+              <w:rPr>
+                <w:rFonts w:ascii="Calibri" w:hAnsi="Calibri" w:cs="Calibri"/>
+                <w:b/>
+                <w:bCs/>
+                <w:sz w:val="22"/>
+                <w:szCs w:val="22"/>
+                <w:lang w:val="en-US"/>
+              </w:rPr>
+              <w:t xml:space="preserve"> class</w:t>
+            </w:r>
+          </w:p>
+        </w:tc>
+        <w:tc>
+          <w:tcPr>
+            <w:tcW w:w="4508" w:type="dxa"/>
+          </w:tcPr>
+          <w:p>
+            <w:pPr>
+              <w:rPr>
+                <w:rFonts w:ascii="Calibri" w:hAnsi="Calibri" w:cs="Calibri"/>
+                <w:b/>
+                <w:bCs/>
+                <w:sz w:val="22"/>
+                <w:szCs w:val="22"/>
+                <w:lang w:val="en-US"/>
+              </w:rPr>
+            </w:pPr>
+            <w:r>
+              <w:rPr>
+                <w:rFonts w:ascii="Calibri" w:hAnsi="Calibri" w:cs="Calibri"/>
+                <w:b/>
+                <w:bCs/>
+                <w:sz w:val="22"/>
+                <w:szCs w:val="22"/>
+                <w:lang w:val="en-US"/>
+              </w:rPr>
+              <w:t xml:space="preserve">Protocol defines blueprint of methods, properties and other requirements. </w:t>
+            </w:r>
+          </w:p>
+        </w:tc>
+      </w:tr>
+      <w:tr>
+        <w:tc>
+          <w:tcPr>
+            <w:tcW w:w="4508" w:type="dxa"/>
+          </w:tcPr>
+          <w:p>
+            <w:pPr>
+              <w:rPr>
+                <w:rFonts w:ascii="Calibri" w:hAnsi="Calibri" w:cs="Calibri"/>
+                <w:b/>
+                <w:bCs/>
+                <w:sz w:val="22"/>
+                <w:szCs w:val="22"/>
+                <w:lang w:val="en-US"/>
+              </w:rPr>
+            </w:pPr>
+            <w:r>
+              <w:rPr>
+                <w:rFonts w:ascii="Calibri" w:hAnsi="Calibri" w:cs="Calibri"/>
+                <w:b/>
+                <w:bCs/>
+                <w:sz w:val="22"/>
+                <w:szCs w:val="22"/>
+                <w:lang w:val="en-US"/>
+              </w:rPr>
+              <w:t xml:space="preserve">Reference </w:t>
+            </w:r>
+            <w:proofErr w:type="gramStart"/>
+            <w:r>
+              <w:rPr>
+                <w:rFonts w:ascii="Calibri" w:hAnsi="Calibri" w:cs="Calibri"/>
+                <w:b/>
+                <w:bCs/>
+                <w:sz w:val="22"/>
+                <w:szCs w:val="22"/>
+                <w:lang w:val="en-US"/>
+              </w:rPr>
+              <w:t>type(</w:t>
+            </w:r>
+            <w:proofErr w:type="gramEnd"/>
+            <w:r>
+              <w:rPr>
+                <w:rFonts w:ascii="Calibri" w:hAnsi="Calibri" w:cs="Calibri"/>
+                <w:b/>
+                <w:bCs/>
+                <w:sz w:val="22"/>
+                <w:szCs w:val="22"/>
+                <w:lang w:val="en-US"/>
+              </w:rPr>
+              <w:t>Classes)</w:t>
+            </w:r>
+          </w:p>
+        </w:tc>
+        <w:tc>
+          <w:tcPr>
+            <w:tcW w:w="4508" w:type="dxa"/>
+          </w:tcPr>
+          <w:p>
+            <w:pPr>
+              <w:rPr>
+                <w:rFonts w:ascii="Calibri" w:hAnsi="Calibri" w:cs="Calibri"/>
+                <w:b/>
+                <w:bCs/>
+                <w:sz w:val="22"/>
+                <w:szCs w:val="22"/>
+                <w:lang w:val="en-US"/>
+              </w:rPr>
+            </w:pPr>
+            <w:r>
+              <w:rPr>
+                <w:rFonts w:ascii="Calibri" w:hAnsi="Calibri" w:cs="Calibri"/>
+                <w:b/>
+                <w:bCs/>
+                <w:sz w:val="22"/>
+                <w:szCs w:val="22"/>
+                <w:lang w:val="en-US"/>
+              </w:rPr>
+              <w:t xml:space="preserve">Value and reference type </w:t>
+            </w:r>
+          </w:p>
+        </w:tc>
+      </w:tr>
+      <w:tr>
+        <w:tc>
+          <w:tcPr>
+            <w:tcW w:w="4508" w:type="dxa"/>
+          </w:tcPr>
+          <w:p>
+            <w:pPr>
+              <w:rPr>
+                <w:rFonts w:ascii="Calibri" w:hAnsi="Calibri" w:cs="Calibri"/>
+                <w:b/>
+                <w:bCs/>
+                <w:sz w:val="22"/>
+                <w:szCs w:val="22"/>
+                <w:lang w:val="en-US"/>
+              </w:rPr>
+            </w:pPr>
+            <w:r>
+              <w:rPr>
+                <w:rFonts w:ascii="Calibri" w:hAnsi="Calibri" w:cs="Calibri"/>
+                <w:b/>
+                <w:bCs/>
+                <w:sz w:val="22"/>
+                <w:szCs w:val="22"/>
+                <w:lang w:val="en-US"/>
+              </w:rPr>
+              <w:t xml:space="preserve">Is-a relationship </w:t>
+            </w:r>
+          </w:p>
+        </w:tc>
+        <w:tc>
+          <w:tcPr>
+            <w:tcW w:w="4508" w:type="dxa"/>
+          </w:tcPr>
+          <w:p>
+            <w:pPr>
+              <w:rPr>
+                <w:rFonts w:ascii="Calibri" w:hAnsi="Calibri" w:cs="Calibri"/>
+                <w:b/>
+                <w:bCs/>
+                <w:sz w:val="22"/>
+                <w:szCs w:val="22"/>
+                <w:lang w:val="en-US"/>
+              </w:rPr>
+            </w:pPr>
+            <w:r>
+              <w:rPr>
+                <w:rFonts w:ascii="Calibri" w:hAnsi="Calibri" w:cs="Calibri"/>
+                <w:b/>
+                <w:bCs/>
+                <w:sz w:val="22"/>
+                <w:szCs w:val="22"/>
+                <w:lang w:val="en-US"/>
+              </w:rPr>
+              <w:t>Can-do relationship</w:t>
+            </w:r>
+          </w:p>
+        </w:tc>
+      </w:tr>
+      <w:tr>
+        <w:tc>
+          <w:tcPr>
+            <w:tcW w:w="4508" w:type="dxa"/>
+          </w:tcPr>
+          <w:p>
+            <w:pPr>
+              <w:rPr>
+                <w:rFonts w:ascii="Calibri" w:hAnsi="Calibri" w:cs="Calibri"/>
+                <w:b/>
+                <w:bCs/>
+                <w:sz w:val="22"/>
+                <w:szCs w:val="22"/>
+                <w:lang w:val="en-US"/>
+              </w:rPr>
+            </w:pPr>
+            <w:r>
+              <w:rPr>
+                <w:rFonts w:ascii="Calibri" w:hAnsi="Calibri" w:cs="Calibri"/>
+                <w:b/>
+                <w:bCs/>
+                <w:sz w:val="22"/>
+                <w:szCs w:val="22"/>
+                <w:lang w:val="en-US"/>
+              </w:rPr>
+              <w:t>Pros – Code reuse</w:t>
+            </w:r>
+          </w:p>
+        </w:tc>
+        <w:tc>
+          <w:tcPr>
+            <w:tcW w:w="4508" w:type="dxa"/>
+          </w:tcPr>
+          <w:p>
+            <w:pPr>
+              <w:rPr>
+                <w:rFonts w:ascii="Calibri" w:hAnsi="Calibri" w:cs="Calibri"/>
+                <w:b/>
+                <w:bCs/>
+                <w:sz w:val="22"/>
+                <w:szCs w:val="22"/>
+                <w:lang w:val="en-US"/>
+              </w:rPr>
+            </w:pPr>
+            <w:r>
+              <w:rPr>
+                <w:rFonts w:ascii="Calibri" w:hAnsi="Calibri" w:cs="Calibri"/>
+                <w:b/>
+                <w:bCs/>
+                <w:sz w:val="22"/>
+                <w:szCs w:val="22"/>
+                <w:lang w:val="en-US"/>
+              </w:rPr>
+              <w:t>Pros - Decoupling</w:t>
+            </w:r>
+          </w:p>
+        </w:tc>
+      </w:tr>
+      <w:tr>
+        <w:tc>
+          <w:tcPr>
+            <w:tcW w:w="4508" w:type="dxa"/>
+          </w:tcPr>
+          <w:p>
+            <w:pPr>
+              <w:rPr>
+                <w:rFonts w:ascii="Calibri" w:hAnsi="Calibri" w:cs="Calibri"/>
+                <w:b/>
+                <w:bCs/>
+                <w:sz w:val="22"/>
+                <w:szCs w:val="22"/>
+                <w:lang w:val="en-US"/>
+              </w:rPr>
+            </w:pPr>
+            <w:r>
+              <w:rPr>
+                <w:rFonts w:ascii="Calibri" w:hAnsi="Calibri" w:cs="Calibri"/>
+                <w:b/>
+                <w:bCs/>
+                <w:sz w:val="22"/>
+                <w:szCs w:val="22"/>
+                <w:lang w:val="en-US"/>
+              </w:rPr>
+              <w:t>Cons – Tightly coupled</w:t>
+            </w:r>
+          </w:p>
+        </w:tc>
+        <w:tc>
+          <w:tcPr>
+            <w:tcW w:w="4508" w:type="dxa"/>
+          </w:tcPr>
+          <w:p>
+            <w:pPr>
+              <w:rPr>
+                <w:rFonts w:ascii="Calibri" w:hAnsi="Calibri" w:cs="Calibri"/>
+                <w:b/>
+                <w:bCs/>
+                <w:sz w:val="22"/>
+                <w:szCs w:val="22"/>
+                <w:lang w:val="en-US"/>
+              </w:rPr>
+            </w:pPr>
+            <w:r>
+              <w:rPr>
+                <w:rFonts w:ascii="Calibri" w:hAnsi="Calibri" w:cs="Calibri"/>
+                <w:b/>
+                <w:bCs/>
+                <w:sz w:val="22"/>
+                <w:szCs w:val="22"/>
+                <w:lang w:val="en-US"/>
+              </w:rPr>
+              <w:t>Cons – More boilerplate and complex protocol associated type</w:t>
+            </w:r>
+          </w:p>
+        </w:tc>
+      </w:tr>
+    </w:tbl>
+    <w:p>
+      <w:pPr>
+        <w:rPr>
+          <w:rFonts w:ascii="Calibri" w:hAnsi="Calibri" w:cs="Calibri"/>
+          <w:b/>
+          <w:bCs/>
+          <w:sz w:val="22"/>
+          <w:szCs w:val="22"/>
+          <w:lang w:val="en-US"/>
+        </w:rPr>
+      </w:pPr>
     </w:p>
     <w:sectPr>
       <w:pgSz w:w="11906" w:h="16838"/>

</xml_diff>

<commit_message>
Doc-Interview-2026 : SOLID Principle
</commit_message>
<xml_diff>
--- a/Documents/Interview-2026.docx
+++ b/Documents/Interview-2026.docx
@@ -116,67 +116,7 @@
           <w:szCs w:val="22"/>
           <w:lang w:val="en-US"/>
         </w:rPr>
-        <w:t xml:space="preserve">Methods: </w:t>
-      </w:r>
-      <w:proofErr w:type="gramStart"/>
-      <w:r>
-        <w:rPr>
-          <w:rFonts w:ascii="Calibri" w:hAnsi="Calibri" w:cs="Calibri"/>
-          <w:sz w:val="22"/>
-          <w:szCs w:val="22"/>
-          <w:lang w:val="en-US"/>
-        </w:rPr>
-        <w:t>talking(</w:t>
-      </w:r>
-      <w:proofErr w:type="gramEnd"/>
-      <w:r>
-        <w:rPr>
-          <w:rFonts w:ascii="Calibri" w:hAnsi="Calibri" w:cs="Calibri"/>
-          <w:sz w:val="22"/>
-          <w:szCs w:val="22"/>
-          <w:lang w:val="en-US"/>
-        </w:rPr>
-        <w:t xml:space="preserve">), </w:t>
-      </w:r>
-      <w:proofErr w:type="gramStart"/>
-      <w:r>
-        <w:rPr>
-          <w:rFonts w:ascii="Calibri" w:hAnsi="Calibri" w:cs="Calibri"/>
-          <w:sz w:val="22"/>
-          <w:szCs w:val="22"/>
-          <w:lang w:val="en-US"/>
-        </w:rPr>
-        <w:t>saving(</w:t>
-      </w:r>
-      <w:proofErr w:type="gramEnd"/>
-      <w:r>
-        <w:rPr>
-          <w:rFonts w:ascii="Calibri" w:hAnsi="Calibri" w:cs="Calibri"/>
-          <w:sz w:val="22"/>
-          <w:szCs w:val="22"/>
-          <w:lang w:val="en-US"/>
-        </w:rPr>
-        <w:t xml:space="preserve">), </w:t>
-      </w:r>
-      <w:proofErr w:type="gramStart"/>
-      <w:r>
-        <w:rPr>
-          <w:rFonts w:ascii="Calibri" w:hAnsi="Calibri" w:cs="Calibri"/>
-          <w:sz w:val="22"/>
-          <w:szCs w:val="22"/>
-          <w:lang w:val="en-US"/>
-        </w:rPr>
-        <w:t>running(</w:t>
-      </w:r>
-      <w:proofErr w:type="gramEnd"/>
-      <w:r>
-        <w:rPr>
-          <w:rFonts w:ascii="Calibri" w:hAnsi="Calibri" w:cs="Calibri"/>
-          <w:sz w:val="22"/>
-          <w:szCs w:val="22"/>
-          <w:lang w:val="en-US"/>
-        </w:rPr>
-        <w:t>).</w:t>
+        <w:t>Methods: talking(), saving(), running().</w:t>
       </w:r>
       <w:r>
         <w:rPr>
@@ -517,31 +457,7 @@
           <w:szCs w:val="22"/>
           <w:lang w:val="en-US"/>
         </w:rPr>
-        <w:t xml:space="preserve">open, public, internal, </w:t>
-      </w:r>
-      <w:proofErr w:type="spellStart"/>
-      <w:r>
-        <w:rPr>
-          <w:rFonts w:ascii="Calibri" w:hAnsi="Calibri" w:cs="Calibri"/>
-          <w:b/>
-          <w:bCs/>
-          <w:sz w:val="22"/>
-          <w:szCs w:val="22"/>
-          <w:lang w:val="en-US"/>
-        </w:rPr>
-        <w:t>filePrivate</w:t>
-      </w:r>
-      <w:proofErr w:type="spellEnd"/>
-      <w:r>
-        <w:rPr>
-          <w:rFonts w:ascii="Calibri" w:hAnsi="Calibri" w:cs="Calibri"/>
-          <w:b/>
-          <w:bCs/>
-          <w:sz w:val="22"/>
-          <w:szCs w:val="22"/>
-          <w:lang w:val="en-US"/>
-        </w:rPr>
-        <w:t>, private.</w:t>
+        <w:t>open, public, internal, filePrivate, private.</w:t>
       </w:r>
       <w:r>
         <w:rPr>
@@ -758,7 +674,6 @@
                 <w:lang w:val="en-US"/>
               </w:rPr>
             </w:pPr>
-            <w:proofErr w:type="spellStart"/>
             <w:r>
               <w:rPr>
                 <w:rFonts w:ascii="Calibri" w:hAnsi="Calibri" w:cs="Calibri"/>
@@ -768,7 +683,6 @@
               </w:rPr>
               <w:t>fileprivate</w:t>
             </w:r>
-            <w:proofErr w:type="spellEnd"/>
           </w:p>
         </w:tc>
         <w:tc>
@@ -1119,49 +1033,16 @@
           <w:szCs w:val="22"/>
           <w:lang w:val="en-US"/>
         </w:rPr>
-        <w:t xml:space="preserve">Property </w:t>
-      </w:r>
-      <w:proofErr w:type="gramStart"/>
-      <w:r>
-        <w:rPr>
-          <w:rFonts w:ascii="Calibri" w:hAnsi="Calibri" w:cs="Calibri"/>
-          <w:b/>
-          <w:bCs/>
-          <w:sz w:val="22"/>
-          <w:szCs w:val="22"/>
-          <w:lang w:val="en-US"/>
-        </w:rPr>
-        <w:t>overriding:</w:t>
-      </w:r>
-      <w:proofErr w:type="gramEnd"/>
-      <w:r>
-        <w:rPr>
-          <w:rFonts w:ascii="Calibri" w:hAnsi="Calibri" w:cs="Calibri"/>
-          <w:sz w:val="22"/>
-          <w:szCs w:val="22"/>
-          <w:lang w:val="en-US"/>
-        </w:rPr>
-        <w:t xml:space="preserve"> Subclass override computed property. (stored property </w:t>
-      </w:r>
-      <w:proofErr w:type="spellStart"/>
-      <w:r>
-        <w:rPr>
-          <w:rFonts w:ascii="Calibri" w:hAnsi="Calibri" w:cs="Calibri"/>
-          <w:sz w:val="22"/>
-          <w:szCs w:val="22"/>
-          <w:lang w:val="en-US"/>
-        </w:rPr>
-        <w:t>can not</w:t>
-      </w:r>
-      <w:proofErr w:type="spellEnd"/>
-      <w:r>
-        <w:rPr>
-          <w:rFonts w:ascii="Calibri" w:hAnsi="Calibri" w:cs="Calibri"/>
-          <w:sz w:val="22"/>
-          <w:szCs w:val="22"/>
-          <w:lang w:val="en-US"/>
-        </w:rPr>
-        <w:t xml:space="preserve"> be overridden)</w:t>
+        <w:t>Property overriding:</w:t>
+      </w:r>
+      <w:r>
+        <w:rPr>
+          <w:rFonts w:ascii="Calibri" w:hAnsi="Calibri" w:cs="Calibri"/>
+          <w:sz w:val="22"/>
+          <w:szCs w:val="22"/>
+          <w:lang w:val="en-US"/>
+        </w:rPr>
+        <w:t xml:space="preserve"> Subclass override computed property. (stored property can not be overridden)</w:t>
       </w:r>
       <w:r>
         <w:rPr>
@@ -1192,7 +1073,6 @@
         </w:rPr>
         <w:t xml:space="preserve">Property observers </w:t>
       </w:r>
-      <w:proofErr w:type="gramStart"/>
       <w:r>
         <w:rPr>
           <w:rFonts w:ascii="Calibri" w:hAnsi="Calibri" w:cs="Calibri"/>
@@ -1204,7 +1084,6 @@
         </w:rPr>
         <w:t>override:</w:t>
       </w:r>
-      <w:proofErr w:type="gramEnd"/>
       <w:r>
         <w:rPr>
           <w:rFonts w:ascii="Calibri" w:hAnsi="Calibri" w:cs="Calibri"/>
@@ -1223,47 +1102,7 @@
           <w:szCs w:val="22"/>
           <w:lang w:val="en-US"/>
         </w:rPr>
-        <w:t xml:space="preserve">Subclass adds </w:t>
-      </w:r>
-      <w:proofErr w:type="spellStart"/>
-      <w:r>
-        <w:rPr>
-          <w:rFonts w:ascii="Calibri" w:hAnsi="Calibri" w:cs="Calibri"/>
-          <w:sz w:val="22"/>
-          <w:szCs w:val="22"/>
-          <w:lang w:val="en-US"/>
-        </w:rPr>
-        <w:t>willSet</w:t>
-      </w:r>
-      <w:proofErr w:type="spellEnd"/>
-      <w:r>
-        <w:rPr>
-          <w:rFonts w:ascii="Calibri" w:hAnsi="Calibri" w:cs="Calibri"/>
-          <w:sz w:val="22"/>
-          <w:szCs w:val="22"/>
-          <w:lang w:val="en-US"/>
-        </w:rPr>
-        <w:t>/</w:t>
-      </w:r>
-      <w:proofErr w:type="spellStart"/>
-      <w:r>
-        <w:rPr>
-          <w:rFonts w:ascii="Calibri" w:hAnsi="Calibri" w:cs="Calibri"/>
-          <w:sz w:val="22"/>
-          <w:szCs w:val="22"/>
-          <w:lang w:val="en-US"/>
-        </w:rPr>
-        <w:t>didSet</w:t>
-      </w:r>
-      <w:proofErr w:type="spellEnd"/>
-      <w:r>
-        <w:rPr>
-          <w:rFonts w:ascii="Calibri" w:hAnsi="Calibri" w:cs="Calibri"/>
-          <w:sz w:val="22"/>
-          <w:szCs w:val="22"/>
-          <w:lang w:val="en-US"/>
-        </w:rPr>
-        <w:t xml:space="preserve"> to inherited properties.</w:t>
+        <w:t>Subclass adds willSet/didSet to inherited properties.</w:t>
       </w:r>
       <w:r>
         <w:rPr>
@@ -2239,27 +2078,7 @@
           <w:szCs w:val="22"/>
           <w:lang w:val="en-US"/>
         </w:rPr>
-        <w:t xml:space="preserve"> Each instance </w:t>
-      </w:r>
-      <w:proofErr w:type="gramStart"/>
-      <w:r>
-        <w:rPr>
-          <w:rFonts w:ascii="Calibri" w:hAnsi="Calibri" w:cs="Calibri"/>
-          <w:sz w:val="22"/>
-          <w:szCs w:val="22"/>
-          <w:lang w:val="en-US"/>
-        </w:rPr>
-        <w:t>keep</w:t>
-      </w:r>
-      <w:proofErr w:type="gramEnd"/>
-      <w:r>
-        <w:rPr>
-          <w:rFonts w:ascii="Calibri" w:hAnsi="Calibri" w:cs="Calibri"/>
-          <w:sz w:val="22"/>
-          <w:szCs w:val="22"/>
-          <w:lang w:val="en-US"/>
-        </w:rPr>
-        <w:t xml:space="preserve"> its own copy.</w:t>
+        <w:t xml:space="preserve"> Each instance keep its own copy.</w:t>
       </w:r>
     </w:p>
     <w:p>
@@ -2300,27 +2119,7 @@
           <w:lang w:val="en-US"/>
         </w:rPr>
         <w:br/>
-        <w:t xml:space="preserve">struct, </w:t>
-      </w:r>
-      <w:proofErr w:type="spellStart"/>
-      <w:r>
-        <w:rPr>
-          <w:rFonts w:ascii="Calibri" w:hAnsi="Calibri" w:cs="Calibri"/>
-          <w:sz w:val="22"/>
-          <w:szCs w:val="22"/>
-          <w:lang w:val="en-US"/>
-        </w:rPr>
-        <w:t>enum</w:t>
-      </w:r>
-      <w:proofErr w:type="spellEnd"/>
-      <w:r>
-        <w:rPr>
-          <w:rFonts w:ascii="Calibri" w:hAnsi="Calibri" w:cs="Calibri"/>
-          <w:sz w:val="22"/>
-          <w:szCs w:val="22"/>
-          <w:lang w:val="en-US"/>
-        </w:rPr>
-        <w:t>, tuple.</w:t>
+        <w:t>struct, enum, tuple.</w:t>
       </w:r>
       <w:r>
         <w:rPr>
@@ -2339,27 +2138,7 @@
           <w:szCs w:val="22"/>
           <w:lang w:val="en-US"/>
         </w:rPr>
-        <w:t xml:space="preserve">Array, Dictionary are </w:t>
-      </w:r>
-      <w:proofErr w:type="gramStart"/>
-      <w:r>
-        <w:rPr>
-          <w:rFonts w:ascii="Calibri" w:hAnsi="Calibri" w:cs="Calibri"/>
-          <w:sz w:val="22"/>
-          <w:szCs w:val="22"/>
-          <w:lang w:val="en-US"/>
-        </w:rPr>
-        <w:t>struct</w:t>
-      </w:r>
-      <w:proofErr w:type="gramEnd"/>
-      <w:r>
-        <w:rPr>
-          <w:rFonts w:ascii="Calibri" w:hAnsi="Calibri" w:cs="Calibri"/>
-          <w:sz w:val="22"/>
-          <w:szCs w:val="22"/>
-          <w:lang w:val="en-US"/>
-        </w:rPr>
-        <w:t xml:space="preserve"> type.</w:t>
+        <w:t>Array, Dictionary are struct type.</w:t>
       </w:r>
     </w:p>
     <w:p>
@@ -2453,27 +2232,7 @@
           <w:szCs w:val="22"/>
           <w:lang w:val="en-US"/>
         </w:rPr>
-        <w:t xml:space="preserve">Class, Closure, </w:t>
-      </w:r>
-      <w:proofErr w:type="spellStart"/>
-      <w:r>
-        <w:rPr>
-          <w:rFonts w:ascii="Calibri" w:hAnsi="Calibri" w:cs="Calibri"/>
-          <w:sz w:val="22"/>
-          <w:szCs w:val="22"/>
-          <w:lang w:val="en-US"/>
-        </w:rPr>
-        <w:t>AnyObject</w:t>
-      </w:r>
-      <w:proofErr w:type="spellEnd"/>
-      <w:r>
-        <w:rPr>
-          <w:rFonts w:ascii="Calibri" w:hAnsi="Calibri" w:cs="Calibri"/>
-          <w:sz w:val="22"/>
-          <w:szCs w:val="22"/>
-          <w:lang w:val="en-US"/>
-        </w:rPr>
-        <w:t>, actor.</w:t>
+        <w:t>Class, Closure, AnyObject, actor.</w:t>
       </w:r>
     </w:p>
     <w:p>
@@ -2691,25 +2450,7 @@
           <w:sz w:val="22"/>
           <w:szCs w:val="22"/>
         </w:rPr>
-        <w:t xml:space="preserve">In swift why we need to create </w:t>
-      </w:r>
-      <w:proofErr w:type="spellStart"/>
-      <w:r>
-        <w:rPr>
-          <w:rFonts w:ascii="Calibri" w:hAnsi="Calibri" w:cs="Calibri"/>
-          <w:sz w:val="22"/>
-          <w:szCs w:val="22"/>
-        </w:rPr>
-        <w:t>init</w:t>
-      </w:r>
-      <w:proofErr w:type="spellEnd"/>
-      <w:r>
-        <w:rPr>
-          <w:rFonts w:ascii="Calibri" w:hAnsi="Calibri" w:cs="Calibri"/>
-          <w:sz w:val="22"/>
-          <w:szCs w:val="22"/>
-        </w:rPr>
-        <w:t xml:space="preserve"> for class but not for struct ?</w:t>
+        <w:t>In swift why we need to create init for class but not for struct ?</w:t>
       </w:r>
     </w:p>
     <w:p>
@@ -2735,33 +2476,7 @@
           <w:lang w:eastAsia="en-GB"/>
           <w14:ligatures w14:val="none"/>
         </w:rPr>
-        <w:t xml:space="preserve">Structs get a free </w:t>
-      </w:r>
-      <w:proofErr w:type="spellStart"/>
-      <w:r>
-        <w:rPr>
-          <w:rFonts w:ascii="Calibri" w:eastAsia="Times New Roman" w:hAnsi="Calibri" w:cs="Calibri"/>
-          <w:color w:val="0E0E0E"/>
-          <w:kern w:val="0"/>
-          <w:sz w:val="22"/>
-          <w:szCs w:val="22"/>
-          <w:lang w:eastAsia="en-GB"/>
-          <w14:ligatures w14:val="none"/>
-        </w:rPr>
-        <w:t>memberwise</w:t>
-      </w:r>
-      <w:proofErr w:type="spellEnd"/>
-      <w:r>
-        <w:rPr>
-          <w:rFonts w:ascii="Calibri" w:eastAsia="Times New Roman" w:hAnsi="Calibri" w:cs="Calibri"/>
-          <w:color w:val="0E0E0E"/>
-          <w:kern w:val="0"/>
-          <w:sz w:val="22"/>
-          <w:szCs w:val="22"/>
-          <w:lang w:eastAsia="en-GB"/>
-          <w14:ligatures w14:val="none"/>
-        </w:rPr>
-        <w:t xml:space="preserve"> initializer because they are simple value types without inheritance, while classes don’t because they support inheritance and require controlled initialization, so Swift forces explicit initializers.</w:t>
+        <w:t>Structs get a free memberwise initializer because they are simple value types without inheritance, while classes don’t because they support inheritance and require controlled initialization, so Swift forces explicit initializers.</w:t>
       </w:r>
     </w:p>
     <w:p>
@@ -2938,25 +2653,37 @@
     <w:p>
       <w:pPr>
         <w:pStyle w:val="p1"/>
+        <w:rPr>
+          <w:rFonts w:ascii="Calibri" w:hAnsi="Calibri" w:cs="Calibri"/>
+          <w:sz w:val="22"/>
+          <w:szCs w:val="22"/>
+        </w:rPr>
       </w:pPr>
       <w:r>
         <w:rPr>
           <w:rStyle w:val="s1"/>
-          <w:rFonts w:eastAsiaTheme="majorEastAsia"/>
+          <w:rFonts w:ascii="Calibri" w:eastAsiaTheme="majorEastAsia" w:hAnsi="Calibri" w:cs="Calibri"/>
+          <w:sz w:val="22"/>
+          <w:szCs w:val="22"/>
         </w:rPr>
         <w:t xml:space="preserve">Enums </w:t>
       </w:r>
       <w:r>
         <w:rPr>
-          <w:b/>
-          <w:bCs/>
+          <w:rFonts w:ascii="Calibri" w:hAnsi="Calibri" w:cs="Calibri"/>
+          <w:b/>
+          <w:bCs/>
+          <w:sz w:val="22"/>
+          <w:szCs w:val="22"/>
         </w:rPr>
         <w:t>cannot have stored properties</w:t>
       </w:r>
       <w:r>
         <w:rPr>
           <w:rStyle w:val="s1"/>
-          <w:rFonts w:eastAsiaTheme="majorEastAsia"/>
+          <w:rFonts w:ascii="Calibri" w:eastAsiaTheme="majorEastAsia" w:hAnsi="Calibri" w:cs="Calibri"/>
+          <w:sz w:val="22"/>
+          <w:szCs w:val="22"/>
         </w:rPr>
         <w:t>:</w:t>
       </w:r>
@@ -2964,20 +2691,37 @@
     <w:p>
       <w:pPr>
         <w:pStyle w:val="p1"/>
-      </w:pPr>
-      <w:r>
+        <w:rPr>
+          <w:rFonts w:ascii="Calibri" w:hAnsi="Calibri" w:cs="Calibri"/>
+          <w:sz w:val="22"/>
+          <w:szCs w:val="22"/>
+        </w:rPr>
+      </w:pPr>
+      <w:r>
+        <w:rPr>
+          <w:rFonts w:ascii="Calibri" w:hAnsi="Calibri" w:cs="Calibri"/>
+          <w:sz w:val="22"/>
+          <w:szCs w:val="22"/>
+        </w:rPr>
         <w:t xml:space="preserve">Enums can store data using </w:t>
       </w:r>
       <w:r>
         <w:rPr>
           <w:rStyle w:val="s1"/>
-          <w:rFonts w:eastAsiaTheme="majorEastAsia"/>
-          <w:b/>
-          <w:bCs/>
+          <w:rFonts w:ascii="Calibri" w:eastAsiaTheme="majorEastAsia" w:hAnsi="Calibri" w:cs="Calibri"/>
+          <w:b/>
+          <w:bCs/>
+          <w:sz w:val="22"/>
+          <w:szCs w:val="22"/>
         </w:rPr>
         <w:t>associated values</w:t>
       </w:r>
       <w:r>
+        <w:rPr>
+          <w:rFonts w:ascii="Calibri" w:hAnsi="Calibri" w:cs="Calibri"/>
+          <w:sz w:val="22"/>
+          <w:szCs w:val="22"/>
+        </w:rPr>
         <w:t>:</w:t>
       </w:r>
     </w:p>
@@ -3150,31 +2894,7 @@
                 <w:szCs w:val="22"/>
                 <w:lang w:val="en-US"/>
               </w:rPr>
-              <w:t xml:space="preserve">One class access properties and methods from </w:t>
-            </w:r>
-            <w:proofErr w:type="gramStart"/>
-            <w:r>
-              <w:rPr>
-                <w:rFonts w:ascii="Calibri" w:hAnsi="Calibri" w:cs="Calibri"/>
-                <w:b/>
-                <w:bCs/>
-                <w:sz w:val="22"/>
-                <w:szCs w:val="22"/>
-                <w:lang w:val="en-US"/>
-              </w:rPr>
-              <w:t>the another</w:t>
-            </w:r>
-            <w:proofErr w:type="gramEnd"/>
-            <w:r>
-              <w:rPr>
-                <w:rFonts w:ascii="Calibri" w:hAnsi="Calibri" w:cs="Calibri"/>
-                <w:b/>
-                <w:bCs/>
-                <w:sz w:val="22"/>
-                <w:szCs w:val="22"/>
-                <w:lang w:val="en-US"/>
-              </w:rPr>
-              <w:t xml:space="preserve"> class</w:t>
+              <w:t>One class access properties and methods from the another class</w:t>
             </w:r>
           </w:p>
         </w:tc>
@@ -3232,31 +2952,7 @@
                 <w:szCs w:val="22"/>
                 <w:lang w:val="en-US"/>
               </w:rPr>
-              <w:t xml:space="preserve">Reference </w:t>
-            </w:r>
-            <w:proofErr w:type="gramStart"/>
-            <w:r>
-              <w:rPr>
-                <w:rFonts w:ascii="Calibri" w:hAnsi="Calibri" w:cs="Calibri"/>
-                <w:b/>
-                <w:bCs/>
-                <w:sz w:val="22"/>
-                <w:szCs w:val="22"/>
-                <w:lang w:val="en-US"/>
-              </w:rPr>
-              <w:t>type(</w:t>
-            </w:r>
-            <w:proofErr w:type="gramEnd"/>
-            <w:r>
-              <w:rPr>
-                <w:rFonts w:ascii="Calibri" w:hAnsi="Calibri" w:cs="Calibri"/>
-                <w:b/>
-                <w:bCs/>
-                <w:sz w:val="22"/>
-                <w:szCs w:val="22"/>
-                <w:lang w:val="en-US"/>
-              </w:rPr>
-              <w:t>Classes)</w:t>
+              <w:t>Reference type(Classes)</w:t>
             </w:r>
           </w:p>
         </w:tc>
@@ -3464,6 +3160,499 @@
         </w:tc>
       </w:tr>
     </w:tbl>
+    <w:p>
+      <w:pPr>
+        <w:rPr>
+          <w:rFonts w:ascii="Calibri" w:hAnsi="Calibri" w:cs="Calibri"/>
+          <w:b/>
+          <w:bCs/>
+          <w:sz w:val="22"/>
+          <w:szCs w:val="22"/>
+          <w:lang w:val="en-US"/>
+        </w:rPr>
+      </w:pPr>
+    </w:p>
+    <w:p>
+      <w:pPr>
+        <w:rPr>
+          <w:rFonts w:ascii="Calibri" w:hAnsi="Calibri" w:cs="Calibri"/>
+          <w:b/>
+          <w:bCs/>
+          <w:sz w:val="22"/>
+          <w:szCs w:val="22"/>
+          <w:lang w:val="en-US"/>
+        </w:rPr>
+      </w:pPr>
+    </w:p>
+    <w:p>
+      <w:pPr>
+        <w:rPr>
+          <w:rFonts w:ascii="Calibri" w:hAnsi="Calibri" w:cs="Calibri"/>
+          <w:b/>
+          <w:bCs/>
+          <w:sz w:val="22"/>
+          <w:szCs w:val="22"/>
+          <w:lang w:val="en-US"/>
+        </w:rPr>
+      </w:pPr>
+      <w:r>
+        <w:rPr>
+          <w:rFonts w:ascii="Calibri" w:hAnsi="Calibri" w:cs="Calibri"/>
+          <w:b/>
+          <w:bCs/>
+          <w:sz w:val="22"/>
+          <w:szCs w:val="22"/>
+          <w:lang w:val="en-US"/>
+        </w:rPr>
+        <w:t>SOLID Principle:</w:t>
+      </w:r>
+    </w:p>
+    <w:p>
+      <w:pPr>
+        <w:pStyle w:val="Heading3"/>
+        <w:rPr>
+          <w:rFonts w:ascii="Calibri" w:hAnsi="Calibri" w:cs="Calibri"/>
+          <w:sz w:val="22"/>
+          <w:szCs w:val="22"/>
+        </w:rPr>
+      </w:pPr>
+      <w:r>
+        <w:rPr>
+          <w:rFonts w:ascii="Apple Color Emoji" w:hAnsi="Apple Color Emoji" w:cs="Apple Color Emoji"/>
+          <w:sz w:val="22"/>
+          <w:szCs w:val="22"/>
+        </w:rPr>
+        <w:t>🔹</w:t>
+      </w:r>
+      <w:r>
+        <w:rPr>
+          <w:rFonts w:ascii="Calibri" w:hAnsi="Calibri" w:cs="Calibri"/>
+          <w:sz w:val="22"/>
+          <w:szCs w:val="22"/>
+        </w:rPr>
+        <w:t xml:space="preserve"> S — Single Responsibility Principle (SRP)</w:t>
+      </w:r>
+    </w:p>
+    <w:p>
+      <w:pPr>
+        <w:rPr>
+          <w:rFonts w:ascii="Calibri" w:hAnsi="Calibri" w:cs="Calibri"/>
+          <w:color w:val="0E0E0E"/>
+          <w:sz w:val="22"/>
+          <w:szCs w:val="22"/>
+        </w:rPr>
+      </w:pPr>
+      <w:r>
+        <w:rPr>
+          <w:rStyle w:val="s2"/>
+          <w:rFonts w:ascii="Calibri" w:hAnsi="Calibri" w:cs="Calibri"/>
+          <w:color w:val="0E0E0E"/>
+          <w:sz w:val="22"/>
+          <w:szCs w:val="22"/>
+        </w:rPr>
+        <w:t xml:space="preserve">A class should have </w:t>
+      </w:r>
+      <w:r>
+        <w:rPr>
+          <w:rFonts w:ascii="Calibri" w:hAnsi="Calibri" w:cs="Calibri"/>
+          <w:b/>
+          <w:bCs/>
+          <w:color w:val="0E0E0E"/>
+          <w:sz w:val="22"/>
+          <w:szCs w:val="22"/>
+        </w:rPr>
+        <w:t>only one reason to change</w:t>
+      </w:r>
+      <w:r>
+        <w:rPr>
+          <w:rStyle w:val="s2"/>
+          <w:rFonts w:ascii="Calibri" w:hAnsi="Calibri" w:cs="Calibri"/>
+          <w:color w:val="0E0E0E"/>
+          <w:sz w:val="22"/>
+          <w:szCs w:val="22"/>
+        </w:rPr>
+        <w:t>.</w:t>
+      </w:r>
+    </w:p>
+    <w:p>
+      <w:pPr>
+        <w:rPr>
+          <w:rStyle w:val="s1"/>
+          <w:rFonts w:ascii="Calibri" w:hAnsi="Calibri" w:cs="Calibri"/>
+          <w:sz w:val="22"/>
+          <w:szCs w:val="22"/>
+        </w:rPr>
+      </w:pPr>
+      <w:r>
+        <w:rPr>
+          <w:rStyle w:val="s1"/>
+          <w:rFonts w:ascii="Calibri" w:hAnsi="Calibri" w:cs="Calibri"/>
+          <w:noProof/>
+          <w:sz w:val="22"/>
+          <w:szCs w:val="22"/>
+        </w:rPr>
+        <w:pict w14:anchorId="1E6B756B">
+          <v:rect id="_x0000_i1028" alt="" style="width:451.3pt;height:.05pt;mso-width-percent:0;mso-height-percent:0;mso-width-percent:0;mso-height-percent:0" o:hralign="center" o:hrstd="t" o:hr="t" fillcolor="#a0a0a0" stroked="f"/>
+        </w:pict>
+      </w:r>
+    </w:p>
+    <w:p>
+      <w:pPr>
+        <w:pStyle w:val="Heading3"/>
+        <w:rPr>
+          <w:rFonts w:ascii="Calibri" w:hAnsi="Calibri" w:cs="Calibri"/>
+          <w:sz w:val="22"/>
+          <w:szCs w:val="22"/>
+        </w:rPr>
+      </w:pPr>
+      <w:r>
+        <w:rPr>
+          <w:rFonts w:ascii="Apple Color Emoji" w:hAnsi="Apple Color Emoji" w:cs="Apple Color Emoji"/>
+          <w:sz w:val="22"/>
+          <w:szCs w:val="22"/>
+        </w:rPr>
+        <w:t>🔹</w:t>
+      </w:r>
+      <w:r>
+        <w:rPr>
+          <w:rFonts w:ascii="Calibri" w:hAnsi="Calibri" w:cs="Calibri"/>
+          <w:sz w:val="22"/>
+          <w:szCs w:val="22"/>
+        </w:rPr>
+        <w:t xml:space="preserve"> O — Open/Closed Principle (OCP)</w:t>
+      </w:r>
+    </w:p>
+    <w:p>
+      <w:pPr>
+        <w:rPr>
+          <w:rFonts w:ascii="Calibri" w:hAnsi="Calibri" w:cs="Calibri"/>
+          <w:color w:val="0E0E0E"/>
+          <w:sz w:val="22"/>
+          <w:szCs w:val="22"/>
+        </w:rPr>
+      </w:pPr>
+      <w:r>
+        <w:rPr>
+          <w:rStyle w:val="s2"/>
+          <w:rFonts w:ascii="Calibri" w:hAnsi="Calibri" w:cs="Calibri"/>
+          <w:color w:val="0E0E0E"/>
+          <w:sz w:val="22"/>
+          <w:szCs w:val="22"/>
+        </w:rPr>
+        <w:t xml:space="preserve">Code should be </w:t>
+      </w:r>
+      <w:r>
+        <w:rPr>
+          <w:rFonts w:ascii="Calibri" w:hAnsi="Calibri" w:cs="Calibri"/>
+          <w:b/>
+          <w:bCs/>
+          <w:color w:val="0E0E0E"/>
+          <w:sz w:val="22"/>
+          <w:szCs w:val="22"/>
+        </w:rPr>
+        <w:t>open for extension, closed for modification</w:t>
+      </w:r>
+      <w:r>
+        <w:rPr>
+          <w:rStyle w:val="s2"/>
+          <w:rFonts w:ascii="Calibri" w:hAnsi="Calibri" w:cs="Calibri"/>
+          <w:color w:val="0E0E0E"/>
+          <w:sz w:val="22"/>
+          <w:szCs w:val="22"/>
+        </w:rPr>
+        <w:t>.</w:t>
+      </w:r>
+    </w:p>
+    <w:p>
+      <w:pPr>
+        <w:rPr>
+          <w:rStyle w:val="s1"/>
+          <w:rFonts w:ascii="Calibri" w:hAnsi="Calibri" w:cs="Calibri"/>
+          <w:sz w:val="22"/>
+          <w:szCs w:val="22"/>
+        </w:rPr>
+      </w:pPr>
+      <w:r>
+        <w:rPr>
+          <w:rStyle w:val="s1"/>
+          <w:rFonts w:ascii="Calibri" w:hAnsi="Calibri" w:cs="Calibri"/>
+          <w:noProof/>
+          <w:sz w:val="22"/>
+          <w:szCs w:val="22"/>
+        </w:rPr>
+        <w:pict w14:anchorId="7F36544E">
+          <v:rect id="_x0000_i1027" alt="" style="width:451.3pt;height:.05pt;mso-width-percent:0;mso-height-percent:0;mso-width-percent:0;mso-height-percent:0" o:hralign="center" o:hrstd="t" o:hr="t" fillcolor="#a0a0a0" stroked="f"/>
+        </w:pict>
+      </w:r>
+    </w:p>
+    <w:p>
+      <w:pPr>
+        <w:pStyle w:val="Heading3"/>
+        <w:rPr>
+          <w:rFonts w:ascii="Calibri" w:hAnsi="Calibri" w:cs="Calibri"/>
+          <w:sz w:val="22"/>
+          <w:szCs w:val="22"/>
+        </w:rPr>
+      </w:pPr>
+      <w:r>
+        <w:rPr>
+          <w:rFonts w:ascii="Apple Color Emoji" w:hAnsi="Apple Color Emoji" w:cs="Apple Color Emoji"/>
+          <w:sz w:val="22"/>
+          <w:szCs w:val="22"/>
+        </w:rPr>
+        <w:t>🔹</w:t>
+      </w:r>
+      <w:r>
+        <w:rPr>
+          <w:rFonts w:ascii="Calibri" w:hAnsi="Calibri" w:cs="Calibri"/>
+          <w:sz w:val="22"/>
+          <w:szCs w:val="22"/>
+        </w:rPr>
+        <w:t xml:space="preserve"> L — Liskov Substitution Principle (LSP)</w:t>
+      </w:r>
+    </w:p>
+    <w:p>
+      <w:pPr>
+        <w:rPr>
+          <w:rFonts w:ascii="Calibri" w:hAnsi="Calibri" w:cs="Calibri"/>
+          <w:color w:val="0E0E0E"/>
+          <w:sz w:val="22"/>
+          <w:szCs w:val="22"/>
+        </w:rPr>
+      </w:pPr>
+      <w:r>
+        <w:rPr>
+          <w:rStyle w:val="s2"/>
+          <w:rFonts w:ascii="Calibri" w:hAnsi="Calibri" w:cs="Calibri"/>
+          <w:color w:val="0E0E0E"/>
+          <w:sz w:val="22"/>
+          <w:szCs w:val="22"/>
+        </w:rPr>
+        <w:t xml:space="preserve">Subtypes should be </w:t>
+      </w:r>
+      <w:r>
+        <w:rPr>
+          <w:rFonts w:ascii="Calibri" w:hAnsi="Calibri" w:cs="Calibri"/>
+          <w:b/>
+          <w:bCs/>
+          <w:color w:val="0E0E0E"/>
+          <w:sz w:val="22"/>
+          <w:szCs w:val="22"/>
+        </w:rPr>
+        <w:t>replaceable for their base types without breaking behavior</w:t>
+      </w:r>
+      <w:r>
+        <w:rPr>
+          <w:rStyle w:val="s2"/>
+          <w:rFonts w:ascii="Calibri" w:hAnsi="Calibri" w:cs="Calibri"/>
+          <w:color w:val="0E0E0E"/>
+          <w:sz w:val="22"/>
+          <w:szCs w:val="22"/>
+        </w:rPr>
+        <w:t>.</w:t>
+      </w:r>
+    </w:p>
+    <w:p>
+      <w:pPr>
+        <w:rPr>
+          <w:rStyle w:val="s1"/>
+          <w:rFonts w:ascii="Calibri" w:hAnsi="Calibri" w:cs="Calibri"/>
+          <w:sz w:val="22"/>
+          <w:szCs w:val="22"/>
+        </w:rPr>
+      </w:pPr>
+      <w:r>
+        <w:rPr>
+          <w:rStyle w:val="s1"/>
+          <w:rFonts w:ascii="Calibri" w:hAnsi="Calibri" w:cs="Calibri"/>
+          <w:noProof/>
+          <w:sz w:val="22"/>
+          <w:szCs w:val="22"/>
+        </w:rPr>
+        <w:pict w14:anchorId="57913823">
+          <v:rect id="_x0000_i1026" alt="" style="width:451.3pt;height:.05pt;mso-width-percent:0;mso-height-percent:0;mso-width-percent:0;mso-height-percent:0" o:hralign="center" o:hrstd="t" o:hr="t" fillcolor="#a0a0a0" stroked="f"/>
+        </w:pict>
+      </w:r>
+    </w:p>
+    <w:p>
+      <w:pPr>
+        <w:pStyle w:val="Heading3"/>
+        <w:rPr>
+          <w:rFonts w:ascii="Calibri" w:hAnsi="Calibri" w:cs="Calibri"/>
+          <w:sz w:val="22"/>
+          <w:szCs w:val="22"/>
+        </w:rPr>
+      </w:pPr>
+      <w:r>
+        <w:rPr>
+          <w:rFonts w:ascii="Apple Color Emoji" w:hAnsi="Apple Color Emoji" w:cs="Apple Color Emoji"/>
+          <w:sz w:val="22"/>
+          <w:szCs w:val="22"/>
+        </w:rPr>
+        <w:t>🔹</w:t>
+      </w:r>
+      <w:r>
+        <w:rPr>
+          <w:rFonts w:ascii="Calibri" w:hAnsi="Calibri" w:cs="Calibri"/>
+          <w:sz w:val="22"/>
+          <w:szCs w:val="22"/>
+        </w:rPr>
+        <w:t xml:space="preserve"> I — Interface Segregation Principle (ISP)</w:t>
+      </w:r>
+    </w:p>
+    <w:p>
+      <w:pPr>
+        <w:rPr>
+          <w:rFonts w:ascii="Calibri" w:hAnsi="Calibri" w:cs="Calibri"/>
+          <w:color w:val="0E0E0E"/>
+          <w:sz w:val="22"/>
+          <w:szCs w:val="22"/>
+        </w:rPr>
+      </w:pPr>
+      <w:r>
+        <w:rPr>
+          <w:rFonts w:ascii="Calibri" w:hAnsi="Calibri" w:cs="Calibri"/>
+          <w:color w:val="0E0E0E"/>
+          <w:sz w:val="22"/>
+          <w:szCs w:val="22"/>
+        </w:rPr>
+        <w:t xml:space="preserve">Don’t force clients to depend on </w:t>
+      </w:r>
+      <w:r>
+        <w:rPr>
+          <w:rStyle w:val="s3"/>
+          <w:rFonts w:ascii="Calibri" w:hAnsi="Calibri" w:cs="Calibri"/>
+          <w:b/>
+          <w:bCs/>
+          <w:color w:val="0E0E0E"/>
+          <w:sz w:val="22"/>
+          <w:szCs w:val="22"/>
+        </w:rPr>
+        <w:t>methods they don’t use</w:t>
+      </w:r>
+      <w:r>
+        <w:rPr>
+          <w:rFonts w:ascii="Calibri" w:hAnsi="Calibri" w:cs="Calibri"/>
+          <w:color w:val="0E0E0E"/>
+          <w:sz w:val="22"/>
+          <w:szCs w:val="22"/>
+        </w:rPr>
+        <w:t>.</w:t>
+      </w:r>
+    </w:p>
+    <w:p>
+      <w:pPr>
+        <w:rPr>
+          <w:rStyle w:val="s1"/>
+          <w:rFonts w:ascii="Calibri" w:hAnsi="Calibri" w:cs="Calibri"/>
+          <w:sz w:val="22"/>
+          <w:szCs w:val="22"/>
+        </w:rPr>
+      </w:pPr>
+      <w:r>
+        <w:rPr>
+          <w:rStyle w:val="s1"/>
+          <w:rFonts w:ascii="Calibri" w:hAnsi="Calibri" w:cs="Calibri"/>
+          <w:noProof/>
+          <w:sz w:val="22"/>
+          <w:szCs w:val="22"/>
+        </w:rPr>
+        <w:pict w14:anchorId="6B930087">
+          <v:rect id="_x0000_i1025" alt="" style="width:451.3pt;height:.05pt;mso-width-percent:0;mso-height-percent:0;mso-width-percent:0;mso-height-percent:0" o:hralign="center" o:hrstd="t" o:hr="t" fillcolor="#a0a0a0" stroked="f"/>
+        </w:pict>
+      </w:r>
+    </w:p>
+    <w:p>
+      <w:pPr>
+        <w:pStyle w:val="Heading3"/>
+        <w:rPr>
+          <w:rFonts w:ascii="Calibri" w:hAnsi="Calibri" w:cs="Calibri"/>
+          <w:sz w:val="22"/>
+          <w:szCs w:val="22"/>
+        </w:rPr>
+      </w:pPr>
+      <w:r>
+        <w:rPr>
+          <w:rFonts w:ascii="Apple Color Emoji" w:hAnsi="Apple Color Emoji" w:cs="Apple Color Emoji"/>
+          <w:sz w:val="22"/>
+          <w:szCs w:val="22"/>
+        </w:rPr>
+        <w:t>🔹</w:t>
+      </w:r>
+      <w:r>
+        <w:rPr>
+          <w:rFonts w:ascii="Calibri" w:hAnsi="Calibri" w:cs="Calibri"/>
+          <w:sz w:val="22"/>
+          <w:szCs w:val="22"/>
+        </w:rPr>
+        <w:t xml:space="preserve"> D — Dependency Inversion Principle (DIP)</w:t>
+      </w:r>
+    </w:p>
+    <w:p>
+      <w:pPr>
+        <w:rPr>
+          <w:rFonts w:ascii="Calibri" w:hAnsi="Calibri" w:cs="Calibri"/>
+          <w:color w:val="0E0E0E"/>
+          <w:sz w:val="22"/>
+          <w:szCs w:val="22"/>
+        </w:rPr>
+      </w:pPr>
+      <w:r>
+        <w:rPr>
+          <w:rStyle w:val="s2"/>
+          <w:rFonts w:ascii="Calibri" w:hAnsi="Calibri" w:cs="Calibri"/>
+          <w:color w:val="0E0E0E"/>
+          <w:sz w:val="22"/>
+          <w:szCs w:val="22"/>
+        </w:rPr>
+        <w:t xml:space="preserve">Depend on </w:t>
+      </w:r>
+      <w:r>
+        <w:rPr>
+          <w:rFonts w:ascii="Calibri" w:hAnsi="Calibri" w:cs="Calibri"/>
+          <w:b/>
+          <w:bCs/>
+          <w:color w:val="0E0E0E"/>
+          <w:sz w:val="22"/>
+          <w:szCs w:val="22"/>
+        </w:rPr>
+        <w:t>abstractions, not concrete implementations</w:t>
+      </w:r>
+      <w:r>
+        <w:rPr>
+          <w:rStyle w:val="s2"/>
+          <w:rFonts w:ascii="Calibri" w:hAnsi="Calibri" w:cs="Calibri"/>
+          <w:color w:val="0E0E0E"/>
+          <w:sz w:val="22"/>
+          <w:szCs w:val="22"/>
+        </w:rPr>
+        <w:t>.</w:t>
+      </w:r>
+    </w:p>
+    <w:p>
+      <w:pPr>
+        <w:rPr>
+          <w:rFonts w:ascii="Calibri" w:hAnsi="Calibri" w:cs="Calibri"/>
+          <w:b/>
+          <w:bCs/>
+          <w:sz w:val="22"/>
+          <w:szCs w:val="22"/>
+          <w:lang w:val="en-US"/>
+        </w:rPr>
+      </w:pPr>
+    </w:p>
+    <w:p>
+      <w:pPr>
+        <w:rPr>
+          <w:rFonts w:ascii="Calibri" w:hAnsi="Calibri" w:cs="Calibri"/>
+          <w:b/>
+          <w:bCs/>
+          <w:sz w:val="22"/>
+          <w:szCs w:val="22"/>
+          <w:lang w:val="en-US"/>
+        </w:rPr>
+      </w:pPr>
+    </w:p>
     <w:p>
       <w:pPr>
         <w:rPr>
@@ -4804,6 +4993,30 @@
     <w:basedOn w:val="DefaultParagraphFont"/>
     <w:rsid w:val="0029099F"/>
   </w:style>
+  <w:style w:type="paragraph" w:customStyle="1" w:styleId="p2">
+    <w:name w:val="p2"/>
+    <w:basedOn w:val="Normal"/>
+    <w:rsid w:val="004E6647"/>
+    <w:pPr>
+      <w:spacing w:before="100" w:beforeAutospacing="1" w:after="100" w:afterAutospacing="1" w:line="240" w:lineRule="auto"/>
+    </w:pPr>
+    <w:rPr>
+      <w:rFonts w:ascii="Times New Roman" w:eastAsia="Times New Roman" w:hAnsi="Times New Roman" w:cs="Times New Roman"/>
+      <w:kern w:val="0"/>
+      <w:lang w:eastAsia="en-GB"/>
+      <w14:ligatures w14:val="none"/>
+    </w:rPr>
+  </w:style>
+  <w:style w:type="character" w:customStyle="1" w:styleId="s2">
+    <w:name w:val="s2"/>
+    <w:basedOn w:val="DefaultParagraphFont"/>
+    <w:rsid w:val="004E6647"/>
+  </w:style>
+  <w:style w:type="character" w:customStyle="1" w:styleId="s3">
+    <w:name w:val="s3"/>
+    <w:basedOn w:val="DefaultParagraphFont"/>
+    <w:rsid w:val="004E6647"/>
+  </w:style>
 </w:styles>
 </file>
 

</xml_diff>